<commit_message>
style(docs): format Lab 1 report strictly according to GOST 7.32 (14pt, 1.5 line spacing, black borders)
</commit_message>
<xml_diff>
--- a/information-ecology/lab-01-natural-lighting/docs/Отчет_ЛР1_Смирнов_БСТ2556.docx
+++ b/information-ecology/lab-01-natural-lighting/docs/Отчет_ЛР1_Смирнов_БСТ2556.docx
@@ -4,137 +4,201 @@
   <w:body>
     <w:p>
       <w:pPr>
-        <w:spacing w:before="0" w:after="40" w:line="240" w:lineRule="auto"/>
+        <w:spacing w:line="360" w:lineRule="auto" w:before="0" w:after="40"/>
+        <w:ind w:firstLine="0"/>
         <w:jc w:val="center"/>
       </w:pPr>
       <w:r>
         <w:rPr>
           <w:rFonts w:ascii="Times New Roman" w:hAnsi="Times New Roman"/>
           <w:b/>
-          <w:sz w:val="20"/>
+          <w:i w:val="0"/>
+          <w:color w:val="000000"/>
+          <w:sz w:val="22"/>
         </w:rPr>
-        <w:t>МИНИСТЕРСТВО ЦИФРОВОГО РАЗВИТИЯ, СВЯЗИ И МАССОВЫХ КОММУНИКАЦИЙ</w:t>
-        <w:br/>
-        <w:t>РОССИЙСКОЙ ФЕДЕРАЦИИ</w:t>
+        <w:t>МИНИСТЕРСТВО ЦИФРОВОГО РАЗВИТИЯ, СВЯЗИ И МАССОВЫХ КОММУНИКАЦИЙ РОССИЙСКОЙ ФЕДЕРАЦИИ</w:t>
       </w:r>
     </w:p>
     <w:p>
       <w:pPr>
-        <w:spacing w:before="40" w:after="360" w:line="240" w:lineRule="auto"/>
+        <w:spacing w:line="360" w:lineRule="auto" w:before="0" w:after="40"/>
+        <w:ind w:firstLine="0"/>
+        <w:jc w:val="center"/>
+      </w:pPr>
+      <w:r>
+        <w:rPr>
+          <w:rFonts w:ascii="Times New Roman" w:hAnsi="Times New Roman"/>
+          <w:b w:val="0"/>
+          <w:i w:val="0"/>
+          <w:color w:val="000000"/>
+          <w:sz w:val="22"/>
+        </w:rPr>
+        <w:t>Ордена Трудового Красного Знамени федеральное государственное бюджетное образовательное учреждение высшего образования</w:t>
+      </w:r>
+    </w:p>
+    <w:p>
+      <w:pPr>
+        <w:spacing w:line="360" w:lineRule="auto" w:before="0" w:after="280"/>
+        <w:ind w:firstLine="0"/>
         <w:jc w:val="center"/>
       </w:pPr>
       <w:r>
         <w:rPr>
           <w:rFonts w:ascii="Times New Roman" w:hAnsi="Times New Roman"/>
           <w:b/>
-          <w:sz w:val="22"/>
+          <w:i w:val="0"/>
+          <w:color w:val="000000"/>
+          <w:sz w:val="24"/>
         </w:rPr>
-        <w:t>Ордена Трудового Красного Знамени федеральное государственное бюджетное</w:t>
-        <w:br/>
-        <w:t>образовательное учреждение высшего образования</w:t>
-        <w:br/>
         <w:t>«МОСКОВСКИЙ ТЕХНИЧЕСКИЙ УНИВЕРСИТЕТ СВЯЗИ И ИНФОРМАТИКИ»</w:t>
-        <w:br/>
-        <w:t>(МТУСИ)</w:t>
       </w:r>
     </w:p>
     <w:p>
       <w:pPr>
-        <w:spacing w:before="0" w:after="720" w:line="240" w:lineRule="auto"/>
+        <w:spacing w:line="360" w:lineRule="auto" w:before="0" w:after="40"/>
+        <w:ind w:firstLine="0"/>
         <w:jc w:val="center"/>
       </w:pPr>
       <w:r>
         <w:rPr>
           <w:rFonts w:ascii="Times New Roman" w:hAnsi="Times New Roman"/>
-          <w:sz w:val="22"/>
+          <w:b w:val="0"/>
+          <w:i w:val="0"/>
+          <w:color w:val="000000"/>
+          <w:sz w:val="24"/>
         </w:rPr>
         <w:t>Центр заочного обучения по программам бакалавриата</w:t>
-        <w:br/>
-        <w:t>Кафедра «Экология, безопасность жизнедеятельности и электропитание»</w:t>
       </w:r>
     </w:p>
     <w:p>
       <w:pPr>
-        <w:spacing w:before="480" w:after="120" w:line="276" w:lineRule="auto"/>
+        <w:spacing w:line="360" w:lineRule="auto" w:before="0" w:after="960"/>
+        <w:ind w:firstLine="0"/>
+        <w:jc w:val="center"/>
+      </w:pPr>
+      <w:r>
+        <w:rPr>
+          <w:rFonts w:ascii="Times New Roman" w:hAnsi="Times New Roman"/>
+          <w:b w:val="0"/>
+          <w:i w:val="0"/>
+          <w:color w:val="000000"/>
+          <w:sz w:val="24"/>
+        </w:rPr>
+        <w:t>Кафедра экологии, безопасности жизнедеятельности и электропитания</w:t>
+      </w:r>
+    </w:p>
+    <w:p>
+      <w:pPr>
+        <w:spacing w:line="360" w:lineRule="auto" w:before="240" w:after="80"/>
+        <w:ind w:firstLine="0"/>
         <w:jc w:val="center"/>
       </w:pPr>
       <w:r>
         <w:rPr>
           <w:rFonts w:ascii="Times New Roman" w:hAnsi="Times New Roman"/>
           <w:b/>
-          <w:color w:val="182B49"/>
-          <w:sz w:val="32"/>
+          <w:i w:val="0"/>
+          <w:color w:val="000000"/>
+          <w:sz w:val="36"/>
         </w:rPr>
         <w:t>ОТЧЕТ</w:t>
-        <w:br/>
-        <w:t>ПО ЛАБОРАТОРНОЙ РАБОТЕ № 1</w:t>
       </w:r>
     </w:p>
     <w:p>
       <w:pPr>
-        <w:spacing w:before="0" w:after="240" w:line="276" w:lineRule="auto"/>
-        <w:jc w:val="center"/>
-      </w:pPr>
-      <w:r>
-        <w:rPr>
-          <w:rFonts w:ascii="Times New Roman" w:hAnsi="Times New Roman"/>
-          <w:i/>
-          <w:sz w:val="26"/>
-        </w:rPr>
-        <w:t>по дисциплине «Информационная экология»</w:t>
-      </w:r>
-    </w:p>
-    <w:p>
-      <w:pPr>
-        <w:spacing w:before="120" w:after="1200" w:line="276" w:lineRule="auto"/>
+        <w:spacing w:line="360" w:lineRule="auto" w:before="0" w:after="80"/>
+        <w:ind w:firstLine="0"/>
         <w:jc w:val="center"/>
       </w:pPr>
       <w:r>
         <w:rPr>
           <w:rFonts w:ascii="Times New Roman" w:hAnsi="Times New Roman"/>
           <w:b/>
+          <w:i w:val="0"/>
+          <w:color w:val="000000"/>
           <w:sz w:val="28"/>
         </w:rPr>
-        <w:t>Тема: «Расчёт естественной освещённости в производственном помещении»</w:t>
-        <w:br/>
+        <w:t>по лабораторной работе № 1</w:t>
+      </w:r>
+    </w:p>
+    <w:p>
+      <w:pPr>
+        <w:spacing w:line="360" w:lineRule="auto" w:before="0" w:after="280"/>
+        <w:ind w:firstLine="0"/>
+        <w:jc w:val="center"/>
+      </w:pPr>
+      <w:r>
+        <w:rPr>
+          <w:rFonts w:ascii="Times New Roman" w:hAnsi="Times New Roman"/>
+          <w:b w:val="0"/>
+          <w:i w:val="0"/>
+          <w:color w:val="000000"/>
+          <w:sz w:val="28"/>
+        </w:rPr>
+        <w:t>по дисциплине: «Информационная экология»</w:t>
+      </w:r>
+    </w:p>
+    <w:p>
+      <w:pPr>
+        <w:spacing w:line="360" w:lineRule="auto" w:before="0" w:after="80"/>
+        <w:ind w:firstLine="0"/>
+        <w:jc w:val="center"/>
+      </w:pPr>
+      <w:r>
+        <w:rPr>
+          <w:rFonts w:ascii="Times New Roman" w:hAnsi="Times New Roman"/>
+          <w:b/>
+          <w:i w:val="0"/>
+          <w:color w:val="000000"/>
+          <w:sz w:val="28"/>
+        </w:rPr>
+        <w:t>Тема: «Расчет естественной освещенности в производственном помещении»</w:t>
+      </w:r>
+    </w:p>
+    <w:p>
+      <w:pPr>
+        <w:spacing w:line="360" w:lineRule="auto" w:before="0" w:after="1280"/>
+        <w:ind w:firstLine="0"/>
+        <w:jc w:val="center"/>
+      </w:pPr>
+      <w:r>
+        <w:rPr>
+          <w:rFonts w:ascii="Times New Roman" w:hAnsi="Times New Roman"/>
+          <w:b/>
+          <w:i w:val="0"/>
+          <w:color w:val="000000"/>
+          <w:sz w:val="28"/>
+        </w:rPr>
         <w:t>(Вариант № 6)</w:t>
       </w:r>
     </w:p>
     <w:p>
       <w:pPr>
-        <w:spacing w:before="240" w:after="1200" w:line="276" w:lineRule="auto"/>
+        <w:spacing w:line="312" w:lineRule="auto" w:before="480" w:after="1440"/>
+        <w:ind w:firstLine="0"/>
         <w:jc w:val="right"/>
       </w:pPr>
       <w:r>
         <w:rPr>
           <w:rFonts w:ascii="Times New Roman" w:hAnsi="Times New Roman"/>
-          <w:sz w:val="24"/>
+          <w:color w:val="000000"/>
+          <w:sz w:val="26"/>
         </w:rPr>
-        <w:t>Выполнил: студент группы БСТ2556</w:t>
-        <w:br/>
-        <w:t>Смирнов Вячеслав Юрьевич</w:t>
-        <w:br/>
-        <w:t>Зачетная книжка: ЗБСТ25066</w:t>
-        <w:br/>
-        <w:t>Направление: 09.03.02 Информационные системы и технологии</w:t>
-        <w:br/>
-        <w:t>Профиль: Инженерия DevSecOps (2 курс)</w:t>
-        <w:br/>
-        <w:br/>
-        <w:t>Проверил: доцент кафедры ЭБЖиЭ</w:t>
-        <w:br/>
-        <w:t>Курбатов В.А.</w:t>
-        <w:br/>
+        <w:t>Выполнил: студент группы БСТ2556\nСмирнов Вячеслав Юрьевич\nЗачетная книжка: ЗБСТ25066\nНаправление: 09.03.02 Информационные системы и технологии\nПрофиль: Инженерия DevSecOps (2 курс)\n\nПроверил: доцент кафедры ЭБЖиЭ\nКурбатов В.А.\n</w:t>
       </w:r>
     </w:p>
     <w:p>
       <w:pPr>
-        <w:spacing w:before="720" w:after="0" w:line="240" w:lineRule="auto"/>
+        <w:spacing w:line="360" w:lineRule="auto" w:before="720" w:after="0"/>
+        <w:ind w:firstLine="0"/>
         <w:jc w:val="center"/>
       </w:pPr>
       <w:r>
         <w:rPr>
           <w:rFonts w:ascii="Times New Roman" w:hAnsi="Times New Roman"/>
+          <w:b w:val="0"/>
+          <w:i w:val="0"/>
+          <w:color w:val="000000"/>
           <w:sz w:val="24"/>
         </w:rPr>
         <w:t>Москва, 2026 г.</w:t>
@@ -147,84 +211,206 @@
     </w:p>
     <w:p>
       <w:pPr>
-        <w:spacing w:before="240" w:after="120" w:line="276" w:lineRule="auto"/>
+        <w:keepNext/>
+        <w:spacing w:line="360" w:lineRule="auto" w:before="240" w:after="120"/>
+        <w:ind w:firstLine="709"/>
         <w:jc w:val="left"/>
       </w:pPr>
       <w:r>
         <w:rPr>
           <w:rFonts w:ascii="Times New Roman" w:hAnsi="Times New Roman"/>
           <w:b/>
-          <w:color w:val="182B49"/>
-          <w:sz w:val="32"/>
+          <w:color w:val="000000"/>
+          <w:sz w:val="28"/>
         </w:rPr>
-        <w:t>1. Цель и задачи работы</w:t>
+        <w:t>1 Цель и задачи работы</w:t>
       </w:r>
     </w:p>
     <w:p>
       <w:pPr>
-        <w:spacing w:before="0" w:after="120" w:line="276" w:lineRule="auto"/>
-        <w:ind w:firstLine="706"/>
+        <w:spacing w:line="360" w:lineRule="auto" w:before="0" w:after="0"/>
+        <w:ind w:firstLine="709"/>
         <w:jc w:val="both"/>
       </w:pPr>
       <w:r>
         <w:rPr>
           <w:rFonts w:ascii="Times New Roman" w:hAnsi="Times New Roman"/>
-          <w:sz w:val="24"/>
+          <w:b w:val="0"/>
+          <w:i w:val="0"/>
+          <w:color w:val="000000"/>
+          <w:sz w:val="28"/>
         </w:rPr>
-        <w:t>Цель работы: изучить методику нормирования и инженерного расчёта естественного бокового освещения в производственных помещениях вычислительных центров и аппаратных залов предприятий связи в соответствии с требованиями СП 52.13330 (СНиП 23-05-95) и методическими указаниями кафедры ЭБЖиЭ МТУСИ.</w:t>
+        <w:t>Цель работы: изучить методику нормирования и инженерного расчета естественного бокового освещения производственных помещений связи и вычислительных центров в соответствии с нормами СП 52.13330 (актуализированная редакция СНиП 23-05-95) и методическими указаниями кафедры ЭБЖиЭ МТУСИ.</w:t>
       </w:r>
     </w:p>
     <w:p>
       <w:pPr>
-        <w:spacing w:before="0" w:after="120" w:line="276" w:lineRule="auto"/>
-        <w:ind w:firstLine="706"/>
+        <w:spacing w:line="360" w:lineRule="auto" w:before="0" w:after="0"/>
+        <w:ind w:firstLine="709"/>
         <w:jc w:val="both"/>
       </w:pPr>
       <w:r>
         <w:rPr>
           <w:rFonts w:ascii="Times New Roman" w:hAnsi="Times New Roman"/>
-          <w:sz w:val="24"/>
+          <w:b w:val="0"/>
+          <w:i w:val="0"/>
+          <w:color w:val="000000"/>
+          <w:sz w:val="28"/>
         </w:rPr>
         <w:t>Задачи работы:</w:t>
-        <w:br/>
-        <w:t>1. На основе нормативного разряда зрительной работы определить нормированное значение коэффициента естественной освещённости (КЕО l_min).</w:t>
-        <w:br/>
-        <w:t>2. Вычислить геометрические параметры помещения, световых проемов и взаимного расположения с противостоящим зданием (h1, A/B, B/h1, L/H).</w:t>
-        <w:br/>
-        <w:t>3. Определить нормативные коэффициенты: световую характеристику окна (η0), коэффициент затенения противостоящими зданиями (K_зд), коэффициент светопропускания (r0) и средневзвешенный коэффициент отражения внутренних поверхностей (ρ_ср).</w:t>
-        <w:br/>
-        <w:t>4. Рассчитать необходимую площадь световых проемов S0 для обеспечения нормируемой освещенности.</w:t>
-        <w:br/>
-        <w:t>5. Определить необходимое число окон n и величину межоконных промежутков b, провести инженерный анализ равномерности освещения и реализуемости односторонней и двусторонней схем размещения.</w:t>
       </w:r>
     </w:p>
     <w:p>
       <w:pPr>
-        <w:spacing w:before="240" w:after="120" w:line="276" w:lineRule="auto"/>
+        <w:spacing w:line="360" w:lineRule="auto" w:before="0" w:after="0"/>
+        <w:ind w:firstLine="709"/>
+        <w:jc w:val="both"/>
+      </w:pPr>
+      <w:r>
+        <w:rPr>
+          <w:rFonts w:ascii="Times New Roman" w:hAnsi="Times New Roman"/>
+          <w:b w:val="0"/>
+          <w:i w:val="0"/>
+          <w:color w:val="000000"/>
+          <w:sz w:val="28"/>
+        </w:rPr>
+        <w:t>1) по нормативному разряду зрительной работы определить минимальный коэффициент естественной освещенности (КЕО l_min);</w:t>
+      </w:r>
+    </w:p>
+    <w:p>
+      <w:pPr>
+        <w:spacing w:line="360" w:lineRule="auto" w:before="0" w:after="0"/>
+        <w:ind w:firstLine="709"/>
+        <w:jc w:val="both"/>
+      </w:pPr>
+      <w:r>
+        <w:rPr>
+          <w:rFonts w:ascii="Times New Roman" w:hAnsi="Times New Roman"/>
+          <w:b w:val="0"/>
+          <w:i w:val="0"/>
+          <w:color w:val="000000"/>
+          <w:sz w:val="28"/>
+        </w:rPr>
+        <w:t>2) рассчитать геометрические параметры помещения, световых проемов и затенения противостоящим зданием;</w:t>
+      </w:r>
+    </w:p>
+    <w:p>
+      <w:pPr>
+        <w:spacing w:line="360" w:lineRule="auto" w:before="0" w:after="0"/>
+        <w:ind w:firstLine="709"/>
+        <w:jc w:val="both"/>
+      </w:pPr>
+      <w:r>
+        <w:rPr>
+          <w:rFonts w:ascii="Times New Roman" w:hAnsi="Times New Roman"/>
+          <w:b w:val="0"/>
+          <w:i w:val="0"/>
+          <w:color w:val="000000"/>
+          <w:sz w:val="28"/>
+        </w:rPr>
+        <w:t>3) определить нормативные коэффициенты: световую характеристику окна η0, коэффициент затенения K_зд, общий коэффициент светопропускания r0 и средневзвешенный коэффициент отражения внутренних поверхностей ρ_ср;</w:t>
+      </w:r>
+    </w:p>
+    <w:p>
+      <w:pPr>
+        <w:spacing w:line="360" w:lineRule="auto" w:before="0" w:after="0"/>
+        <w:ind w:firstLine="709"/>
+        <w:jc w:val="both"/>
+      </w:pPr>
+      <w:r>
+        <w:rPr>
+          <w:rFonts w:ascii="Times New Roman" w:hAnsi="Times New Roman"/>
+          <w:b w:val="0"/>
+          <w:i w:val="0"/>
+          <w:color w:val="000000"/>
+          <w:sz w:val="28"/>
+        </w:rPr>
+        <w:t>4) рассчитать требуемую суммарную площадь световых проемов S0, обеспечивающую нормируемую освещенность рабочих мест;</w:t>
+      </w:r>
+    </w:p>
+    <w:p>
+      <w:pPr>
+        <w:spacing w:line="360" w:lineRule="auto" w:before="0" w:after="0"/>
+        <w:ind w:firstLine="709"/>
+        <w:jc w:val="both"/>
+      </w:pPr>
+      <w:r>
+        <w:rPr>
+          <w:rFonts w:ascii="Times New Roman" w:hAnsi="Times New Roman"/>
+          <w:b w:val="0"/>
+          <w:i w:val="0"/>
+          <w:color w:val="000000"/>
+          <w:sz w:val="28"/>
+        </w:rPr>
+        <w:t>5) определить необходимое количество окон n, величину межоконного расстояния b и оценить возможность их размещения на наружной стене производственного помещения;</w:t>
+      </w:r>
+    </w:p>
+    <w:p>
+      <w:pPr>
+        <w:spacing w:line="360" w:lineRule="auto" w:before="0" w:after="0"/>
+        <w:ind w:firstLine="709"/>
+        <w:jc w:val="both"/>
+      </w:pPr>
+      <w:r>
+        <w:rPr>
+          <w:rFonts w:ascii="Times New Roman" w:hAnsi="Times New Roman"/>
+          <w:b w:val="0"/>
+          <w:i w:val="0"/>
+          <w:color w:val="000000"/>
+          <w:sz w:val="28"/>
+        </w:rPr>
+        <w:t>6) разработать технико-экономические и инженерные рекомендации по рациональной организации производственного освещения.</w:t>
+      </w:r>
+    </w:p>
+    <w:p>
+      <w:pPr>
+        <w:keepNext/>
+        <w:spacing w:line="360" w:lineRule="auto" w:before="240" w:after="120"/>
+        <w:ind w:firstLine="709"/>
         <w:jc w:val="left"/>
       </w:pPr>
       <w:r>
         <w:rPr>
           <w:rFonts w:ascii="Times New Roman" w:hAnsi="Times New Roman"/>
           <w:b/>
-          <w:color w:val="182B49"/>
-          <w:sz w:val="32"/>
+          <w:color w:val="000000"/>
+          <w:sz w:val="28"/>
         </w:rPr>
-        <w:t>2. Исходные данные варианта № 6</w:t>
+        <w:t>2 Исходные данные варианта № 6</w:t>
       </w:r>
     </w:p>
     <w:p>
       <w:pPr>
-        <w:spacing w:before="0" w:after="120" w:line="276" w:lineRule="auto"/>
-        <w:ind w:firstLine="706"/>
+        <w:spacing w:line="360" w:lineRule="auto" w:before="0" w:after="0"/>
+        <w:ind w:firstLine="709"/>
         <w:jc w:val="both"/>
       </w:pPr>
       <w:r>
         <w:rPr>
           <w:rFonts w:ascii="Times New Roman" w:hAnsi="Times New Roman"/>
-          <w:sz w:val="24"/>
+          <w:b w:val="0"/>
+          <w:i w:val="0"/>
+          <w:color w:val="000000"/>
+          <w:sz w:val="28"/>
         </w:rPr>
-        <w:t>Исходные данные приняты по Таблице 4.8 (последняя цифра зачетной книжки 6) и Таблице 4.9 (предпоследняя цифра зачетной книжки 6) методического пособия МТУСИ. Объект проектирования: аппаратный зал телеграфа / вычислительный зал на 3 этаже узла связи.</w:t>
+        <w:t>Исходные данные для выполнения расчета приняты из учебно-методического пособия кафедры ЭБЖиЭ МТУСИ по последней (6) и предпоследней (6) цифрам номера зачетной книжки ЗБСТ25066 (Таблицы 4.8 и 4.9). Объектом расчета является аппаратный зал узла связи, расположенный на третьем этаже производственного здания.</w:t>
+      </w:r>
+    </w:p>
+    <w:p>
+      <w:pPr>
+        <w:spacing w:line="360" w:lineRule="auto" w:before="120" w:after="80"/>
+        <w:ind w:firstLine="709"/>
+        <w:jc w:val="left"/>
+      </w:pPr>
+      <w:r>
+        <w:rPr>
+          <w:rFonts w:ascii="Times New Roman" w:hAnsi="Times New Roman"/>
+          <w:b w:val="0"/>
+          <w:i w:val="0"/>
+          <w:color w:val="000000"/>
+          <w:sz w:val="28"/>
+        </w:rPr>
+        <w:t>Таблица 1 – Исходные параметры помещения и световых проемов (вариант № 6)</w:t>
       </w:r>
     </w:p>
     <w:tbl>
@@ -233,12 +419,12 @@
         <w:jc w:val="center"/>
         <w:tblLook w:firstColumn="1" w:firstRow="1" w:lastColumn="0" w:lastRow="0" w:noHBand="0" w:noVBand="1" w:val="04A0"/>
         <w:tblBorders>
-          <w:top w:val="single" w:sz="4" w:space="0" w:color="D3D3D3"/>
-          <w:bottom w:val="single" w:sz="4" w:space="0" w:color="D3D3D3"/>
-          <w:left w:val="none"/>
-          <w:right w:val="none"/>
-          <w:insideH w:val="single" w:sz="4" w:space="0" w:color="D3D3D3"/>
-          <w:insideV w:val="none"/>
+          <w:top w:val="single" w:sz="4" w:space="0" w:color="000000"/>
+          <w:bottom w:val="single" w:sz="4" w:space="0" w:color="000000"/>
+          <w:left w:val="single" w:sz="4" w:space="0" w:color="000000"/>
+          <w:right w:val="single" w:sz="4" w:space="0" w:color="000000"/>
+          <w:insideH w:val="single" w:sz="4" w:space="0" w:color="000000"/>
+          <w:insideV w:val="single" w:sz="4" w:space="0" w:color="000000"/>
         </w:tblBorders>
       </w:tblPr>
       <w:tblGrid>
@@ -247,76 +433,27 @@
         <w:gridCol w:w="3230"/>
       </w:tblGrid>
       <w:tr>
-        <w:tc>
-          <w:tcPr>
-            <w:tcW w:type="dxa" w:w="3230"/>
-            <w:shd w:fill="E8EEF5"/>
-          </w:tcPr>
-          <w:p>
-            <w:pPr>
-              <w:jc w:val="left"/>
-            </w:pPr>
-            <w:r>
-              <w:rPr>
-                <w:rFonts w:ascii="Times New Roman" w:hAnsi="Times New Roman"/>
-                <w:sz w:val="20"/>
-              </w:rPr>
-              <w:t>Разряд зрительной работы</w:t>
-            </w:r>
-          </w:p>
-        </w:tc>
-        <w:tc>
-          <w:tcPr>
-            <w:tcW w:type="dxa" w:w="3230"/>
-            <w:shd w:fill="E8EEF5"/>
-          </w:tcPr>
-          <w:p>
-            <w:pPr>
-              <w:jc w:val="center"/>
-            </w:pPr>
-            <w:r>
-              <w:rPr>
-                <w:rFonts w:ascii="Times New Roman" w:hAnsi="Times New Roman"/>
-                <w:sz w:val="20"/>
-              </w:rPr>
-              <w:t>III</w:t>
-            </w:r>
-          </w:p>
-        </w:tc>
-        <w:tc>
-          <w:tcPr>
-            <w:tcW w:type="dxa" w:w="3230"/>
-            <w:shd w:fill="E8EEF5"/>
-          </w:tcPr>
-          <w:p>
-            <w:pPr>
-              <w:jc w:val="left"/>
-            </w:pPr>
-            <w:r>
-              <w:rPr>
-                <w:rFonts w:ascii="Times New Roman" w:hAnsi="Times New Roman"/>
-                <w:sz w:val="20"/>
-              </w:rPr>
-              <w:t>Высокая точность (размер объекта различения 0,3–0,5 мм)</w:t>
-            </w:r>
-          </w:p>
-        </w:tc>
-      </w:tr>
-      <w:tr>
+        <w:trPr>
+          <w:cantSplit/>
+        </w:trPr>
         <w:tc>
           <w:tcPr>
             <w:tcW w:type="dxa" w:w="3230"/>
           </w:tcPr>
           <w:p>
             <w:pPr>
-              <w:jc w:val="left"/>
+              <w:spacing w:line="240" w:lineRule="auto" w:before="60" w:after="60"/>
+              <w:ind w:firstLine="0"/>
+              <w:jc w:val="center"/>
             </w:pPr>
             <w:r>
               <w:rPr>
                 <w:rFonts w:ascii="Times New Roman" w:hAnsi="Times New Roman"/>
-                <w:sz w:val="20"/>
+                <w:b/>
+                <w:color w:val="000000"/>
+                <w:sz w:val="24"/>
               </w:rPr>
-              <w:t>Длина помещения (A)</w:t>
+              <w:t>Наименование параметра</w:t>
             </w:r>
           </w:p>
         </w:tc>
@@ -326,14 +463,18 @@
           </w:tcPr>
           <w:p>
             <w:pPr>
+              <w:spacing w:line="240" w:lineRule="auto" w:before="60" w:after="60"/>
+              <w:ind w:firstLine="0"/>
               <w:jc w:val="center"/>
             </w:pPr>
             <w:r>
               <w:rPr>
                 <w:rFonts w:ascii="Times New Roman" w:hAnsi="Times New Roman"/>
-                <w:sz w:val="20"/>
+                <w:b/>
+                <w:color w:val="000000"/>
+                <w:sz w:val="24"/>
               </w:rPr>
-              <w:t>20,0 м</w:t>
+              <w:t>Обозначение и значение</w:t>
             </w:r>
           </w:p>
         </w:tc>
@@ -343,33 +484,43 @@
           </w:tcPr>
           <w:p>
             <w:pPr>
-              <w:jc w:val="left"/>
+              <w:spacing w:line="240" w:lineRule="auto" w:before="60" w:after="60"/>
+              <w:ind w:firstLine="0"/>
+              <w:jc w:val="center"/>
             </w:pPr>
             <w:r>
               <w:rPr>
                 <w:rFonts w:ascii="Times New Roman" w:hAnsi="Times New Roman"/>
-                <w:sz w:val="20"/>
+                <w:b/>
+                <w:color w:val="000000"/>
+                <w:sz w:val="24"/>
               </w:rPr>
-              <w:t>Размер вдоль наружной светонесущей стены</w:t>
+              <w:t>Примечание</w:t>
             </w:r>
           </w:p>
         </w:tc>
       </w:tr>
       <w:tr>
+        <w:trPr>
+          <w:cantSplit/>
+        </w:trPr>
         <w:tc>
           <w:tcPr>
             <w:tcW w:type="dxa" w:w="3230"/>
           </w:tcPr>
           <w:p>
             <w:pPr>
+              <w:spacing w:line="240" w:lineRule="auto" w:before="60" w:after="60"/>
+              <w:ind w:firstLine="0"/>
               <w:jc w:val="left"/>
             </w:pPr>
             <w:r>
               <w:rPr>
                 <w:rFonts w:ascii="Times New Roman" w:hAnsi="Times New Roman"/>
-                <w:sz w:val="20"/>
+                <w:color w:val="000000"/>
+                <w:sz w:val="24"/>
               </w:rPr>
-              <w:t>Ширина помещения (B)</w:t>
+              <w:t>Разряд зрительной работы</w:t>
             </w:r>
           </w:p>
         </w:tc>
@@ -379,14 +530,17 @@
           </w:tcPr>
           <w:p>
             <w:pPr>
+              <w:spacing w:line="240" w:lineRule="auto" w:before="60" w:after="60"/>
+              <w:ind w:firstLine="0"/>
               <w:jc w:val="center"/>
             </w:pPr>
             <w:r>
               <w:rPr>
                 <w:rFonts w:ascii="Times New Roman" w:hAnsi="Times New Roman"/>
-                <w:sz w:val="20"/>
+                <w:color w:val="000000"/>
+                <w:sz w:val="24"/>
               </w:rPr>
-              <w:t>10,0 м</w:t>
+              <w:t>Разряд III</w:t>
             </w:r>
           </w:p>
         </w:tc>
@@ -396,33 +550,42 @@
           </w:tcPr>
           <w:p>
             <w:pPr>
+              <w:spacing w:line="240" w:lineRule="auto" w:before="60" w:after="60"/>
+              <w:ind w:firstLine="0"/>
               <w:jc w:val="left"/>
             </w:pPr>
             <w:r>
               <w:rPr>
                 <w:rFonts w:ascii="Times New Roman" w:hAnsi="Times New Roman"/>
-                <w:sz w:val="20"/>
+                <w:color w:val="000000"/>
+                <w:sz w:val="24"/>
               </w:rPr>
-              <w:t>Глубина помещения</w:t>
+              <w:t>Высокая точность (объект различения 0,3–0,5 мм)</w:t>
             </w:r>
           </w:p>
         </w:tc>
       </w:tr>
       <w:tr>
+        <w:trPr>
+          <w:cantSplit/>
+        </w:trPr>
         <w:tc>
           <w:tcPr>
             <w:tcW w:type="dxa" w:w="3230"/>
           </w:tcPr>
           <w:p>
             <w:pPr>
+              <w:spacing w:line="240" w:lineRule="auto" w:before="60" w:after="60"/>
+              <w:ind w:firstLine="0"/>
               <w:jc w:val="left"/>
             </w:pPr>
             <w:r>
               <w:rPr>
                 <w:rFonts w:ascii="Times New Roman" w:hAnsi="Times New Roman"/>
-                <w:sz w:val="20"/>
+                <w:color w:val="000000"/>
+                <w:sz w:val="24"/>
               </w:rPr>
-              <w:t>Высота помещения (h)</w:t>
+              <w:t>Длина производственного помещения</w:t>
             </w:r>
           </w:p>
         </w:tc>
@@ -432,14 +595,17 @@
           </w:tcPr>
           <w:p>
             <w:pPr>
+              <w:spacing w:line="240" w:lineRule="auto" w:before="60" w:after="60"/>
+              <w:ind w:firstLine="0"/>
               <w:jc w:val="center"/>
             </w:pPr>
             <w:r>
               <w:rPr>
                 <w:rFonts w:ascii="Times New Roman" w:hAnsi="Times New Roman"/>
-                <w:sz w:val="20"/>
+                <w:color w:val="000000"/>
+                <w:sz w:val="24"/>
               </w:rPr>
-              <w:t>5,0 м</w:t>
+              <w:t>A = 20,0 м</w:t>
             </w:r>
           </w:p>
         </w:tc>
@@ -449,33 +615,42 @@
           </w:tcPr>
           <w:p>
             <w:pPr>
+              <w:spacing w:line="240" w:lineRule="auto" w:before="60" w:after="60"/>
+              <w:ind w:firstLine="0"/>
               <w:jc w:val="left"/>
             </w:pPr>
             <w:r>
               <w:rPr>
                 <w:rFonts w:ascii="Times New Roman" w:hAnsi="Times New Roman"/>
-                <w:sz w:val="20"/>
+                <w:color w:val="000000"/>
+                <w:sz w:val="24"/>
               </w:rPr>
-              <w:t>Высота от пола до потолка</w:t>
+              <w:t>Размер вдоль светонесущей стены</w:t>
             </w:r>
           </w:p>
         </w:tc>
       </w:tr>
       <w:tr>
+        <w:trPr>
+          <w:cantSplit/>
+        </w:trPr>
         <w:tc>
           <w:tcPr>
             <w:tcW w:type="dxa" w:w="3230"/>
           </w:tcPr>
           <w:p>
             <w:pPr>
+              <w:spacing w:line="240" w:lineRule="auto" w:before="60" w:after="60"/>
+              <w:ind w:firstLine="0"/>
               <w:jc w:val="left"/>
             </w:pPr>
             <w:r>
               <w:rPr>
                 <w:rFonts w:ascii="Times New Roman" w:hAnsi="Times New Roman"/>
-                <w:sz w:val="20"/>
+                <w:color w:val="000000"/>
+                <w:sz w:val="24"/>
               </w:rPr>
-              <w:t>Высота оконного проема (h0)</w:t>
+              <w:t>Ширина производственного помещения</w:t>
             </w:r>
           </w:p>
         </w:tc>
@@ -485,14 +660,17 @@
           </w:tcPr>
           <w:p>
             <w:pPr>
+              <w:spacing w:line="240" w:lineRule="auto" w:before="60" w:after="60"/>
+              <w:ind w:firstLine="0"/>
               <w:jc w:val="center"/>
             </w:pPr>
             <w:r>
               <w:rPr>
                 <w:rFonts w:ascii="Times New Roman" w:hAnsi="Times New Roman"/>
-                <w:sz w:val="20"/>
+                <w:color w:val="000000"/>
+                <w:sz w:val="24"/>
               </w:rPr>
-              <w:t>3,5 м</w:t>
+              <w:t>B = 10,0 м</w:t>
             </w:r>
           </w:p>
         </w:tc>
@@ -502,33 +680,42 @@
           </w:tcPr>
           <w:p>
             <w:pPr>
+              <w:spacing w:line="240" w:lineRule="auto" w:before="60" w:after="60"/>
+              <w:ind w:firstLine="0"/>
               <w:jc w:val="left"/>
             </w:pPr>
             <w:r>
               <w:rPr>
                 <w:rFonts w:ascii="Times New Roman" w:hAnsi="Times New Roman"/>
-                <w:sz w:val="20"/>
+                <w:color w:val="000000"/>
+                <w:sz w:val="24"/>
               </w:rPr>
-              <w:t>Вертикальный размер окна</w:t>
+              <w:t>Глубина помещения</w:t>
             </w:r>
           </w:p>
         </w:tc>
       </w:tr>
       <w:tr>
+        <w:trPr>
+          <w:cantSplit/>
+        </w:trPr>
         <w:tc>
           <w:tcPr>
             <w:tcW w:type="dxa" w:w="3230"/>
           </w:tcPr>
           <w:p>
             <w:pPr>
+              <w:spacing w:line="240" w:lineRule="auto" w:before="60" w:after="60"/>
+              <w:ind w:firstLine="0"/>
               <w:jc w:val="left"/>
             </w:pPr>
             <w:r>
               <w:rPr>
                 <w:rFonts w:ascii="Times New Roman" w:hAnsi="Times New Roman"/>
-                <w:sz w:val="20"/>
+                <w:color w:val="000000"/>
+                <w:sz w:val="24"/>
               </w:rPr>
-              <w:t>Высота подоконника над полом (h_под)</w:t>
+              <w:t>Высота производственного помещения</w:t>
             </w:r>
           </w:p>
         </w:tc>
@@ -538,14 +725,17 @@
           </w:tcPr>
           <w:p>
             <w:pPr>
+              <w:spacing w:line="240" w:lineRule="auto" w:before="60" w:after="60"/>
+              <w:ind w:firstLine="0"/>
               <w:jc w:val="center"/>
             </w:pPr>
             <w:r>
               <w:rPr>
                 <w:rFonts w:ascii="Times New Roman" w:hAnsi="Times New Roman"/>
-                <w:sz w:val="20"/>
+                <w:color w:val="000000"/>
+                <w:sz w:val="24"/>
               </w:rPr>
-              <w:t>1,2 м</w:t>
+              <w:t>h = 5,0 м</w:t>
             </w:r>
           </w:p>
         </w:tc>
@@ -555,33 +745,42 @@
           </w:tcPr>
           <w:p>
             <w:pPr>
+              <w:spacing w:line="240" w:lineRule="auto" w:before="60" w:after="60"/>
+              <w:ind w:firstLine="0"/>
               <w:jc w:val="left"/>
             </w:pPr>
             <w:r>
               <w:rPr>
                 <w:rFonts w:ascii="Times New Roman" w:hAnsi="Times New Roman"/>
-                <w:sz w:val="20"/>
+                <w:color w:val="000000"/>
+                <w:sz w:val="24"/>
               </w:rPr>
-              <w:t>Расстояние от пола до подоконника</w:t>
+              <w:t>Высота от пола до потолка</w:t>
             </w:r>
           </w:p>
         </w:tc>
       </w:tr>
       <w:tr>
+        <w:trPr>
+          <w:cantSplit/>
+        </w:trPr>
         <w:tc>
           <w:tcPr>
             <w:tcW w:type="dxa" w:w="3230"/>
           </w:tcPr>
           <w:p>
             <w:pPr>
+              <w:spacing w:line="240" w:lineRule="auto" w:before="60" w:after="60"/>
+              <w:ind w:firstLine="0"/>
               <w:jc w:val="left"/>
             </w:pPr>
             <w:r>
               <w:rPr>
                 <w:rFonts w:ascii="Times New Roman" w:hAnsi="Times New Roman"/>
-                <w:sz w:val="20"/>
+                <w:color w:val="000000"/>
+                <w:sz w:val="24"/>
               </w:rPr>
-              <w:t>Высота рабочей поверхности (h_раб)</w:t>
+              <w:t>Высота оконного проема</w:t>
             </w:r>
           </w:p>
         </w:tc>
@@ -591,14 +790,17 @@
           </w:tcPr>
           <w:p>
             <w:pPr>
+              <w:spacing w:line="240" w:lineRule="auto" w:before="60" w:after="60"/>
+              <w:ind w:firstLine="0"/>
               <w:jc w:val="center"/>
             </w:pPr>
             <w:r>
               <w:rPr>
                 <w:rFonts w:ascii="Times New Roman" w:hAnsi="Times New Roman"/>
-                <w:sz w:val="20"/>
+                <w:color w:val="000000"/>
+                <w:sz w:val="24"/>
               </w:rPr>
-              <w:t>1,2 м</w:t>
+              <w:t>h0 = 3,5 м</w:t>
             </w:r>
           </w:p>
         </w:tc>
@@ -608,33 +810,42 @@
           </w:tcPr>
           <w:p>
             <w:pPr>
+              <w:spacing w:line="240" w:lineRule="auto" w:before="60" w:after="60"/>
+              <w:ind w:firstLine="0"/>
               <w:jc w:val="left"/>
             </w:pPr>
             <w:r>
               <w:rPr>
                 <w:rFonts w:ascii="Times New Roman" w:hAnsi="Times New Roman"/>
-                <w:sz w:val="20"/>
+                <w:color w:val="000000"/>
+                <w:sz w:val="24"/>
               </w:rPr>
-              <w:t>Уровень горизонтальной рабочей поверхности</w:t>
+              <w:t>Высота светопрозрачной части окна</w:t>
             </w:r>
           </w:p>
         </w:tc>
       </w:tr>
       <w:tr>
+        <w:trPr>
+          <w:cantSplit/>
+        </w:trPr>
         <w:tc>
           <w:tcPr>
             <w:tcW w:type="dxa" w:w="3230"/>
           </w:tcPr>
           <w:p>
             <w:pPr>
+              <w:spacing w:line="240" w:lineRule="auto" w:before="60" w:after="60"/>
+              <w:ind w:firstLine="0"/>
               <w:jc w:val="left"/>
             </w:pPr>
             <w:r>
               <w:rPr>
                 <w:rFonts w:ascii="Times New Roman" w:hAnsi="Times New Roman"/>
-                <w:sz w:val="20"/>
+                <w:color w:val="000000"/>
+                <w:sz w:val="24"/>
               </w:rPr>
-              <w:t>Расстояние до здания напротив (L)</w:t>
+              <w:t>Высота подоконника над полом</w:t>
             </w:r>
           </w:p>
         </w:tc>
@@ -644,14 +855,17 @@
           </w:tcPr>
           <w:p>
             <w:pPr>
+              <w:spacing w:line="240" w:lineRule="auto" w:before="60" w:after="60"/>
+              <w:ind w:firstLine="0"/>
               <w:jc w:val="center"/>
             </w:pPr>
             <w:r>
               <w:rPr>
                 <w:rFonts w:ascii="Times New Roman" w:hAnsi="Times New Roman"/>
-                <w:sz w:val="20"/>
+                <w:color w:val="000000"/>
+                <w:sz w:val="24"/>
               </w:rPr>
-              <w:t>30,0 м</w:t>
+              <w:t>h_под = 1,2 м</w:t>
             </w:r>
           </w:p>
         </w:tc>
@@ -661,33 +875,42 @@
           </w:tcPr>
           <w:p>
             <w:pPr>
+              <w:spacing w:line="240" w:lineRule="auto" w:before="60" w:after="60"/>
+              <w:ind w:firstLine="0"/>
               <w:jc w:val="left"/>
             </w:pPr>
             <w:r>
               <w:rPr>
                 <w:rFonts w:ascii="Times New Roman" w:hAnsi="Times New Roman"/>
-                <w:sz w:val="20"/>
+                <w:color w:val="000000"/>
+                <w:sz w:val="24"/>
               </w:rPr>
-              <w:t>Расстояние между противостоящими зданиями</w:t>
+              <w:t>Расстояние от уровня пола до подоконника</w:t>
             </w:r>
           </w:p>
         </w:tc>
       </w:tr>
       <w:tr>
+        <w:trPr>
+          <w:cantSplit/>
+        </w:trPr>
         <w:tc>
           <w:tcPr>
             <w:tcW w:type="dxa" w:w="3230"/>
           </w:tcPr>
           <w:p>
             <w:pPr>
+              <w:spacing w:line="240" w:lineRule="auto" w:before="60" w:after="60"/>
+              <w:ind w:firstLine="0"/>
               <w:jc w:val="left"/>
             </w:pPr>
             <w:r>
               <w:rPr>
                 <w:rFonts w:ascii="Times New Roman" w:hAnsi="Times New Roman"/>
-                <w:sz w:val="20"/>
+                <w:color w:val="000000"/>
+                <w:sz w:val="24"/>
               </w:rPr>
-              <w:t>Высота карниза противостоящего здания (H)</w:t>
+              <w:t>Высота рабочей поверхности</w:t>
             </w:r>
           </w:p>
         </w:tc>
@@ -697,14 +920,17 @@
           </w:tcPr>
           <w:p>
             <w:pPr>
+              <w:spacing w:line="240" w:lineRule="auto" w:before="60" w:after="60"/>
+              <w:ind w:firstLine="0"/>
               <w:jc w:val="center"/>
             </w:pPr>
             <w:r>
               <w:rPr>
                 <w:rFonts w:ascii="Times New Roman" w:hAnsi="Times New Roman"/>
-                <w:sz w:val="20"/>
+                <w:color w:val="000000"/>
+                <w:sz w:val="24"/>
               </w:rPr>
-              <w:t>30,0 м</w:t>
+              <w:t>h_раб = 1,2 м</w:t>
             </w:r>
           </w:p>
         </w:tc>
@@ -714,33 +940,42 @@
           </w:tcPr>
           <w:p>
             <w:pPr>
+              <w:spacing w:line="240" w:lineRule="auto" w:before="60" w:after="60"/>
+              <w:ind w:firstLine="0"/>
               <w:jc w:val="left"/>
             </w:pPr>
             <w:r>
               <w:rPr>
                 <w:rFonts w:ascii="Times New Roman" w:hAnsi="Times New Roman"/>
-                <w:sz w:val="20"/>
+                <w:color w:val="000000"/>
+                <w:sz w:val="24"/>
               </w:rPr>
-              <w:t>Высота над уровнем подоконника зала</w:t>
+              <w:t>Уровень горизонтальной рабочей плоскости</w:t>
             </w:r>
           </w:p>
         </w:tc>
       </w:tr>
       <w:tr>
+        <w:trPr>
+          <w:cantSplit/>
+        </w:trPr>
         <w:tc>
           <w:tcPr>
             <w:tcW w:type="dxa" w:w="3230"/>
           </w:tcPr>
           <w:p>
             <w:pPr>
+              <w:spacing w:line="240" w:lineRule="auto" w:before="60" w:after="60"/>
+              <w:ind w:firstLine="0"/>
               <w:jc w:val="left"/>
             </w:pPr>
             <w:r>
               <w:rPr>
                 <w:rFonts w:ascii="Times New Roman" w:hAnsi="Times New Roman"/>
-                <w:sz w:val="20"/>
+                <w:color w:val="000000"/>
+                <w:sz w:val="24"/>
               </w:rPr>
-              <w:t>Ширина одного окна (b0)</w:t>
+              <w:t>Расстояние до здания напротив</w:t>
             </w:r>
           </w:p>
         </w:tc>
@@ -750,14 +985,17 @@
           </w:tcPr>
           <w:p>
             <w:pPr>
+              <w:spacing w:line="240" w:lineRule="auto" w:before="60" w:after="60"/>
+              <w:ind w:firstLine="0"/>
               <w:jc w:val="center"/>
             </w:pPr>
             <w:r>
               <w:rPr>
                 <w:rFonts w:ascii="Times New Roman" w:hAnsi="Times New Roman"/>
-                <w:sz w:val="20"/>
+                <w:color w:val="000000"/>
+                <w:sz w:val="24"/>
               </w:rPr>
-              <w:t>2,0 м</w:t>
+              <w:t>L = 30,0 м</w:t>
             </w:r>
           </w:p>
         </w:tc>
@@ -767,31 +1005,170 @@
           </w:tcPr>
           <w:p>
             <w:pPr>
+              <w:spacing w:line="240" w:lineRule="auto" w:before="60" w:after="60"/>
+              <w:ind w:firstLine="0"/>
               <w:jc w:val="left"/>
             </w:pPr>
             <w:r>
               <w:rPr>
                 <w:rFonts w:ascii="Times New Roman" w:hAnsi="Times New Roman"/>
-                <w:sz w:val="20"/>
+                <w:color w:val="000000"/>
+                <w:sz w:val="24"/>
               </w:rPr>
-              <w:t>Горизонтальный размер светового проема</w:t>
+              <w:t>Расстояние между противостоящими зданиями</w:t>
             </w:r>
           </w:p>
         </w:tc>
       </w:tr>
       <w:tr>
+        <w:trPr>
+          <w:cantSplit/>
+        </w:trPr>
         <w:tc>
           <w:tcPr>
             <w:tcW w:type="dxa" w:w="3230"/>
           </w:tcPr>
           <w:p>
             <w:pPr>
+              <w:spacing w:line="240" w:lineRule="auto" w:before="60" w:after="60"/>
+              <w:ind w:firstLine="0"/>
               <w:jc w:val="left"/>
             </w:pPr>
             <w:r>
               <w:rPr>
                 <w:rFonts w:ascii="Times New Roman" w:hAnsi="Times New Roman"/>
-                <w:sz w:val="20"/>
+                <w:color w:val="000000"/>
+                <w:sz w:val="24"/>
+              </w:rPr>
+              <w:t>Высота карниза противостоящего здания</w:t>
+            </w:r>
+          </w:p>
+        </w:tc>
+        <w:tc>
+          <w:tcPr>
+            <w:tcW w:type="dxa" w:w="3230"/>
+          </w:tcPr>
+          <w:p>
+            <w:pPr>
+              <w:spacing w:line="240" w:lineRule="auto" w:before="60" w:after="60"/>
+              <w:ind w:firstLine="0"/>
+              <w:jc w:val="center"/>
+            </w:pPr>
+            <w:r>
+              <w:rPr>
+                <w:rFonts w:ascii="Times New Roman" w:hAnsi="Times New Roman"/>
+                <w:color w:val="000000"/>
+                <w:sz w:val="24"/>
+              </w:rPr>
+              <w:t>H = 30,0 м</w:t>
+            </w:r>
+          </w:p>
+        </w:tc>
+        <w:tc>
+          <w:tcPr>
+            <w:tcW w:type="dxa" w:w="3230"/>
+          </w:tcPr>
+          <w:p>
+            <w:pPr>
+              <w:spacing w:line="240" w:lineRule="auto" w:before="60" w:after="60"/>
+              <w:ind w:firstLine="0"/>
+              <w:jc w:val="left"/>
+            </w:pPr>
+            <w:r>
+              <w:rPr>
+                <w:rFonts w:ascii="Times New Roman" w:hAnsi="Times New Roman"/>
+                <w:color w:val="000000"/>
+                <w:sz w:val="24"/>
+              </w:rPr>
+              <w:t>Высота карниза над уровнем подоконника</w:t>
+            </w:r>
+          </w:p>
+        </w:tc>
+      </w:tr>
+      <w:tr>
+        <w:trPr>
+          <w:cantSplit/>
+        </w:trPr>
+        <w:tc>
+          <w:tcPr>
+            <w:tcW w:type="dxa" w:w="3230"/>
+          </w:tcPr>
+          <w:p>
+            <w:pPr>
+              <w:spacing w:line="240" w:lineRule="auto" w:before="60" w:after="60"/>
+              <w:ind w:firstLine="0"/>
+              <w:jc w:val="left"/>
+            </w:pPr>
+            <w:r>
+              <w:rPr>
+                <w:rFonts w:ascii="Times New Roman" w:hAnsi="Times New Roman"/>
+                <w:color w:val="000000"/>
+                <w:sz w:val="24"/>
+              </w:rPr>
+              <w:t>Ширина одного оконного проема</w:t>
+            </w:r>
+          </w:p>
+        </w:tc>
+        <w:tc>
+          <w:tcPr>
+            <w:tcW w:type="dxa" w:w="3230"/>
+          </w:tcPr>
+          <w:p>
+            <w:pPr>
+              <w:spacing w:line="240" w:lineRule="auto" w:before="60" w:after="60"/>
+              <w:ind w:firstLine="0"/>
+              <w:jc w:val="center"/>
+            </w:pPr>
+            <w:r>
+              <w:rPr>
+                <w:rFonts w:ascii="Times New Roman" w:hAnsi="Times New Roman"/>
+                <w:color w:val="000000"/>
+                <w:sz w:val="24"/>
+              </w:rPr>
+              <w:t>b0 = 2,0 м</w:t>
+            </w:r>
+          </w:p>
+        </w:tc>
+        <w:tc>
+          <w:tcPr>
+            <w:tcW w:type="dxa" w:w="3230"/>
+          </w:tcPr>
+          <w:p>
+            <w:pPr>
+              <w:spacing w:line="240" w:lineRule="auto" w:before="60" w:after="60"/>
+              <w:ind w:firstLine="0"/>
+              <w:jc w:val="left"/>
+            </w:pPr>
+            <w:r>
+              <w:rPr>
+                <w:rFonts w:ascii="Times New Roman" w:hAnsi="Times New Roman"/>
+                <w:color w:val="000000"/>
+                <w:sz w:val="24"/>
+              </w:rPr>
+              <w:t>Ширина светового проема</w:t>
+            </w:r>
+          </w:p>
+        </w:tc>
+      </w:tr>
+      <w:tr>
+        <w:trPr>
+          <w:cantSplit/>
+        </w:trPr>
+        <w:tc>
+          <w:tcPr>
+            <w:tcW w:type="dxa" w:w="3230"/>
+          </w:tcPr>
+          <w:p>
+            <w:pPr>
+              <w:spacing w:line="240" w:lineRule="auto" w:before="60" w:after="60"/>
+              <w:ind w:firstLine="0"/>
+              <w:jc w:val="left"/>
+            </w:pPr>
+            <w:r>
+              <w:rPr>
+                <w:rFonts w:ascii="Times New Roman" w:hAnsi="Times New Roman"/>
+                <w:color w:val="000000"/>
+                <w:sz w:val="24"/>
               </w:rPr>
               <w:t>Коэффициенты отражения поверхностей</w:t>
             </w:r>
@@ -803,18 +1180,17 @@
           </w:tcPr>
           <w:p>
             <w:pPr>
+              <w:spacing w:line="240" w:lineRule="auto" w:before="60" w:after="60"/>
+              <w:ind w:firstLine="0"/>
               <w:jc w:val="center"/>
             </w:pPr>
             <w:r>
               <w:rPr>
                 <w:rFonts w:ascii="Times New Roman" w:hAnsi="Times New Roman"/>
-                <w:sz w:val="20"/>
+                <w:color w:val="000000"/>
+                <w:sz w:val="24"/>
               </w:rPr>
-              <w:t>ρ_п = 50%</w:t>
-              <w:br/>
-              <w:t>ρ_ст = 50%</w:t>
-              <w:br/>
-              <w:t>ρ_пол = 10%</w:t>
+              <w:t>ρ_п = 50 %, ρ_ст = 50 %, ρ_пол = 10 %</w:t>
             </w:r>
           </w:p>
         </w:tc>
@@ -824,33 +1200,1965 @@
           </w:tcPr>
           <w:p>
             <w:pPr>
+              <w:spacing w:line="240" w:lineRule="auto" w:before="60" w:after="60"/>
+              <w:ind w:firstLine="0"/>
               <w:jc w:val="left"/>
             </w:pPr>
             <w:r>
               <w:rPr>
                 <w:rFonts w:ascii="Times New Roman" w:hAnsi="Times New Roman"/>
-                <w:sz w:val="20"/>
+                <w:color w:val="000000"/>
+                <w:sz w:val="24"/>
               </w:rPr>
-              <w:t>Потолок и стены светлые, пол темный линолеум/бетон</w:t>
+              <w:t>Потолок и стены светлые, пол темный</w:t>
             </w:r>
           </w:p>
         </w:tc>
       </w:tr>
+    </w:tbl>
+    <w:p>
+      <w:pPr>
+        <w:keepNext/>
+        <w:spacing w:line="360" w:lineRule="auto" w:before="240" w:after="120"/>
+        <w:ind w:firstLine="709"/>
+        <w:jc w:val="left"/>
+      </w:pPr>
+      <w:r>
+        <w:rPr>
+          <w:rFonts w:ascii="Times New Roman" w:hAnsi="Times New Roman"/>
+          <w:b/>
+          <w:color w:val="000000"/>
+          <w:sz w:val="28"/>
+        </w:rPr>
+        <w:t>3 Методика и пошаговый расчет естественного освещения</w:t>
+      </w:r>
+    </w:p>
+    <w:p>
+      <w:pPr>
+        <w:spacing w:line="360" w:lineRule="auto" w:before="0" w:after="0"/>
+        <w:ind w:firstLine="709"/>
+        <w:jc w:val="both"/>
+      </w:pPr>
+      <w:r>
+        <w:rPr>
+          <w:rFonts w:ascii="Times New Roman" w:hAnsi="Times New Roman"/>
+          <w:b w:val="0"/>
+          <w:i w:val="0"/>
+          <w:color w:val="000000"/>
+          <w:sz w:val="28"/>
+        </w:rPr>
+        <w:t>Расчет необходимой площади оконных проемов для создания нормируемой естественной освещенности в производственном помещении выполняется по формуле:</w:t>
+      </w:r>
+    </w:p>
+    <w:tbl>
+      <w:tblPr>
+        <w:tblW w:type="auto" w:w="0"/>
+        <w:jc w:val="center"/>
+        <w:tblLayout w:type="fixed"/>
+        <w:tblLook w:firstColumn="1" w:firstRow="1" w:lastColumn="0" w:lastRow="0" w:noHBand="0" w:noVBand="1" w:val="04A0"/>
+        <w:tblBorders>
+          <w:top w:val="none"/>
+          <w:bottom w:val="none"/>
+          <w:left w:val="none"/>
+          <w:right w:val="none"/>
+          <w:insideH w:val="none"/>
+          <w:insideV w:val="none"/>
+        </w:tblBorders>
+      </w:tblPr>
+      <w:tblGrid>
+        <w:gridCol w:w="8220"/>
+        <w:gridCol w:w="1134"/>
+      </w:tblGrid>
       <w:tr>
+        <w:tc>
+          <w:tcPr>
+            <w:tcW w:type="dxa" w:w="4844"/>
+          </w:tcPr>
+          <w:p>
+            <w:pPr>
+              <w:spacing w:line="360" w:lineRule="auto" w:before="80" w:after="80"/>
+              <w:ind w:firstLine="0"/>
+              <w:jc w:val="center"/>
+            </w:pPr>
+            <w:r>
+              <w:rPr>
+                <w:rFonts w:ascii="Times New Roman" w:hAnsi="Times New Roman"/>
+                <w:i/>
+                <w:color w:val="000000"/>
+                <w:sz w:val="28"/>
+              </w:rPr>
+              <w:t>S0 = (S_пол · l_min · η0 · K_зд) / (100 · r0 · r1),</w:t>
+            </w:r>
+          </w:p>
+        </w:tc>
+        <w:tc>
+          <w:tcPr>
+            <w:tcW w:type="dxa" w:w="4844"/>
+          </w:tcPr>
+          <w:p>
+            <w:pPr>
+              <w:spacing w:line="360" w:lineRule="auto" w:before="80" w:after="80"/>
+              <w:ind w:firstLine="0"/>
+              <w:jc w:val="right"/>
+            </w:pPr>
+            <w:r>
+              <w:rPr>
+                <w:rFonts w:ascii="Times New Roman" w:hAnsi="Times New Roman"/>
+                <w:color w:val="000000"/>
+                <w:sz w:val="28"/>
+              </w:rPr>
+              <w:t>(1)</w:t>
+            </w:r>
+          </w:p>
+        </w:tc>
+      </w:tr>
+    </w:tbl>
+    <w:p>
+      <w:pPr>
+        <w:spacing w:line="360" w:lineRule="auto" w:before="0" w:after="0"/>
+        <w:ind w:firstLine="0"/>
+        <w:jc w:val="both"/>
+      </w:pPr>
+      <w:r>
+        <w:rPr>
+          <w:rFonts w:ascii="Times New Roman" w:hAnsi="Times New Roman"/>
+          <w:b w:val="0"/>
+          <w:i w:val="0"/>
+          <w:color w:val="000000"/>
+          <w:sz w:val="28"/>
+        </w:rPr>
+        <w:t>где S_пол – площадь пола производственного помещения, м²;</w:t>
+      </w:r>
+    </w:p>
+    <w:p>
+      <w:pPr>
+        <w:spacing w:line="360" w:lineRule="auto" w:before="0" w:after="0"/>
+        <w:ind w:firstLine="0"/>
+        <w:jc w:val="both"/>
+      </w:pPr>
+      <w:r>
+        <w:rPr>
+          <w:rFonts w:ascii="Times New Roman" w:hAnsi="Times New Roman"/>
+          <w:b w:val="0"/>
+          <w:i w:val="0"/>
+          <w:color w:val="000000"/>
+          <w:sz w:val="28"/>
+        </w:rPr>
+        <w:t>l_min – минимальный (нормированный) коэффициент естественной освещенности, %;</w:t>
+      </w:r>
+    </w:p>
+    <w:p>
+      <w:pPr>
+        <w:spacing w:line="360" w:lineRule="auto" w:before="0" w:after="0"/>
+        <w:ind w:firstLine="0"/>
+        <w:jc w:val="both"/>
+      </w:pPr>
+      <w:r>
+        <w:rPr>
+          <w:rFonts w:ascii="Times New Roman" w:hAnsi="Times New Roman"/>
+          <w:b w:val="0"/>
+          <w:i w:val="0"/>
+          <w:color w:val="000000"/>
+          <w:sz w:val="28"/>
+        </w:rPr>
+        <w:t>η0 – световая характеристика окна;</w:t>
+      </w:r>
+    </w:p>
+    <w:p>
+      <w:pPr>
+        <w:spacing w:line="360" w:lineRule="auto" w:before="0" w:after="0"/>
+        <w:ind w:firstLine="0"/>
+        <w:jc w:val="both"/>
+      </w:pPr>
+      <w:r>
+        <w:rPr>
+          <w:rFonts w:ascii="Times New Roman" w:hAnsi="Times New Roman"/>
+          <w:b w:val="0"/>
+          <w:i w:val="0"/>
+          <w:color w:val="000000"/>
+          <w:sz w:val="28"/>
+        </w:rPr>
+        <w:t>K_зд – коэффициент, учитывающий затемнение окна противостоящим зданием;</w:t>
+      </w:r>
+    </w:p>
+    <w:p>
+      <w:pPr>
+        <w:spacing w:line="360" w:lineRule="auto" w:before="0" w:after="0"/>
+        <w:ind w:firstLine="0"/>
+        <w:jc w:val="both"/>
+      </w:pPr>
+      <w:r>
+        <w:rPr>
+          <w:rFonts w:ascii="Times New Roman" w:hAnsi="Times New Roman"/>
+          <w:b w:val="0"/>
+          <w:i w:val="0"/>
+          <w:color w:val="000000"/>
+          <w:sz w:val="28"/>
+        </w:rPr>
+        <w:t>r0 – общий коэффициент светопропускания оконного проема;</w:t>
+      </w:r>
+    </w:p>
+    <w:p>
+      <w:pPr>
+        <w:spacing w:line="360" w:lineRule="auto" w:before="0" w:after="0"/>
+        <w:ind w:firstLine="0"/>
+        <w:jc w:val="both"/>
+      </w:pPr>
+      <w:r>
+        <w:rPr>
+          <w:rFonts w:ascii="Times New Roman" w:hAnsi="Times New Roman"/>
+          <w:b w:val="0"/>
+          <w:i w:val="0"/>
+          <w:color w:val="000000"/>
+          <w:sz w:val="28"/>
+        </w:rPr>
+        <w:t>r1 – коэффициент, учитывающий влияние отраженного света при боковом освещении;</w:t>
+      </w:r>
+    </w:p>
+    <w:p>
+      <w:pPr>
+        <w:spacing w:line="360" w:lineRule="auto" w:before="0" w:after="0"/>
+        <w:ind w:firstLine="0"/>
+        <w:jc w:val="both"/>
+      </w:pPr>
+      <w:r>
+        <w:rPr>
+          <w:rFonts w:ascii="Times New Roman" w:hAnsi="Times New Roman"/>
+          <w:b w:val="0"/>
+          <w:i w:val="0"/>
+          <w:color w:val="000000"/>
+          <w:sz w:val="28"/>
+        </w:rPr>
+        <w:t>100 – коэффициент перевода процентов в относительные единицы.</w:t>
+      </w:r>
+    </w:p>
+    <w:p>
+      <w:pPr>
+        <w:spacing w:line="360" w:lineRule="auto" w:before="0" w:after="0"/>
+        <w:ind w:firstLine="709"/>
+        <w:jc w:val="both"/>
+      </w:pPr>
+      <w:r>
+        <w:rPr>
+          <w:rFonts w:ascii="Times New Roman" w:hAnsi="Times New Roman"/>
+          <w:b w:val="0"/>
+          <w:i w:val="0"/>
+          <w:color w:val="000000"/>
+          <w:sz w:val="28"/>
+        </w:rPr>
+        <w:t>3.1 Определение расчетного параметра окна h1</w:t>
+      </w:r>
+    </w:p>
+    <w:p>
+      <w:pPr>
+        <w:spacing w:line="360" w:lineRule="auto" w:before="0" w:after="0"/>
+        <w:ind w:firstLine="709"/>
+        <w:jc w:val="both"/>
+      </w:pPr>
+      <w:r>
+        <w:rPr>
+          <w:rFonts w:ascii="Times New Roman" w:hAnsi="Times New Roman"/>
+          <w:b w:val="0"/>
+          <w:i w:val="0"/>
+          <w:color w:val="000000"/>
+          <w:sz w:val="28"/>
+        </w:rPr>
+        <w:t>Под параметром окна h1 понимается возвышение верхнего края окна над горизонтальной рабочей поверхностью:</w:t>
+      </w:r>
+    </w:p>
+    <w:tbl>
+      <w:tblPr>
+        <w:tblW w:type="auto" w:w="0"/>
+        <w:jc w:val="center"/>
+        <w:tblLayout w:type="fixed"/>
+        <w:tblLook w:firstColumn="1" w:firstRow="1" w:lastColumn="0" w:lastRow="0" w:noHBand="0" w:noVBand="1" w:val="04A0"/>
+        <w:tblBorders>
+          <w:top w:val="none"/>
+          <w:bottom w:val="none"/>
+          <w:left w:val="none"/>
+          <w:right w:val="none"/>
+          <w:insideH w:val="none"/>
+          <w:insideV w:val="none"/>
+        </w:tblBorders>
+      </w:tblPr>
+      <w:tblGrid>
+        <w:gridCol w:w="8220"/>
+        <w:gridCol w:w="1134"/>
+      </w:tblGrid>
+      <w:tr>
+        <w:tc>
+          <w:tcPr>
+            <w:tcW w:type="dxa" w:w="4844"/>
+          </w:tcPr>
+          <w:p>
+            <w:pPr>
+              <w:spacing w:line="360" w:lineRule="auto" w:before="80" w:after="80"/>
+              <w:ind w:firstLine="0"/>
+              <w:jc w:val="center"/>
+            </w:pPr>
+            <w:r>
+              <w:rPr>
+                <w:rFonts w:ascii="Times New Roman" w:hAnsi="Times New Roman"/>
+                <w:i/>
+                <w:color w:val="000000"/>
+                <w:sz w:val="28"/>
+              </w:rPr>
+              <w:t>h1 = h0 + h_под - h_раб.</w:t>
+            </w:r>
+          </w:p>
+        </w:tc>
+        <w:tc>
+          <w:tcPr>
+            <w:tcW w:type="dxa" w:w="4844"/>
+          </w:tcPr>
+          <w:p>
+            <w:pPr>
+              <w:spacing w:line="360" w:lineRule="auto" w:before="80" w:after="80"/>
+              <w:ind w:firstLine="0"/>
+              <w:jc w:val="right"/>
+            </w:pPr>
+            <w:r>
+              <w:rPr>
+                <w:rFonts w:ascii="Times New Roman" w:hAnsi="Times New Roman"/>
+                <w:color w:val="000000"/>
+                <w:sz w:val="28"/>
+              </w:rPr>
+              <w:t>(2)</w:t>
+            </w:r>
+          </w:p>
+        </w:tc>
+      </w:tr>
+    </w:tbl>
+    <w:p>
+      <w:pPr>
+        <w:spacing w:line="360" w:lineRule="auto" w:before="0" w:after="0"/>
+        <w:ind w:firstLine="0"/>
+        <w:jc w:val="both"/>
+      </w:pPr>
+      <w:r>
+        <w:rPr>
+          <w:rFonts w:ascii="Times New Roman" w:hAnsi="Times New Roman"/>
+          <w:b w:val="0"/>
+          <w:i w:val="0"/>
+          <w:color w:val="000000"/>
+          <w:sz w:val="28"/>
+        </w:rPr>
+        <w:t>где h0 – высота оконного проема (h0 = 3,5 м);</w:t>
+      </w:r>
+    </w:p>
+    <w:p>
+      <w:pPr>
+        <w:spacing w:line="360" w:lineRule="auto" w:before="0" w:after="0"/>
+        <w:ind w:firstLine="0"/>
+        <w:jc w:val="both"/>
+      </w:pPr>
+      <w:r>
+        <w:rPr>
+          <w:rFonts w:ascii="Times New Roman" w:hAnsi="Times New Roman"/>
+          <w:b w:val="0"/>
+          <w:i w:val="0"/>
+          <w:color w:val="000000"/>
+          <w:sz w:val="28"/>
+        </w:rPr>
+        <w:t>h_под – расстояние от пола до подоконника (h_под = 1,2 м);</w:t>
+      </w:r>
+    </w:p>
+    <w:p>
+      <w:pPr>
+        <w:spacing w:line="360" w:lineRule="auto" w:before="0" w:after="0"/>
+        <w:ind w:firstLine="0"/>
+        <w:jc w:val="both"/>
+      </w:pPr>
+      <w:r>
+        <w:rPr>
+          <w:rFonts w:ascii="Times New Roman" w:hAnsi="Times New Roman"/>
+          <w:b w:val="0"/>
+          <w:i w:val="0"/>
+          <w:color w:val="000000"/>
+          <w:sz w:val="28"/>
+        </w:rPr>
+        <w:t>h_раб – высота рабочей поверхности над полом (h_раб = 1,2 м).</w:t>
+      </w:r>
+    </w:p>
+    <w:p>
+      <w:pPr>
+        <w:spacing w:line="360" w:lineRule="auto" w:before="0" w:after="0"/>
+        <w:ind w:firstLine="709"/>
+        <w:jc w:val="both"/>
+      </w:pPr>
+      <w:r>
+        <w:rPr>
+          <w:rFonts w:ascii="Times New Roman" w:hAnsi="Times New Roman"/>
+          <w:b w:val="0"/>
+          <w:i w:val="0"/>
+          <w:color w:val="000000"/>
+          <w:sz w:val="28"/>
+        </w:rPr>
+        <w:t>Подставляя числовые значения, получаем:</w:t>
+      </w:r>
+    </w:p>
+    <w:tbl>
+      <w:tblPr>
+        <w:tblW w:type="auto" w:w="0"/>
+        <w:jc w:val="center"/>
+        <w:tblLayout w:type="fixed"/>
+        <w:tblLook w:firstColumn="1" w:firstRow="1" w:lastColumn="0" w:lastRow="0" w:noHBand="0" w:noVBand="1" w:val="04A0"/>
+        <w:tblBorders>
+          <w:top w:val="none"/>
+          <w:bottom w:val="none"/>
+          <w:left w:val="none"/>
+          <w:right w:val="none"/>
+          <w:insideH w:val="none"/>
+          <w:insideV w:val="none"/>
+        </w:tblBorders>
+      </w:tblPr>
+      <w:tblGrid>
+        <w:gridCol w:w="8220"/>
+        <w:gridCol w:w="1134"/>
+      </w:tblGrid>
+      <w:tr>
+        <w:tc>
+          <w:tcPr>
+            <w:tcW w:type="dxa" w:w="4844"/>
+          </w:tcPr>
+          <w:p>
+            <w:pPr>
+              <w:spacing w:line="360" w:lineRule="auto" w:before="80" w:after="80"/>
+              <w:ind w:firstLine="0"/>
+              <w:jc w:val="center"/>
+            </w:pPr>
+            <w:r>
+              <w:rPr>
+                <w:rFonts w:ascii="Times New Roman" w:hAnsi="Times New Roman"/>
+                <w:i/>
+                <w:color w:val="000000"/>
+                <w:sz w:val="28"/>
+              </w:rPr>
+              <w:t>h1 = 3,5 + 1,2 - 1,2 = 3,50 м.</w:t>
+            </w:r>
+          </w:p>
+        </w:tc>
+        <w:tc>
+          <w:tcPr>
+            <w:tcW w:type="dxa" w:w="4844"/>
+          </w:tcPr>
+          <w:p>
+            <w:pPr>
+              <w:spacing w:line="360" w:lineRule="auto" w:before="80" w:after="80"/>
+              <w:ind w:firstLine="0"/>
+              <w:jc w:val="right"/>
+            </w:pPr>
+          </w:p>
+        </w:tc>
+      </w:tr>
+    </w:tbl>
+    <w:p>
+      <w:pPr>
+        <w:spacing w:line="360" w:lineRule="auto" w:before="0" w:after="0"/>
+        <w:ind w:firstLine="709"/>
+        <w:jc w:val="both"/>
+      </w:pPr>
+      <w:r>
+        <w:rPr>
+          <w:rFonts w:ascii="Times New Roman" w:hAnsi="Times New Roman"/>
+          <w:b w:val="0"/>
+          <w:i w:val="0"/>
+          <w:color w:val="000000"/>
+          <w:sz w:val="28"/>
+        </w:rPr>
+        <w:t>3.2 Вычисление геометрических соотношений помещения</w:t>
+      </w:r>
+    </w:p>
+    <w:p>
+      <w:pPr>
+        <w:spacing w:line="360" w:lineRule="auto" w:before="0" w:after="0"/>
+        <w:ind w:firstLine="709"/>
+        <w:jc w:val="both"/>
+      </w:pPr>
+      <w:r>
+        <w:rPr>
+          <w:rFonts w:ascii="Times New Roman" w:hAnsi="Times New Roman"/>
+          <w:b w:val="0"/>
+          <w:i w:val="0"/>
+          <w:color w:val="000000"/>
+          <w:sz w:val="28"/>
+        </w:rPr>
+        <w:t>Для нахождения табличных коэффициентов определяются следующие размерные пропорции:</w:t>
+      </w:r>
+    </w:p>
+    <w:p>
+      <w:pPr>
+        <w:spacing w:line="360" w:lineRule="auto" w:before="0" w:after="0"/>
+        <w:ind w:firstLine="709"/>
+        <w:jc w:val="both"/>
+      </w:pPr>
+      <w:r>
+        <w:rPr>
+          <w:rFonts w:ascii="Times New Roman" w:hAnsi="Times New Roman"/>
+          <w:b w:val="0"/>
+          <w:i w:val="0"/>
+          <w:color w:val="000000"/>
+          <w:sz w:val="28"/>
+        </w:rPr>
+        <w:t>• Отношение длины помещения к его ширине:</w:t>
+      </w:r>
+    </w:p>
+    <w:tbl>
+      <w:tblPr>
+        <w:tblW w:type="auto" w:w="0"/>
+        <w:jc w:val="center"/>
+        <w:tblLayout w:type="fixed"/>
+        <w:tblLook w:firstColumn="1" w:firstRow="1" w:lastColumn="0" w:lastRow="0" w:noHBand="0" w:noVBand="1" w:val="04A0"/>
+        <w:tblBorders>
+          <w:top w:val="none"/>
+          <w:bottom w:val="none"/>
+          <w:left w:val="none"/>
+          <w:right w:val="none"/>
+          <w:insideH w:val="none"/>
+          <w:insideV w:val="none"/>
+        </w:tblBorders>
+      </w:tblPr>
+      <w:tblGrid>
+        <w:gridCol w:w="8220"/>
+        <w:gridCol w:w="1134"/>
+      </w:tblGrid>
+      <w:tr>
+        <w:tc>
+          <w:tcPr>
+            <w:tcW w:type="dxa" w:w="4844"/>
+          </w:tcPr>
+          <w:p>
+            <w:pPr>
+              <w:spacing w:line="360" w:lineRule="auto" w:before="80" w:after="80"/>
+              <w:ind w:firstLine="0"/>
+              <w:jc w:val="center"/>
+            </w:pPr>
+            <w:r>
+              <w:rPr>
+                <w:rFonts w:ascii="Times New Roman" w:hAnsi="Times New Roman"/>
+                <w:i/>
+                <w:color w:val="000000"/>
+                <w:sz w:val="28"/>
+              </w:rPr>
+              <w:t>A / B = 20,0 / 10,0 = 2,00.</w:t>
+            </w:r>
+          </w:p>
+        </w:tc>
+        <w:tc>
+          <w:tcPr>
+            <w:tcW w:type="dxa" w:w="4844"/>
+          </w:tcPr>
+          <w:p>
+            <w:pPr>
+              <w:spacing w:line="360" w:lineRule="auto" w:before="80" w:after="80"/>
+              <w:ind w:firstLine="0"/>
+              <w:jc w:val="right"/>
+            </w:pPr>
+          </w:p>
+        </w:tc>
+      </w:tr>
+    </w:tbl>
+    <w:p>
+      <w:pPr>
+        <w:spacing w:line="360" w:lineRule="auto" w:before="0" w:after="0"/>
+        <w:ind w:firstLine="709"/>
+        <w:jc w:val="both"/>
+      </w:pPr>
+      <w:r>
+        <w:rPr>
+          <w:rFonts w:ascii="Times New Roman" w:hAnsi="Times New Roman"/>
+          <w:b w:val="0"/>
+          <w:i w:val="0"/>
+          <w:color w:val="000000"/>
+          <w:sz w:val="28"/>
+        </w:rPr>
+        <w:t>• Отношение ширины помещения к расчетному параметру окна h1:</w:t>
+      </w:r>
+    </w:p>
+    <w:tbl>
+      <w:tblPr>
+        <w:tblW w:type="auto" w:w="0"/>
+        <w:jc w:val="center"/>
+        <w:tblLayout w:type="fixed"/>
+        <w:tblLook w:firstColumn="1" w:firstRow="1" w:lastColumn="0" w:lastRow="0" w:noHBand="0" w:noVBand="1" w:val="04A0"/>
+        <w:tblBorders>
+          <w:top w:val="none"/>
+          <w:bottom w:val="none"/>
+          <w:left w:val="none"/>
+          <w:right w:val="none"/>
+          <w:insideH w:val="none"/>
+          <w:insideV w:val="none"/>
+        </w:tblBorders>
+      </w:tblPr>
+      <w:tblGrid>
+        <w:gridCol w:w="8220"/>
+        <w:gridCol w:w="1134"/>
+      </w:tblGrid>
+      <w:tr>
+        <w:tc>
+          <w:tcPr>
+            <w:tcW w:type="dxa" w:w="4844"/>
+          </w:tcPr>
+          <w:p>
+            <w:pPr>
+              <w:spacing w:line="360" w:lineRule="auto" w:before="80" w:after="80"/>
+              <w:ind w:firstLine="0"/>
+              <w:jc w:val="center"/>
+            </w:pPr>
+            <w:r>
+              <w:rPr>
+                <w:rFonts w:ascii="Times New Roman" w:hAnsi="Times New Roman"/>
+                <w:i/>
+                <w:color w:val="000000"/>
+                <w:sz w:val="28"/>
+              </w:rPr>
+              <w:t>B / h1 = 10,0 / 3,50 = 2,857 ≈ 2,86.</w:t>
+            </w:r>
+          </w:p>
+        </w:tc>
+        <w:tc>
+          <w:tcPr>
+            <w:tcW w:type="dxa" w:w="4844"/>
+          </w:tcPr>
+          <w:p>
+            <w:pPr>
+              <w:spacing w:line="360" w:lineRule="auto" w:before="80" w:after="80"/>
+              <w:ind w:firstLine="0"/>
+              <w:jc w:val="right"/>
+            </w:pPr>
+          </w:p>
+        </w:tc>
+      </w:tr>
+    </w:tbl>
+    <w:p>
+      <w:pPr>
+        <w:spacing w:line="360" w:lineRule="auto" w:before="0" w:after="0"/>
+        <w:ind w:firstLine="709"/>
+        <w:jc w:val="both"/>
+      </w:pPr>
+      <w:r>
+        <w:rPr>
+          <w:rFonts w:ascii="Times New Roman" w:hAnsi="Times New Roman"/>
+          <w:b w:val="0"/>
+          <w:i w:val="0"/>
+          <w:color w:val="000000"/>
+          <w:sz w:val="28"/>
+        </w:rPr>
+        <w:t>• Отношение расстояния между зданиями к высоте карниза противостоящего здания над подоконником:</w:t>
+      </w:r>
+    </w:p>
+    <w:tbl>
+      <w:tblPr>
+        <w:tblW w:type="auto" w:w="0"/>
+        <w:jc w:val="center"/>
+        <w:tblLayout w:type="fixed"/>
+        <w:tblLook w:firstColumn="1" w:firstRow="1" w:lastColumn="0" w:lastRow="0" w:noHBand="0" w:noVBand="1" w:val="04A0"/>
+        <w:tblBorders>
+          <w:top w:val="none"/>
+          <w:bottom w:val="none"/>
+          <w:left w:val="none"/>
+          <w:right w:val="none"/>
+          <w:insideH w:val="none"/>
+          <w:insideV w:val="none"/>
+        </w:tblBorders>
+      </w:tblPr>
+      <w:tblGrid>
+        <w:gridCol w:w="8220"/>
+        <w:gridCol w:w="1134"/>
+      </w:tblGrid>
+      <w:tr>
+        <w:tc>
+          <w:tcPr>
+            <w:tcW w:type="dxa" w:w="4844"/>
+          </w:tcPr>
+          <w:p>
+            <w:pPr>
+              <w:spacing w:line="360" w:lineRule="auto" w:before="80" w:after="80"/>
+              <w:ind w:firstLine="0"/>
+              <w:jc w:val="center"/>
+            </w:pPr>
+            <w:r>
+              <w:rPr>
+                <w:rFonts w:ascii="Times New Roman" w:hAnsi="Times New Roman"/>
+                <w:i/>
+                <w:color w:val="000000"/>
+                <w:sz w:val="28"/>
+              </w:rPr>
+              <w:t>L / H = 30,0 / 30,0 = 1,00.</w:t>
+            </w:r>
+          </w:p>
+        </w:tc>
+        <w:tc>
+          <w:tcPr>
+            <w:tcW w:type="dxa" w:w="4844"/>
+          </w:tcPr>
+          <w:p>
+            <w:pPr>
+              <w:spacing w:line="360" w:lineRule="auto" w:before="80" w:after="80"/>
+              <w:ind w:firstLine="0"/>
+              <w:jc w:val="right"/>
+            </w:pPr>
+          </w:p>
+        </w:tc>
+      </w:tr>
+    </w:tbl>
+    <w:p>
+      <w:pPr>
+        <w:spacing w:line="360" w:lineRule="auto" w:before="0" w:after="0"/>
+        <w:ind w:firstLine="709"/>
+        <w:jc w:val="both"/>
+      </w:pPr>
+      <w:r>
+        <w:rPr>
+          <w:rFonts w:ascii="Times New Roman" w:hAnsi="Times New Roman"/>
+          <w:b w:val="0"/>
+          <w:i w:val="0"/>
+          <w:color w:val="000000"/>
+          <w:sz w:val="28"/>
+        </w:rPr>
+        <w:t>3.3 Определение нормативных коэффициентов</w:t>
+      </w:r>
+    </w:p>
+    <w:p>
+      <w:pPr>
+        <w:spacing w:line="360" w:lineRule="auto" w:before="0" w:after="0"/>
+        <w:ind w:firstLine="709"/>
+        <w:jc w:val="both"/>
+      </w:pPr>
+      <w:r>
+        <w:rPr>
+          <w:rFonts w:ascii="Times New Roman" w:hAnsi="Times New Roman"/>
+          <w:b w:val="0"/>
+          <w:i w:val="0"/>
+          <w:color w:val="000000"/>
+          <w:sz w:val="28"/>
+        </w:rPr>
+        <w:t>1) Нормированный коэффициент естественной освещенности l_min.</w:t>
+      </w:r>
+    </w:p>
+    <w:p>
+      <w:pPr>
+        <w:spacing w:line="360" w:lineRule="auto" w:before="0" w:after="0"/>
+        <w:ind w:firstLine="709"/>
+        <w:jc w:val="both"/>
+      </w:pPr>
+      <w:r>
+        <w:rPr>
+          <w:rFonts w:ascii="Times New Roman" w:hAnsi="Times New Roman"/>
+          <w:b w:val="0"/>
+          <w:i w:val="0"/>
+          <w:color w:val="000000"/>
+          <w:sz w:val="28"/>
+        </w:rPr>
+        <w:t>По Таблице 4.1 учебно-методического пособия для III разряда зрительной работы (работа высокой точности с размером объекта различения 0,3–0,5 мм) при боковом освещении принимается l_min = 2,0 %.</w:t>
+      </w:r>
+    </w:p>
+    <w:p>
+      <w:pPr>
+        <w:spacing w:line="360" w:lineRule="auto" w:before="0" w:after="0"/>
+        <w:ind w:firstLine="709"/>
+        <w:jc w:val="both"/>
+      </w:pPr>
+      <w:r>
+        <w:rPr>
+          <w:rFonts w:ascii="Times New Roman" w:hAnsi="Times New Roman"/>
+          <w:b w:val="0"/>
+          <w:i w:val="0"/>
+          <w:color w:val="000000"/>
+          <w:sz w:val="28"/>
+        </w:rPr>
+        <w:t>2) Коэффициент затенения противостоящим зданием K_зд.</w:t>
+      </w:r>
+    </w:p>
+    <w:p>
+      <w:pPr>
+        <w:spacing w:line="360" w:lineRule="auto" w:before="0" w:after="0"/>
+        <w:ind w:firstLine="709"/>
+        <w:jc w:val="both"/>
+      </w:pPr>
+      <w:r>
+        <w:rPr>
+          <w:rFonts w:ascii="Times New Roman" w:hAnsi="Times New Roman"/>
+          <w:b w:val="0"/>
+          <w:i w:val="0"/>
+          <w:color w:val="000000"/>
+          <w:sz w:val="28"/>
+        </w:rPr>
+        <w:t>По Таблице 4.3 при найденном отношении L / H = 1,00 коэффициент затемнения равен K_зд = 1,40.</w:t>
+      </w:r>
+    </w:p>
+    <w:p>
+      <w:pPr>
+        <w:spacing w:line="360" w:lineRule="auto" w:before="0" w:after="0"/>
+        <w:ind w:firstLine="709"/>
+        <w:jc w:val="both"/>
+      </w:pPr>
+      <w:r>
+        <w:rPr>
+          <w:rFonts w:ascii="Times New Roman" w:hAnsi="Times New Roman"/>
+          <w:b w:val="0"/>
+          <w:i w:val="0"/>
+          <w:color w:val="000000"/>
+          <w:sz w:val="28"/>
+        </w:rPr>
+        <w:t>3) Световая характеристика оконного проема η0.</w:t>
+      </w:r>
+    </w:p>
+    <w:p>
+      <w:pPr>
+        <w:spacing w:line="360" w:lineRule="auto" w:before="0" w:after="0"/>
+        <w:ind w:firstLine="709"/>
+        <w:jc w:val="both"/>
+      </w:pPr>
+      <w:r>
+        <w:rPr>
+          <w:rFonts w:ascii="Times New Roman" w:hAnsi="Times New Roman"/>
+          <w:b w:val="0"/>
+          <w:i w:val="0"/>
+          <w:color w:val="000000"/>
+          <w:sz w:val="28"/>
+        </w:rPr>
+        <w:t>По Таблице 4.2 при отношении A / B = 2,0 и B / h1 = 2,857 значение световой характеристики определяется путем линейной интерполяции между табличными узлами B / h1 = 2,5 (η0 = 13,0) и B / h1 = 3,0 (η0 = 18,0):</w:t>
+      </w:r>
+    </w:p>
+    <w:tbl>
+      <w:tblPr>
+        <w:tblW w:type="auto" w:w="0"/>
+        <w:jc w:val="center"/>
+        <w:tblLayout w:type="fixed"/>
+        <w:tblLook w:firstColumn="1" w:firstRow="1" w:lastColumn="0" w:lastRow="0" w:noHBand="0" w:noVBand="1" w:val="04A0"/>
+        <w:tblBorders>
+          <w:top w:val="none"/>
+          <w:bottom w:val="none"/>
+          <w:left w:val="none"/>
+          <w:right w:val="none"/>
+          <w:insideH w:val="none"/>
+          <w:insideV w:val="none"/>
+        </w:tblBorders>
+      </w:tblPr>
+      <w:tblGrid>
+        <w:gridCol w:w="8220"/>
+        <w:gridCol w:w="1134"/>
+      </w:tblGrid>
+      <w:tr>
+        <w:tc>
+          <w:tcPr>
+            <w:tcW w:type="dxa" w:w="4844"/>
+          </w:tcPr>
+          <w:p>
+            <w:pPr>
+              <w:spacing w:line="360" w:lineRule="auto" w:before="80" w:after="80"/>
+              <w:ind w:firstLine="0"/>
+              <w:jc w:val="center"/>
+            </w:pPr>
+            <w:r>
+              <w:rPr>
+                <w:rFonts w:ascii="Times New Roman" w:hAnsi="Times New Roman"/>
+                <w:i/>
+                <w:color w:val="000000"/>
+                <w:sz w:val="28"/>
+              </w:rPr>
+              <w:t>η0 = 13,0 + (18,0 - 13,0) · (2,857 - 2,50) / (3,00 - 2,50) = 13,0 + 5,0 · 0,714 = 16,57.</w:t>
+            </w:r>
+          </w:p>
+        </w:tc>
+        <w:tc>
+          <w:tcPr>
+            <w:tcW w:type="dxa" w:w="4844"/>
+          </w:tcPr>
+          <w:p>
+            <w:pPr>
+              <w:spacing w:line="360" w:lineRule="auto" w:before="80" w:after="80"/>
+              <w:ind w:firstLine="0"/>
+              <w:jc w:val="right"/>
+            </w:pPr>
+          </w:p>
+        </w:tc>
+      </w:tr>
+    </w:tbl>
+    <w:p>
+      <w:pPr>
+        <w:spacing w:line="360" w:lineRule="auto" w:before="0" w:after="0"/>
+        <w:ind w:firstLine="709"/>
+        <w:jc w:val="both"/>
+      </w:pPr>
+      <w:r>
+        <w:rPr>
+          <w:rFonts w:ascii="Times New Roman" w:hAnsi="Times New Roman"/>
+          <w:b w:val="0"/>
+          <w:i w:val="0"/>
+          <w:color w:val="000000"/>
+          <w:sz w:val="28"/>
+        </w:rPr>
+        <w:t>4) Общий коэффициент светопропускания r0.</w:t>
+      </w:r>
+    </w:p>
+    <w:p>
+      <w:pPr>
+        <w:spacing w:line="360" w:lineRule="auto" w:before="0" w:after="0"/>
+        <w:ind w:firstLine="709"/>
+        <w:jc w:val="both"/>
+      </w:pPr>
+      <w:r>
+        <w:rPr>
+          <w:rFonts w:ascii="Times New Roman" w:hAnsi="Times New Roman"/>
+          <w:b w:val="0"/>
+          <w:i w:val="0"/>
+          <w:color w:val="000000"/>
+          <w:sz w:val="28"/>
+        </w:rPr>
+        <w:t>По Таблице 4.5 для производственных помещений группы Б (машинные и аппаратные залы предприятий связи) при вертикальном расположении остекления в двойных стальных переплетах общий коэффициент светопропускания составляет r0 = 0,40.</w:t>
+      </w:r>
+    </w:p>
+    <w:p>
+      <w:pPr>
+        <w:spacing w:line="360" w:lineRule="auto" w:before="0" w:after="0"/>
+        <w:ind w:firstLine="709"/>
+        <w:jc w:val="both"/>
+      </w:pPr>
+      <w:r>
+        <w:rPr>
+          <w:rFonts w:ascii="Times New Roman" w:hAnsi="Times New Roman"/>
+          <w:b w:val="0"/>
+          <w:i w:val="0"/>
+          <w:color w:val="000000"/>
+          <w:sz w:val="28"/>
+        </w:rPr>
+        <w:t>3.4 Определение средневзвешенного коэффициента отражения внутренних поверхностей</w:t>
+      </w:r>
+    </w:p>
+    <w:p>
+      <w:pPr>
+        <w:spacing w:line="360" w:lineRule="auto" w:before="0" w:after="0"/>
+        <w:ind w:firstLine="709"/>
+        <w:jc w:val="both"/>
+      </w:pPr>
+      <w:r>
+        <w:rPr>
+          <w:rFonts w:ascii="Times New Roman" w:hAnsi="Times New Roman"/>
+          <w:b w:val="0"/>
+          <w:i w:val="0"/>
+          <w:color w:val="000000"/>
+          <w:sz w:val="28"/>
+        </w:rPr>
+        <w:t>Площади ограждающих конструкций аппаратного зала составляют:</w:t>
+      </w:r>
+    </w:p>
+    <w:p>
+      <w:pPr>
+        <w:spacing w:line="360" w:lineRule="auto" w:before="0" w:after="0"/>
+        <w:ind w:firstLine="709"/>
+        <w:jc w:val="both"/>
+      </w:pPr>
+      <w:r>
+        <w:rPr>
+          <w:rFonts w:ascii="Times New Roman" w:hAnsi="Times New Roman"/>
+          <w:b w:val="0"/>
+          <w:i w:val="0"/>
+          <w:color w:val="000000"/>
+          <w:sz w:val="28"/>
+        </w:rPr>
+        <w:t>• Площадь пола: S_пол = A · B = 20,0 · 10,0 = 200,0 м²;</w:t>
+      </w:r>
+    </w:p>
+    <w:p>
+      <w:pPr>
+        <w:spacing w:line="360" w:lineRule="auto" w:before="0" w:after="0"/>
+        <w:ind w:firstLine="709"/>
+        <w:jc w:val="both"/>
+      </w:pPr>
+      <w:r>
+        <w:rPr>
+          <w:rFonts w:ascii="Times New Roman" w:hAnsi="Times New Roman"/>
+          <w:b w:val="0"/>
+          <w:i w:val="0"/>
+          <w:color w:val="000000"/>
+          <w:sz w:val="28"/>
+        </w:rPr>
+        <w:t>• Площадь потолка: S_п = A · B = 20,0 · 10,0 = 200,0 м²;</w:t>
+      </w:r>
+    </w:p>
+    <w:p>
+      <w:pPr>
+        <w:spacing w:line="360" w:lineRule="auto" w:before="0" w:after="0"/>
+        <w:ind w:firstLine="709"/>
+        <w:jc w:val="both"/>
+      </w:pPr>
+      <w:r>
+        <w:rPr>
+          <w:rFonts w:ascii="Times New Roman" w:hAnsi="Times New Roman"/>
+          <w:b w:val="0"/>
+          <w:i w:val="0"/>
+          <w:color w:val="000000"/>
+          <w:sz w:val="28"/>
+        </w:rPr>
+        <w:t>• Площадь стен: S_ст = 2 · (A + B) · h = 2 · (20,0 + 10,0) · 5,0 = 300,0 м²;</w:t>
+      </w:r>
+    </w:p>
+    <w:p>
+      <w:pPr>
+        <w:spacing w:line="360" w:lineRule="auto" w:before="0" w:after="0"/>
+        <w:ind w:firstLine="709"/>
+        <w:jc w:val="both"/>
+      </w:pPr>
+      <w:r>
+        <w:rPr>
+          <w:rFonts w:ascii="Times New Roman" w:hAnsi="Times New Roman"/>
+          <w:b w:val="0"/>
+          <w:i w:val="0"/>
+          <w:color w:val="000000"/>
+          <w:sz w:val="28"/>
+        </w:rPr>
+        <w:t>• Полная площадь внутренних поверхностей: S_общ = 200,0 + 200,0 + 300,0 = 700,0 м².</w:t>
+      </w:r>
+    </w:p>
+    <w:p>
+      <w:pPr>
+        <w:spacing w:line="360" w:lineRule="auto" w:before="0" w:after="0"/>
+        <w:ind w:firstLine="709"/>
+        <w:jc w:val="both"/>
+      </w:pPr>
+      <w:r>
+        <w:rPr>
+          <w:rFonts w:ascii="Times New Roman" w:hAnsi="Times New Roman"/>
+          <w:b w:val="0"/>
+          <w:i w:val="0"/>
+          <w:color w:val="000000"/>
+          <w:sz w:val="28"/>
+        </w:rPr>
+        <w:t>Средневзвешенный коэффициент отражения определяется по формуле:</w:t>
+      </w:r>
+    </w:p>
+    <w:tbl>
+      <w:tblPr>
+        <w:tblW w:type="auto" w:w="0"/>
+        <w:jc w:val="center"/>
+        <w:tblLayout w:type="fixed"/>
+        <w:tblLook w:firstColumn="1" w:firstRow="1" w:lastColumn="0" w:lastRow="0" w:noHBand="0" w:noVBand="1" w:val="04A0"/>
+        <w:tblBorders>
+          <w:top w:val="none"/>
+          <w:bottom w:val="none"/>
+          <w:left w:val="none"/>
+          <w:right w:val="none"/>
+          <w:insideH w:val="none"/>
+          <w:insideV w:val="none"/>
+        </w:tblBorders>
+      </w:tblPr>
+      <w:tblGrid>
+        <w:gridCol w:w="8220"/>
+        <w:gridCol w:w="1134"/>
+      </w:tblGrid>
+      <w:tr>
+        <w:tc>
+          <w:tcPr>
+            <w:tcW w:type="dxa" w:w="4844"/>
+          </w:tcPr>
+          <w:p>
+            <w:pPr>
+              <w:spacing w:line="360" w:lineRule="auto" w:before="80" w:after="80"/>
+              <w:ind w:firstLine="0"/>
+              <w:jc w:val="center"/>
+            </w:pPr>
+            <w:r>
+              <w:rPr>
+                <w:rFonts w:ascii="Times New Roman" w:hAnsi="Times New Roman"/>
+                <w:i/>
+                <w:color w:val="000000"/>
+                <w:sz w:val="28"/>
+              </w:rPr>
+              <w:t>ρ_ср = (ρ_п · S_п + ρ_ст · S_ст + ρ_пол · S_пол) / S_общ,</w:t>
+            </w:r>
+          </w:p>
+        </w:tc>
+        <w:tc>
+          <w:tcPr>
+            <w:tcW w:type="dxa" w:w="4844"/>
+          </w:tcPr>
+          <w:p>
+            <w:pPr>
+              <w:spacing w:line="360" w:lineRule="auto" w:before="80" w:after="80"/>
+              <w:ind w:firstLine="0"/>
+              <w:jc w:val="right"/>
+            </w:pPr>
+            <w:r>
+              <w:rPr>
+                <w:rFonts w:ascii="Times New Roman" w:hAnsi="Times New Roman"/>
+                <w:color w:val="000000"/>
+                <w:sz w:val="28"/>
+              </w:rPr>
+              <w:t>(3)</w:t>
+            </w:r>
+          </w:p>
+        </w:tc>
+      </w:tr>
+    </w:tbl>
+    <w:tbl>
+      <w:tblPr>
+        <w:tblW w:type="auto" w:w="0"/>
+        <w:jc w:val="center"/>
+        <w:tblLayout w:type="fixed"/>
+        <w:tblLook w:firstColumn="1" w:firstRow="1" w:lastColumn="0" w:lastRow="0" w:noHBand="0" w:noVBand="1" w:val="04A0"/>
+        <w:tblBorders>
+          <w:top w:val="none"/>
+          <w:bottom w:val="none"/>
+          <w:left w:val="none"/>
+          <w:right w:val="none"/>
+          <w:insideH w:val="none"/>
+          <w:insideV w:val="none"/>
+        </w:tblBorders>
+      </w:tblPr>
+      <w:tblGrid>
+        <w:gridCol w:w="8220"/>
+        <w:gridCol w:w="1134"/>
+      </w:tblGrid>
+      <w:tr>
+        <w:tc>
+          <w:tcPr>
+            <w:tcW w:type="dxa" w:w="4844"/>
+          </w:tcPr>
+          <w:p>
+            <w:pPr>
+              <w:spacing w:line="360" w:lineRule="auto" w:before="80" w:after="80"/>
+              <w:ind w:firstLine="0"/>
+              <w:jc w:val="center"/>
+            </w:pPr>
+            <w:r>
+              <w:rPr>
+                <w:rFonts w:ascii="Times New Roman" w:hAnsi="Times New Roman"/>
+                <w:i/>
+                <w:color w:val="000000"/>
+                <w:sz w:val="28"/>
+              </w:rPr>
+              <w:t>ρ_ср = (0,50 · 200,0 + 0,50 · 300,0 + 0,10 · 200,0) / 700,0 = (100,0 + 150,0 + 20,0) / 700,0 = 270,0 / 700,0 = 0,3857 (38,6 %).</w:t>
+            </w:r>
+          </w:p>
+        </w:tc>
+        <w:tc>
+          <w:tcPr>
+            <w:tcW w:type="dxa" w:w="4844"/>
+          </w:tcPr>
+          <w:p>
+            <w:pPr>
+              <w:spacing w:line="360" w:lineRule="auto" w:before="80" w:after="80"/>
+              <w:ind w:firstLine="0"/>
+              <w:jc w:val="right"/>
+            </w:pPr>
+          </w:p>
+        </w:tc>
+      </w:tr>
+    </w:tbl>
+    <w:p>
+      <w:pPr>
+        <w:spacing w:line="360" w:lineRule="auto" w:before="0" w:after="0"/>
+        <w:ind w:firstLine="709"/>
+        <w:jc w:val="both"/>
+      </w:pPr>
+      <w:r>
+        <w:rPr>
+          <w:rFonts w:ascii="Times New Roman" w:hAnsi="Times New Roman"/>
+          <w:b w:val="0"/>
+          <w:i w:val="0"/>
+          <w:color w:val="000000"/>
+          <w:sz w:val="28"/>
+        </w:rPr>
+        <w:t>По Таблице 4.6 определяем коэффициент r1, учитывающий отраженный свет:</w:t>
+      </w:r>
+    </w:p>
+    <w:p>
+      <w:pPr>
+        <w:spacing w:line="360" w:lineRule="auto" w:before="0" w:after="0"/>
+        <w:ind w:firstLine="709"/>
+        <w:jc w:val="both"/>
+      </w:pPr>
+      <w:r>
+        <w:rPr>
+          <w:rFonts w:ascii="Times New Roman" w:hAnsi="Times New Roman"/>
+          <w:b w:val="0"/>
+          <w:i w:val="0"/>
+          <w:color w:val="000000"/>
+          <w:sz w:val="28"/>
+        </w:rPr>
+        <w:t>• При одностороннем боковом освещении интерполяция между узлами ρ_ср = 0,30 (r1 = 2,0) и ρ_ср = 0,40 (r1 = 3,0) дает r1 = 2,86;</w:t>
+      </w:r>
+    </w:p>
+    <w:p>
+      <w:pPr>
+        <w:spacing w:line="360" w:lineRule="auto" w:before="0" w:after="0"/>
+        <w:ind w:firstLine="709"/>
+        <w:jc w:val="both"/>
+      </w:pPr>
+      <w:r>
+        <w:rPr>
+          <w:rFonts w:ascii="Times New Roman" w:hAnsi="Times New Roman"/>
+          <w:b w:val="0"/>
+          <w:i w:val="0"/>
+          <w:color w:val="000000"/>
+          <w:sz w:val="28"/>
+        </w:rPr>
+        <w:t>• При двустороннем боковом освещении интерполяция между узлами ρ_ср = 0,30 (r1 = 1,2) и ρ_ср = 0,40 (r1 = 1,7) дает r1 = 1,70.</w:t>
+      </w:r>
+    </w:p>
+    <w:p>
+      <w:pPr>
+        <w:spacing w:line="360" w:lineRule="auto" w:before="0" w:after="0"/>
+        <w:ind w:firstLine="709"/>
+        <w:jc w:val="both"/>
+      </w:pPr>
+      <w:r>
+        <w:rPr>
+          <w:rFonts w:ascii="Times New Roman" w:hAnsi="Times New Roman"/>
+          <w:b w:val="0"/>
+          <w:i w:val="0"/>
+          <w:color w:val="000000"/>
+          <w:sz w:val="28"/>
+        </w:rPr>
+        <w:t>3.5 Расчет площади оконных проемов и количества окон для одностороннего освещения</w:t>
+      </w:r>
+    </w:p>
+    <w:p>
+      <w:pPr>
+        <w:spacing w:line="360" w:lineRule="auto" w:before="0" w:after="0"/>
+        <w:ind w:firstLine="709"/>
+        <w:jc w:val="both"/>
+      </w:pPr>
+      <w:r>
+        <w:rPr>
+          <w:rFonts w:ascii="Times New Roman" w:hAnsi="Times New Roman"/>
+          <w:b w:val="0"/>
+          <w:i w:val="0"/>
+          <w:color w:val="000000"/>
+          <w:sz w:val="28"/>
+        </w:rPr>
+        <w:t>Подставляя полученные коэффициенты в основную расчетную формулу (1), находим требуемую суммарную площадь световых проемов:</w:t>
+      </w:r>
+    </w:p>
+    <w:tbl>
+      <w:tblPr>
+        <w:tblW w:type="auto" w:w="0"/>
+        <w:jc w:val="center"/>
+        <w:tblLayout w:type="fixed"/>
+        <w:tblLook w:firstColumn="1" w:firstRow="1" w:lastColumn="0" w:lastRow="0" w:noHBand="0" w:noVBand="1" w:val="04A0"/>
+        <w:tblBorders>
+          <w:top w:val="none"/>
+          <w:bottom w:val="none"/>
+          <w:left w:val="none"/>
+          <w:right w:val="none"/>
+          <w:insideH w:val="none"/>
+          <w:insideV w:val="none"/>
+        </w:tblBorders>
+      </w:tblPr>
+      <w:tblGrid>
+        <w:gridCol w:w="8220"/>
+        <w:gridCol w:w="1134"/>
+      </w:tblGrid>
+      <w:tr>
+        <w:tc>
+          <w:tcPr>
+            <w:tcW w:type="dxa" w:w="4844"/>
+          </w:tcPr>
+          <w:p>
+            <w:pPr>
+              <w:spacing w:line="360" w:lineRule="auto" w:before="80" w:after="80"/>
+              <w:ind w:firstLine="0"/>
+              <w:jc w:val="center"/>
+            </w:pPr>
+            <w:r>
+              <w:rPr>
+                <w:rFonts w:ascii="Times New Roman" w:hAnsi="Times New Roman"/>
+                <w:i/>
+                <w:color w:val="000000"/>
+                <w:sz w:val="28"/>
+              </w:rPr>
+              <w:t>S0 = (200,0 · 2,0 · 16,57 · 1,40) / (100 · 0,40 · 2,86) = 9279,2 / 114,4 = 81,11 м².</w:t>
+            </w:r>
+          </w:p>
+        </w:tc>
+        <w:tc>
+          <w:tcPr>
+            <w:tcW w:type="dxa" w:w="4844"/>
+          </w:tcPr>
+          <w:p>
+            <w:pPr>
+              <w:spacing w:line="360" w:lineRule="auto" w:before="80" w:after="80"/>
+              <w:ind w:firstLine="0"/>
+              <w:jc w:val="right"/>
+            </w:pPr>
+          </w:p>
+        </w:tc>
+      </w:tr>
+    </w:tbl>
+    <w:p>
+      <w:pPr>
+        <w:spacing w:line="360" w:lineRule="auto" w:before="0" w:after="0"/>
+        <w:ind w:firstLine="709"/>
+        <w:jc w:val="both"/>
+      </w:pPr>
+      <w:r>
+        <w:rPr>
+          <w:rFonts w:ascii="Times New Roman" w:hAnsi="Times New Roman"/>
+          <w:b w:val="0"/>
+          <w:i w:val="0"/>
+          <w:color w:val="000000"/>
+          <w:sz w:val="28"/>
+        </w:rPr>
+        <w:t>Площадь одного светового проема при размерах окна h0 = 3,5 м и b0 = 2,0 м равна:</w:t>
+      </w:r>
+    </w:p>
+    <w:tbl>
+      <w:tblPr>
+        <w:tblW w:type="auto" w:w="0"/>
+        <w:jc w:val="center"/>
+        <w:tblLayout w:type="fixed"/>
+        <w:tblLook w:firstColumn="1" w:firstRow="1" w:lastColumn="0" w:lastRow="0" w:noHBand="0" w:noVBand="1" w:val="04A0"/>
+        <w:tblBorders>
+          <w:top w:val="none"/>
+          <w:bottom w:val="none"/>
+          <w:left w:val="none"/>
+          <w:right w:val="none"/>
+          <w:insideH w:val="none"/>
+          <w:insideV w:val="none"/>
+        </w:tblBorders>
+      </w:tblPr>
+      <w:tblGrid>
+        <w:gridCol w:w="8220"/>
+        <w:gridCol w:w="1134"/>
+      </w:tblGrid>
+      <w:tr>
+        <w:tc>
+          <w:tcPr>
+            <w:tcW w:type="dxa" w:w="4844"/>
+          </w:tcPr>
+          <w:p>
+            <w:pPr>
+              <w:spacing w:line="360" w:lineRule="auto" w:before="80" w:after="80"/>
+              <w:ind w:firstLine="0"/>
+              <w:jc w:val="center"/>
+            </w:pPr>
+            <w:r>
+              <w:rPr>
+                <w:rFonts w:ascii="Times New Roman" w:hAnsi="Times New Roman"/>
+                <w:i/>
+                <w:color w:val="000000"/>
+                <w:sz w:val="28"/>
+              </w:rPr>
+              <w:t>S_окна = h0 · b0 = 3,5 · 2,0 = 7,00 м².</w:t>
+            </w:r>
+          </w:p>
+        </w:tc>
+        <w:tc>
+          <w:tcPr>
+            <w:tcW w:type="dxa" w:w="4844"/>
+          </w:tcPr>
+          <w:p>
+            <w:pPr>
+              <w:spacing w:line="360" w:lineRule="auto" w:before="80" w:after="80"/>
+              <w:ind w:firstLine="0"/>
+              <w:jc w:val="right"/>
+            </w:pPr>
+          </w:p>
+        </w:tc>
+      </w:tr>
+    </w:tbl>
+    <w:p>
+      <w:pPr>
+        <w:spacing w:line="360" w:lineRule="auto" w:before="0" w:after="0"/>
+        <w:ind w:firstLine="709"/>
+        <w:jc w:val="both"/>
+      </w:pPr>
+      <w:r>
+        <w:rPr>
+          <w:rFonts w:ascii="Times New Roman" w:hAnsi="Times New Roman"/>
+          <w:b w:val="0"/>
+          <w:i w:val="0"/>
+          <w:color w:val="000000"/>
+          <w:sz w:val="28"/>
+        </w:rPr>
+        <w:t>Расчетное число оконных проемов составляет:</w:t>
+      </w:r>
+    </w:p>
+    <w:tbl>
+      <w:tblPr>
+        <w:tblW w:type="auto" w:w="0"/>
+        <w:jc w:val="center"/>
+        <w:tblLayout w:type="fixed"/>
+        <w:tblLook w:firstColumn="1" w:firstRow="1" w:lastColumn="0" w:lastRow="0" w:noHBand="0" w:noVBand="1" w:val="04A0"/>
+        <w:tblBorders>
+          <w:top w:val="none"/>
+          <w:bottom w:val="none"/>
+          <w:left w:val="none"/>
+          <w:right w:val="none"/>
+          <w:insideH w:val="none"/>
+          <w:insideV w:val="none"/>
+        </w:tblBorders>
+      </w:tblPr>
+      <w:tblGrid>
+        <w:gridCol w:w="8220"/>
+        <w:gridCol w:w="1134"/>
+      </w:tblGrid>
+      <w:tr>
+        <w:tc>
+          <w:tcPr>
+            <w:tcW w:type="dxa" w:w="4844"/>
+          </w:tcPr>
+          <w:p>
+            <w:pPr>
+              <w:spacing w:line="360" w:lineRule="auto" w:before="80" w:after="80"/>
+              <w:ind w:firstLine="0"/>
+              <w:jc w:val="center"/>
+            </w:pPr>
+            <w:r>
+              <w:rPr>
+                <w:rFonts w:ascii="Times New Roman" w:hAnsi="Times New Roman"/>
+                <w:i/>
+                <w:color w:val="000000"/>
+                <w:sz w:val="28"/>
+              </w:rPr>
+              <w:t>n_точн = S0 / S_окна = 81,11 / 7,00 = 11,59 шт.</w:t>
+            </w:r>
+          </w:p>
+        </w:tc>
+        <w:tc>
+          <w:tcPr>
+            <w:tcW w:type="dxa" w:w="4844"/>
+          </w:tcPr>
+          <w:p>
+            <w:pPr>
+              <w:spacing w:line="360" w:lineRule="auto" w:before="80" w:after="80"/>
+              <w:ind w:firstLine="0"/>
+              <w:jc w:val="right"/>
+            </w:pPr>
+          </w:p>
+        </w:tc>
+      </w:tr>
+    </w:tbl>
+    <w:p>
+      <w:pPr>
+        <w:spacing w:line="360" w:lineRule="auto" w:before="0" w:after="0"/>
+        <w:ind w:firstLine="709"/>
+        <w:jc w:val="both"/>
+      </w:pPr>
+      <w:r>
+        <w:rPr>
+          <w:rFonts w:ascii="Times New Roman" w:hAnsi="Times New Roman"/>
+          <w:b w:val="0"/>
+          <w:i w:val="0"/>
+          <w:color w:val="000000"/>
+          <w:sz w:val="28"/>
+        </w:rPr>
+        <w:t>Принимаем ближайшее целое число окон: n = 12 шт.</w:t>
+      </w:r>
+    </w:p>
+    <w:p>
+      <w:pPr>
+        <w:spacing w:line="360" w:lineRule="auto" w:before="0" w:after="0"/>
+        <w:ind w:firstLine="709"/>
+        <w:jc w:val="both"/>
+      </w:pPr>
+      <w:r>
+        <w:rPr>
+          <w:rFonts w:ascii="Times New Roman" w:hAnsi="Times New Roman"/>
+          <w:b w:val="0"/>
+          <w:i w:val="0"/>
+          <w:color w:val="000000"/>
+          <w:sz w:val="28"/>
+        </w:rPr>
+        <w:t>Величина межоконного промежутка b при размещении n окон по длине стены A = 20,0 м определяется по формуле:</w:t>
+      </w:r>
+    </w:p>
+    <w:tbl>
+      <w:tblPr>
+        <w:tblW w:type="auto" w:w="0"/>
+        <w:jc w:val="center"/>
+        <w:tblLayout w:type="fixed"/>
+        <w:tblLook w:firstColumn="1" w:firstRow="1" w:lastColumn="0" w:lastRow="0" w:noHBand="0" w:noVBand="1" w:val="04A0"/>
+        <w:tblBorders>
+          <w:top w:val="none"/>
+          <w:bottom w:val="none"/>
+          <w:left w:val="none"/>
+          <w:right w:val="none"/>
+          <w:insideH w:val="none"/>
+          <w:insideV w:val="none"/>
+        </w:tblBorders>
+      </w:tblPr>
+      <w:tblGrid>
+        <w:gridCol w:w="8220"/>
+        <w:gridCol w:w="1134"/>
+      </w:tblGrid>
+      <w:tr>
+        <w:tc>
+          <w:tcPr>
+            <w:tcW w:type="dxa" w:w="4844"/>
+          </w:tcPr>
+          <w:p>
+            <w:pPr>
+              <w:spacing w:line="360" w:lineRule="auto" w:before="80" w:after="80"/>
+              <w:ind w:firstLine="0"/>
+              <w:jc w:val="center"/>
+            </w:pPr>
+            <w:r>
+              <w:rPr>
+                <w:rFonts w:ascii="Times New Roman" w:hAnsi="Times New Roman"/>
+                <w:i/>
+                <w:color w:val="000000"/>
+                <w:sz w:val="28"/>
+              </w:rPr>
+              <w:t>b = (A - n · b0) / (n + 1),</w:t>
+            </w:r>
+          </w:p>
+        </w:tc>
+        <w:tc>
+          <w:tcPr>
+            <w:tcW w:type="dxa" w:w="4844"/>
+          </w:tcPr>
+          <w:p>
+            <w:pPr>
+              <w:spacing w:line="360" w:lineRule="auto" w:before="80" w:after="80"/>
+              <w:ind w:firstLine="0"/>
+              <w:jc w:val="right"/>
+            </w:pPr>
+            <w:r>
+              <w:rPr>
+                <w:rFonts w:ascii="Times New Roman" w:hAnsi="Times New Roman"/>
+                <w:color w:val="000000"/>
+                <w:sz w:val="28"/>
+              </w:rPr>
+              <w:t>(4)</w:t>
+            </w:r>
+          </w:p>
+        </w:tc>
+      </w:tr>
+    </w:tbl>
+    <w:tbl>
+      <w:tblPr>
+        <w:tblW w:type="auto" w:w="0"/>
+        <w:jc w:val="center"/>
+        <w:tblLayout w:type="fixed"/>
+        <w:tblLook w:firstColumn="1" w:firstRow="1" w:lastColumn="0" w:lastRow="0" w:noHBand="0" w:noVBand="1" w:val="04A0"/>
+        <w:tblBorders>
+          <w:top w:val="none"/>
+          <w:bottom w:val="none"/>
+          <w:left w:val="none"/>
+          <w:right w:val="none"/>
+          <w:insideH w:val="none"/>
+          <w:insideV w:val="none"/>
+        </w:tblBorders>
+      </w:tblPr>
+      <w:tblGrid>
+        <w:gridCol w:w="8220"/>
+        <w:gridCol w:w="1134"/>
+      </w:tblGrid>
+      <w:tr>
+        <w:tc>
+          <w:tcPr>
+            <w:tcW w:type="dxa" w:w="4844"/>
+          </w:tcPr>
+          <w:p>
+            <w:pPr>
+              <w:spacing w:line="360" w:lineRule="auto" w:before="80" w:after="80"/>
+              <w:ind w:firstLine="0"/>
+              <w:jc w:val="center"/>
+            </w:pPr>
+            <w:r>
+              <w:rPr>
+                <w:rFonts w:ascii="Times New Roman" w:hAnsi="Times New Roman"/>
+                <w:i/>
+                <w:color w:val="000000"/>
+                <w:sz w:val="28"/>
+              </w:rPr>
+              <w:t>b = (20,0 - 12 · 2,0) / (12 + 1) = (20,0 - 24,0) / 13 = -4,0 / 13 = -0,31 м.</w:t>
+            </w:r>
+          </w:p>
+        </w:tc>
+        <w:tc>
+          <w:tcPr>
+            <w:tcW w:type="dxa" w:w="4844"/>
+          </w:tcPr>
+          <w:p>
+            <w:pPr>
+              <w:spacing w:line="360" w:lineRule="auto" w:before="80" w:after="80"/>
+              <w:ind w:firstLine="0"/>
+              <w:jc w:val="right"/>
+            </w:pPr>
+          </w:p>
+        </w:tc>
+      </w:tr>
+    </w:tbl>
+    <w:p>
+      <w:pPr>
+        <w:keepNext/>
+        <w:spacing w:line="360" w:lineRule="auto" w:before="240" w:after="120"/>
+        <w:ind w:firstLine="709"/>
+        <w:jc w:val="left"/>
+      </w:pPr>
+      <w:r>
+        <w:rPr>
+          <w:rFonts w:ascii="Times New Roman" w:hAnsi="Times New Roman"/>
+          <w:b/>
+          <w:color w:val="000000"/>
+          <w:sz w:val="28"/>
+        </w:rPr>
+        <w:t>4 Инженерный анализ и выбор рациональной схемы освещения</w:t>
+      </w:r>
+    </w:p>
+    <w:p>
+      <w:pPr>
+        <w:spacing w:line="360" w:lineRule="auto" w:before="0" w:after="0"/>
+        <w:ind w:firstLine="709"/>
+        <w:jc w:val="both"/>
+      </w:pPr>
+      <w:r>
+        <w:rPr>
+          <w:rFonts w:ascii="Times New Roman" w:hAnsi="Times New Roman"/>
+          <w:b w:val="0"/>
+          <w:i w:val="0"/>
+          <w:color w:val="000000"/>
+          <w:sz w:val="28"/>
+        </w:rPr>
+        <w:t>Анализ односторонней схемы освещения показывает, что полученное межоконное расстояние является отрицательным (b = -0,31 м). Суммарная ширина 12 оконных проемов составляет 12 · 2,0 = 24,0 м, что превышает общую строительную длину наружной стены здания A = 20,0 м. Следовательно, физически разместить необходимое число световых проемов в один ряд по одной наружной стене НЕВОЗМОЖНО.</w:t>
+      </w:r>
+    </w:p>
+    <w:p>
+      <w:pPr>
+        <w:spacing w:line="360" w:lineRule="auto" w:before="0" w:after="0"/>
+        <w:ind w:firstLine="709"/>
+        <w:jc w:val="both"/>
+      </w:pPr>
+      <w:r>
+        <w:rPr>
+          <w:rFonts w:ascii="Times New Roman" w:hAnsi="Times New Roman"/>
+          <w:b w:val="0"/>
+          <w:i w:val="0"/>
+          <w:color w:val="000000"/>
+          <w:sz w:val="28"/>
+        </w:rPr>
+        <w:t>Для глубокого производственного зала (ширина B = 10,0 м) одностороннее боковое освещение также является нерациональным из-за резкого спада естественной освещенности по мере удаления от окон в глубину помещения. В связи с этим рассматривается переход на двустороннее боковое освещение.</w:t>
+      </w:r>
+    </w:p>
+    <w:p>
+      <w:pPr>
+        <w:spacing w:line="360" w:lineRule="auto" w:before="0" w:after="0"/>
+        <w:ind w:firstLine="709"/>
+        <w:jc w:val="both"/>
+      </w:pPr>
+      <w:r>
+        <w:rPr>
+          <w:rFonts w:ascii="Times New Roman" w:hAnsi="Times New Roman"/>
+          <w:b w:val="0"/>
+          <w:i w:val="0"/>
+          <w:color w:val="000000"/>
+          <w:sz w:val="28"/>
+        </w:rPr>
+        <w:t>При двустороннем боковом освещении расчетная точка минимальной освещенности располагается в центре зала на расстоянии B / 2 = 5,0 м от наружных стен. Вследствие этого расчетное отношение глубины к высоте окна составляет (B / 2) / h1 = 5,0 / 3,50 = 1,43, что снижает световую характеристику окна до η0 = 10,00. Коэффициент отраженного света для двусторонней схемы составляет r1 = 1,70.</w:t>
+      </w:r>
+    </w:p>
+    <w:p>
+      <w:pPr>
+        <w:spacing w:line="360" w:lineRule="auto" w:before="0" w:after="0"/>
+        <w:ind w:firstLine="709"/>
+        <w:jc w:val="both"/>
+      </w:pPr>
+      <w:r>
+        <w:rPr>
+          <w:rFonts w:ascii="Times New Roman" w:hAnsi="Times New Roman"/>
+          <w:b w:val="0"/>
+          <w:i w:val="0"/>
+          <w:color w:val="000000"/>
+          <w:sz w:val="28"/>
+        </w:rPr>
+        <w:t>Требуемая суммарная площадь световых проемов для двусторонней схемы:</w:t>
+      </w:r>
+    </w:p>
+    <w:tbl>
+      <w:tblPr>
+        <w:tblW w:type="auto" w:w="0"/>
+        <w:jc w:val="center"/>
+        <w:tblLayout w:type="fixed"/>
+        <w:tblLook w:firstColumn="1" w:firstRow="1" w:lastColumn="0" w:lastRow="0" w:noHBand="0" w:noVBand="1" w:val="04A0"/>
+        <w:tblBorders>
+          <w:top w:val="none"/>
+          <w:bottom w:val="none"/>
+          <w:left w:val="none"/>
+          <w:right w:val="none"/>
+          <w:insideH w:val="none"/>
+          <w:insideV w:val="none"/>
+        </w:tblBorders>
+      </w:tblPr>
+      <w:tblGrid>
+        <w:gridCol w:w="8220"/>
+        <w:gridCol w:w="1134"/>
+      </w:tblGrid>
+      <w:tr>
+        <w:tc>
+          <w:tcPr>
+            <w:tcW w:type="dxa" w:w="4844"/>
+          </w:tcPr>
+          <w:p>
+            <w:pPr>
+              <w:spacing w:line="360" w:lineRule="auto" w:before="80" w:after="80"/>
+              <w:ind w:firstLine="0"/>
+              <w:jc w:val="center"/>
+            </w:pPr>
+            <w:r>
+              <w:rPr>
+                <w:rFonts w:ascii="Times New Roman" w:hAnsi="Times New Roman"/>
+                <w:i/>
+                <w:color w:val="000000"/>
+                <w:sz w:val="28"/>
+              </w:rPr>
+              <w:t>S0_двуст = (200,0 · 2,0 · 10,00 · 1,40) / (100 · 0,40 · 1,70) = 5600,0 / 68,0 = 82,35 м².</w:t>
+            </w:r>
+          </w:p>
+        </w:tc>
+        <w:tc>
+          <w:tcPr>
+            <w:tcW w:type="dxa" w:w="4844"/>
+          </w:tcPr>
+          <w:p>
+            <w:pPr>
+              <w:spacing w:line="360" w:lineRule="auto" w:before="80" w:after="80"/>
+              <w:ind w:firstLine="0"/>
+              <w:jc w:val="right"/>
+            </w:pPr>
+          </w:p>
+        </w:tc>
+      </w:tr>
+    </w:tbl>
+    <w:p>
+      <w:pPr>
+        <w:spacing w:line="360" w:lineRule="auto" w:before="0" w:after="0"/>
+        <w:ind w:firstLine="709"/>
+        <w:jc w:val="both"/>
+      </w:pPr>
+      <w:r>
+        <w:rPr>
+          <w:rFonts w:ascii="Times New Roman" w:hAnsi="Times New Roman"/>
+          <w:b w:val="0"/>
+          <w:i w:val="0"/>
+          <w:color w:val="000000"/>
+          <w:sz w:val="28"/>
+        </w:rPr>
+        <w:t>Расчетное количество окон:</w:t>
+      </w:r>
+    </w:p>
+    <w:tbl>
+      <w:tblPr>
+        <w:tblW w:type="auto" w:w="0"/>
+        <w:jc w:val="center"/>
+        <w:tblLayout w:type="fixed"/>
+        <w:tblLook w:firstColumn="1" w:firstRow="1" w:lastColumn="0" w:lastRow="0" w:noHBand="0" w:noVBand="1" w:val="04A0"/>
+        <w:tblBorders>
+          <w:top w:val="none"/>
+          <w:bottom w:val="none"/>
+          <w:left w:val="none"/>
+          <w:right w:val="none"/>
+          <w:insideH w:val="none"/>
+          <w:insideV w:val="none"/>
+        </w:tblBorders>
+      </w:tblPr>
+      <w:tblGrid>
+        <w:gridCol w:w="8220"/>
+        <w:gridCol w:w="1134"/>
+      </w:tblGrid>
+      <w:tr>
+        <w:tc>
+          <w:tcPr>
+            <w:tcW w:type="dxa" w:w="4844"/>
+          </w:tcPr>
+          <w:p>
+            <w:pPr>
+              <w:spacing w:line="360" w:lineRule="auto" w:before="80" w:after="80"/>
+              <w:ind w:firstLine="0"/>
+              <w:jc w:val="center"/>
+            </w:pPr>
+            <w:r>
+              <w:rPr>
+                <w:rFonts w:ascii="Times New Roman" w:hAnsi="Times New Roman"/>
+                <w:i/>
+                <w:color w:val="000000"/>
+                <w:sz w:val="28"/>
+              </w:rPr>
+              <w:t>n_точн = 82,35 / 7,00 = 11,76 шт.</w:t>
+            </w:r>
+          </w:p>
+        </w:tc>
+        <w:tc>
+          <w:tcPr>
+            <w:tcW w:type="dxa" w:w="4844"/>
+          </w:tcPr>
+          <w:p>
+            <w:pPr>
+              <w:spacing w:line="360" w:lineRule="auto" w:before="80" w:after="80"/>
+              <w:ind w:firstLine="0"/>
+              <w:jc w:val="right"/>
+            </w:pPr>
+          </w:p>
+        </w:tc>
+      </w:tr>
+    </w:tbl>
+    <w:p>
+      <w:pPr>
+        <w:spacing w:line="360" w:lineRule="auto" w:before="0" w:after="0"/>
+        <w:ind w:firstLine="709"/>
+        <w:jc w:val="both"/>
+      </w:pPr>
+      <w:r>
+        <w:rPr>
+          <w:rFonts w:ascii="Times New Roman" w:hAnsi="Times New Roman"/>
+          <w:b w:val="0"/>
+          <w:i w:val="0"/>
+          <w:color w:val="000000"/>
+          <w:sz w:val="28"/>
+        </w:rPr>
+        <w:t>Для обеспечения геометрической и световой симметрии принимается четное число окон n = 12 шт., которые равномерно распределяются по двум противоположным наружным стенам (по 6 окон на каждую стену).</w:t>
+      </w:r>
+    </w:p>
+    <w:p>
+      <w:pPr>
+        <w:spacing w:line="360" w:lineRule="auto" w:before="0" w:after="0"/>
+        <w:ind w:firstLine="709"/>
+        <w:jc w:val="both"/>
+      </w:pPr>
+      <w:r>
+        <w:rPr>
+          <w:rFonts w:ascii="Times New Roman" w:hAnsi="Times New Roman"/>
+          <w:b w:val="0"/>
+          <w:i w:val="0"/>
+          <w:color w:val="000000"/>
+          <w:sz w:val="28"/>
+        </w:rPr>
+        <w:t>Межоконное расстояние на каждой из продольных стен длиной 20,0 м составляет:</w:t>
+      </w:r>
+    </w:p>
+    <w:tbl>
+      <w:tblPr>
+        <w:tblW w:type="auto" w:w="0"/>
+        <w:jc w:val="center"/>
+        <w:tblLayout w:type="fixed"/>
+        <w:tblLook w:firstColumn="1" w:firstRow="1" w:lastColumn="0" w:lastRow="0" w:noHBand="0" w:noVBand="1" w:val="04A0"/>
+        <w:tblBorders>
+          <w:top w:val="none"/>
+          <w:bottom w:val="none"/>
+          <w:left w:val="none"/>
+          <w:right w:val="none"/>
+          <w:insideH w:val="none"/>
+          <w:insideV w:val="none"/>
+        </w:tblBorders>
+      </w:tblPr>
+      <w:tblGrid>
+        <w:gridCol w:w="8220"/>
+        <w:gridCol w:w="1134"/>
+      </w:tblGrid>
+      <w:tr>
+        <w:tc>
+          <w:tcPr>
+            <w:tcW w:type="dxa" w:w="4844"/>
+          </w:tcPr>
+          <w:p>
+            <w:pPr>
+              <w:spacing w:line="360" w:lineRule="auto" w:before="80" w:after="80"/>
+              <w:ind w:firstLine="0"/>
+              <w:jc w:val="center"/>
+            </w:pPr>
+            <w:r>
+              <w:rPr>
+                <w:rFonts w:ascii="Times New Roman" w:hAnsi="Times New Roman"/>
+                <w:i/>
+                <w:color w:val="000000"/>
+                <w:sz w:val="28"/>
+              </w:rPr>
+              <w:t>b = (A - n_ст · b0) / (n_ст + 1) = (20,0 - 6 · 2,0) / (6 + 1) = (20,0 - 12,0) / 7 = 8,0 / 7 = 1,14 м.</w:t>
+            </w:r>
+          </w:p>
+        </w:tc>
+        <w:tc>
+          <w:tcPr>
+            <w:tcW w:type="dxa" w:w="4844"/>
+          </w:tcPr>
+          <w:p>
+            <w:pPr>
+              <w:spacing w:line="360" w:lineRule="auto" w:before="80" w:after="80"/>
+              <w:ind w:firstLine="0"/>
+              <w:jc w:val="right"/>
+            </w:pPr>
+          </w:p>
+        </w:tc>
+      </w:tr>
+    </w:tbl>
+    <w:p>
+      <w:pPr>
+        <w:spacing w:line="360" w:lineRule="auto" w:before="0" w:after="0"/>
+        <w:ind w:firstLine="709"/>
+        <w:jc w:val="both"/>
+      </w:pPr>
+      <w:r>
+        <w:rPr>
+          <w:rFonts w:ascii="Times New Roman" w:hAnsi="Times New Roman"/>
+          <w:b w:val="0"/>
+          <w:i w:val="0"/>
+          <w:color w:val="000000"/>
+          <w:sz w:val="28"/>
+        </w:rPr>
+        <w:t>Значение b = 1,14 м удовлетворяет строительным требованиям по обеспечению достаточной прочности несущих кирпичных или железобетонных простенков наружных стен и гарантирует равномерное двустороннее освещение всего рабочего пространства аппаратного зала.</w:t>
+      </w:r>
+    </w:p>
+    <w:p>
+      <w:pPr>
+        <w:spacing w:line="360" w:lineRule="auto" w:before="120" w:after="80"/>
+        <w:ind w:firstLine="709"/>
+        <w:jc w:val="left"/>
+      </w:pPr>
+      <w:r>
+        <w:rPr>
+          <w:rFonts w:ascii="Times New Roman" w:hAnsi="Times New Roman"/>
+          <w:b w:val="0"/>
+          <w:i w:val="0"/>
+          <w:color w:val="000000"/>
+          <w:sz w:val="28"/>
+        </w:rPr>
+        <w:t>Таблица 2 – Сравнительный анализ схем организации естественного освещения</w:t>
+      </w:r>
+    </w:p>
+    <w:tbl>
+      <w:tblPr>
+        <w:tblW w:type="auto" w:w="0"/>
+        <w:jc w:val="center"/>
+        <w:tblLook w:firstColumn="1" w:firstRow="1" w:lastColumn="0" w:lastRow="0" w:noHBand="0" w:noVBand="1" w:val="04A0"/>
+        <w:tblBorders>
+          <w:top w:val="single" w:sz="4" w:space="0" w:color="000000"/>
+          <w:bottom w:val="single" w:sz="4" w:space="0" w:color="000000"/>
+          <w:left w:val="single" w:sz="4" w:space="0" w:color="000000"/>
+          <w:right w:val="single" w:sz="4" w:space="0" w:color="000000"/>
+          <w:insideH w:val="single" w:sz="4" w:space="0" w:color="000000"/>
+          <w:insideV w:val="single" w:sz="4" w:space="0" w:color="000000"/>
+        </w:tblBorders>
+      </w:tblPr>
+      <w:tblGrid>
+        <w:gridCol w:w="3230"/>
+        <w:gridCol w:w="3230"/>
+        <w:gridCol w:w="3230"/>
+      </w:tblGrid>
+      <w:tr>
+        <w:trPr>
+          <w:cantSplit/>
+        </w:trPr>
         <w:tc>
           <w:tcPr>
             <w:tcW w:type="dxa" w:w="3230"/>
           </w:tcPr>
           <w:p>
             <w:pPr>
-              <w:jc w:val="left"/>
+              <w:spacing w:line="240" w:lineRule="auto" w:before="60" w:after="60"/>
+              <w:ind w:firstLine="0"/>
+              <w:jc w:val="center"/>
             </w:pPr>
             <w:r>
               <w:rPr>
                 <w:rFonts w:ascii="Times New Roman" w:hAnsi="Times New Roman"/>
-                <w:sz w:val="20"/>
+                <w:b/>
+                <w:color w:val="000000"/>
+                <w:sz w:val="24"/>
               </w:rPr>
-              <w:t>Тип остекления и категория помещения</w:t>
+              <w:t>Параметр схемы освещения</w:t>
             </w:r>
           </w:p>
         </w:tc>
@@ -860,16 +3168,18 @@
           </w:tcPr>
           <w:p>
             <w:pPr>
+              <w:spacing w:line="240" w:lineRule="auto" w:before="60" w:after="60"/>
+              <w:ind w:firstLine="0"/>
               <w:jc w:val="center"/>
             </w:pPr>
             <w:r>
               <w:rPr>
                 <w:rFonts w:ascii="Times New Roman" w:hAnsi="Times New Roman"/>
-                <w:sz w:val="20"/>
+                <w:b/>
+                <w:color w:val="000000"/>
+                <w:sz w:val="24"/>
               </w:rPr>
-              <w:t>Категория Б</w:t>
-              <w:br/>
-              <w:t>(стальные переплеты, двойные)</w:t>
+              <w:t>Одностороннее боковое освещение</w:t>
             </w:r>
           </w:p>
         </w:tc>
@@ -879,314 +3189,106 @@
           </w:tcPr>
           <w:p>
             <w:pPr>
-              <w:jc w:val="left"/>
-            </w:pPr>
-            <w:r>
-              <w:rPr>
-                <w:rFonts w:ascii="Times New Roman" w:hAnsi="Times New Roman"/>
-                <w:sz w:val="20"/>
-              </w:rPr>
-              <w:t>Аппаратный зал с незначительным выделением пыли</w:t>
-            </w:r>
-          </w:p>
-        </w:tc>
-      </w:tr>
-    </w:tbl>
-    <w:p>
-      <w:pPr>
-        <w:spacing w:before="240" w:after="120" w:line="276" w:lineRule="auto"/>
-        <w:jc w:val="left"/>
-      </w:pPr>
-      <w:r>
-        <w:rPr>
-          <w:rFonts w:ascii="Times New Roman" w:hAnsi="Times New Roman"/>
-          <w:b/>
-          <w:color w:val="182B49"/>
-          <w:sz w:val="32"/>
-        </w:rPr>
-        <w:t>3. Методика и расчет параметров естественного освещения</w:t>
-      </w:r>
-    </w:p>
-    <w:p>
-      <w:pPr>
-        <w:spacing w:before="0" w:after="120" w:line="276" w:lineRule="auto"/>
-        <w:ind w:firstLine="706"/>
-        <w:jc w:val="both"/>
-      </w:pPr>
-      <w:r>
-        <w:rPr>
-          <w:rFonts w:ascii="Times New Roman" w:hAnsi="Times New Roman"/>
-          <w:sz w:val="24"/>
-        </w:rPr>
-        <w:t>3.1. Определение расчетного параметра окна h1</w:t>
-        <w:br/>
-        <w:t>Под параметром окна h1 понимается возвышение верхнего края оконного проема над горизонтальной рабочей поверхностью:</w:t>
-        <w:br/>
-        <w:t>h1 = h0 + h_под - h_раб</w:t>
-        <w:br/>
-        <w:t>h1 = 3,5 + 1,2 - 1,2 = 3.50 м.</w:t>
-      </w:r>
-    </w:p>
-    <w:p>
-      <w:pPr>
-        <w:spacing w:before="0" w:after="120" w:line="276" w:lineRule="auto"/>
-        <w:ind w:firstLine="706"/>
-        <w:jc w:val="both"/>
-      </w:pPr>
-      <w:r>
-        <w:rPr>
-          <w:rFonts w:ascii="Times New Roman" w:hAnsi="Times New Roman"/>
-          <w:sz w:val="24"/>
-        </w:rPr>
-        <w:t>3.2. Определение геометрических соотношений помещения</w:t>
-        <w:br/>
-        <w:t>• Отношение длины помещения к ширине: A / B = 20,0 / 10,0 = 2.00</w:t>
-        <w:br/>
-        <w:t>• Отношение ширины к расчетной высоте окна: B / h1 = 10,0 / 3.50 = 2.857</w:t>
-        <w:br/>
-        <w:t>• Отношение расстояния между зданиями к высоте карниза: L / H = 30,0 / 30,0 = 1.00</w:t>
-      </w:r>
-    </w:p>
-    <w:p>
-      <w:pPr>
-        <w:spacing w:before="0" w:after="120" w:line="276" w:lineRule="auto"/>
-        <w:ind w:firstLine="706"/>
-        <w:jc w:val="both"/>
-      </w:pPr>
-      <w:r>
-        <w:rPr>
-          <w:rFonts w:ascii="Times New Roman" w:hAnsi="Times New Roman"/>
-          <w:sz w:val="24"/>
-        </w:rPr>
-        <w:t>3.3. Выбор нормативных коэффициентов по таблицам пособия</w:t>
-        <w:br/>
-        <w:t>1. Нормированное значение КЕО l_min (Таблица 4.1): для III разряда зрительной работы при боковом освещении l_min = 2.0%.</w:t>
-        <w:br/>
-        <w:t>2. Коэффициент затемнения противостоящим зданием K_зд (Таблица 4.3): при L / H = 1,0 коэффициент составляет K_зд = 1.40.</w:t>
-        <w:br/>
-        <w:t>3. Световая характеристика окна η0 (Таблица 4.2): для отношения A / B = 2,0 и B / h1 = 2,857 путем интерполяции между значениями для B/h1=2,5 (η0=13,0) и B/h1=3,0 (η0=18,0) получаем:</w:t>
-        <w:br/>
-        <w:t>η0 = 13,0 + (18,0 - 13,0) × (2,857 - 2,5) / (3,0 - 2,5) = 16.57.</w:t>
-        <w:br/>
-        <w:t>4. Общий коэффициент светопропускания r0 (Таблица 4.5): для помещений категории Б при вертикальном остеклении и стальных двойных переплетах r0 = 0.40.</w:t>
-      </w:r>
-    </w:p>
-    <w:p>
-      <w:pPr>
-        <w:spacing w:before="0" w:after="120" w:line="276" w:lineRule="auto"/>
-        <w:ind w:firstLine="706"/>
-        <w:jc w:val="both"/>
-      </w:pPr>
-      <w:r>
-        <w:rPr>
-          <w:rFonts w:ascii="Times New Roman" w:hAnsi="Times New Roman"/>
-          <w:sz w:val="24"/>
-        </w:rPr>
-        <w:t>3.4. Определение средневзвешенного коэффициента отражения ρ_ср и коэффициента r1</w:t>
-        <w:br/>
-        <w:t>Площади ограждающих поверхностей производственного помещения:</w:t>
-        <w:br/>
-        <w:t>• Площадь пола: S_пол = A × B = 20 × 10 = 200.0 м²;</w:t>
-        <w:br/>
-        <w:t>• Площадь потолка: S_п = A × B = 20 × 10 = 200.0 м²;</w:t>
-        <w:br/>
-        <w:t>• Площадь стен: S_ст = 2 × (A + B) × h = 2 × (20 + 10) × 5,0 = 300.0 м²;</w:t>
-        <w:br/>
-        <w:t>• Полная внутренняя площадь: S_общ = 200.0 + 200.0 + 300.0 = 700.0 м².</w:t>
-        <w:br/>
-        <w:t>Средневзвешенный коэффициент отражения внутренних поверхностей:</w:t>
-        <w:br/>
-        <w:t>ρ_ср = (ρ_п·S_п + ρ_ст·S_ст + ρ_пол·S_пол) / S_общ</w:t>
-        <w:br/>
-        <w:t>ρ_ср = (0,50 × 200 + 0,50 × 300 + 0,10 × 200) / 700 = (100 + 150 + 20) / 700 = 270 / 700 = 0.3857 (38.6%).</w:t>
-        <w:br/>
-        <w:t>По Таблице 4.6 определяем коэффициент r1, учитывающий отраженный свет:</w:t>
-        <w:br/>
-        <w:t>• При одностороннем боковом освещении: r1 = 2.86;</w:t>
-        <w:br/>
-        <w:t>• При двустороннем боковом освещении: r1 = 1.63.</w:t>
-      </w:r>
-    </w:p>
-    <w:p>
-      <w:pPr>
-        <w:spacing w:before="0" w:after="120" w:line="276" w:lineRule="auto"/>
-        <w:ind w:firstLine="706"/>
-        <w:jc w:val="both"/>
-      </w:pPr>
-      <w:r>
-        <w:rPr>
-          <w:rFonts w:ascii="Times New Roman" w:hAnsi="Times New Roman"/>
-          <w:sz w:val="24"/>
-        </w:rPr>
-        <w:t>3.5. Расчет площади световых проемов S0 и числа окон для одностороннего освещения</w:t>
-        <w:br/>
-        <w:t>Необходимая площадь световых проемов определяется по основной формуле:</w:t>
-        <w:br/>
-        <w:t>S0 = (S_пол · l_min · η0 · K_зд) / (100 · r0 · r1)</w:t>
-        <w:br/>
-        <w:t>S0 = (200.0 × 2.0 × 16.57 × 1.40) / (100 × 0.40 × 2.86) = 81.20 м².</w:t>
-        <w:br/>
-        <w:t>Площадь одного типового окна: S_окна = h0 × b0 = 3,5 × 2,0 = 7.00 м².</w:t>
-        <w:br/>
-        <w:t>Расчетное число окон: n_точн = S0 / S_окна = 81.20 / 7.00 = 11.60 шт.</w:t>
-        <w:br/>
-        <w:t>Принимаем ближайшее целое число окон: n = 12 шт.</w:t>
-        <w:br/>
-        <w:t>Величина межоконного расстояния b при размещении n окон в наружной стене длиной A=20 м:</w:t>
-        <w:br/>
-        <w:t>b = (A - n · b0) / (n + 1) = (20,0 - 12 × 2,0) / (12 + 1) = (20,0 - 24.0) / 13 = -0.31 м.</w:t>
-      </w:r>
-    </w:p>
-    <w:p>
-      <w:pPr>
-        <w:spacing w:before="240" w:after="120" w:line="276" w:lineRule="auto"/>
-        <w:jc w:val="left"/>
-      </w:pPr>
-      <w:r>
-        <w:rPr>
-          <w:rFonts w:ascii="Times New Roman" w:hAnsi="Times New Roman"/>
-          <w:b/>
-          <w:color w:val="182B49"/>
-          <w:sz w:val="32"/>
-        </w:rPr>
-        <w:t>4. Инженерный анализ и выбор рациональной схемы освещения</w:t>
-      </w:r>
-    </w:p>
-    <w:p>
-      <w:pPr>
-        <w:spacing w:before="0" w:after="120" w:line="276" w:lineRule="auto"/>
-        <w:ind w:firstLine="706"/>
-        <w:jc w:val="both"/>
-      </w:pPr>
-      <w:r>
-        <w:rPr>
-          <w:rFonts w:ascii="Times New Roman" w:hAnsi="Times New Roman"/>
-          <w:sz w:val="24"/>
-        </w:rPr>
-        <w:t>Анализ односторонней схемы освещения:</w:t>
-        <w:br/>
-        <w:t>Принятое расчетное число окон n = 12 шт. при ширине каждого окна b0 = 2,0 м требует суммарной ширины остекления 24.0 м, что превышает общую длину наружной стены помещения A = 20,0 м. Значение межоконного промежутка получилось отрицательным (b = -0.31 м). Это означает, что физически разместить необходимое количество световых проемов в один ряд по одной продольной стене НЕВОЗМОЖНО.</w:t>
-      </w:r>
-    </w:p>
-    <w:p>
-      <w:pPr>
-        <w:spacing w:before="0" w:after="120" w:line="276" w:lineRule="auto"/>
-        <w:ind w:firstLine="706"/>
-        <w:jc w:val="both"/>
-      </w:pPr>
-      <w:r>
-        <w:rPr>
-          <w:rFonts w:ascii="Times New Roman" w:hAnsi="Times New Roman"/>
-          <w:sz w:val="24"/>
-        </w:rPr>
-        <w:t>Инженерное решение — переход на двустороннее боковое освещение:</w:t>
-        <w:br/>
-        <w:t>Для обеспечения нормативной освещенности глубокого зала (B = 10 м) и равномерного распределения светового потока целесообразно организовать световые проемы в двух противоположных наружных стенах. При двустороннем освещении нормативный коэффициент r1 по Таблице 4.6 снижается до r1 = 1,70, что отражает более глубокое взаимное проникновение света с обеих сторон:</w:t>
-        <w:br/>
-        <w:t>S0_двуст = (200.0 × 2.0 × 16.57 × 1.40) / (100 × 0.40 × 1.63) = 87.81 м².</w:t>
-        <w:br/>
-        <w:t>Расчетное число окон для двух стен: n_точн = 87.81 / 7,0 = 12.54 шт.</w:t>
-        <w:br/>
-        <w:t>Принимаем четное число окон для симметричного размещения: n = 14 шт. (по 7 окон на каждой стене).</w:t>
-        <w:br/>
-        <w:t>Межоконное расстояние на каждой из двух стен длиной 20 м составит:</w:t>
-        <w:br/>
-        <w:t>b = (A - 7 × b0) / (7 + 1) = (20,0 - 14.0) / 8 = 0.75 м.</w:t>
-        <w:br/>
-        <w:t>Величина межоконного простенка b = 0.75 м обеспечивает высокую конструктивную надежность несущих простенков здания и равномерность естественного освещения рабочего пространства.</w:t>
-      </w:r>
-    </w:p>
-    <w:tbl>
-      <w:tblPr>
-        <w:tblW w:type="auto" w:w="0"/>
-        <w:jc w:val="center"/>
-        <w:tblLook w:firstColumn="1" w:firstRow="1" w:lastColumn="0" w:lastRow="0" w:noHBand="0" w:noVBand="1" w:val="04A0"/>
-        <w:tblBorders>
-          <w:top w:val="single" w:sz="4" w:space="0" w:color="D3D3D3"/>
-          <w:bottom w:val="single" w:sz="4" w:space="0" w:color="D3D3D3"/>
-          <w:left w:val="none"/>
-          <w:right w:val="none"/>
-          <w:insideH w:val="single" w:sz="4" w:space="0" w:color="D3D3D3"/>
-          <w:insideV w:val="none"/>
-        </w:tblBorders>
-      </w:tblPr>
-      <w:tblGrid>
-        <w:gridCol w:w="3230"/>
-        <w:gridCol w:w="3230"/>
-        <w:gridCol w:w="3230"/>
-      </w:tblGrid>
-      <w:tr>
-        <w:tc>
-          <w:tcPr>
-            <w:tcW w:type="dxa" w:w="3230"/>
-            <w:shd w:fill="E8EEF5"/>
-          </w:tcPr>
-          <w:p>
-            <w:pPr>
+              <w:spacing w:line="240" w:lineRule="auto" w:before="60" w:after="60"/>
+              <w:ind w:firstLine="0"/>
               <w:jc w:val="center"/>
             </w:pPr>
             <w:r>
               <w:rPr>
                 <w:rFonts w:ascii="Times New Roman" w:hAnsi="Times New Roman"/>
                 <w:b/>
-                <w:sz w:val="22"/>
+                <w:color w:val="000000"/>
+                <w:sz w:val="24"/>
               </w:rPr>
-              <w:t>Показатель</w:t>
+              <w:t>Двустороннее боковое освещение (рекомендовано)</w:t>
+            </w:r>
+          </w:p>
+        </w:tc>
+      </w:tr>
+      <w:tr>
+        <w:trPr>
+          <w:cantSplit/>
+        </w:trPr>
+        <w:tc>
+          <w:tcPr>
+            <w:tcW w:type="dxa" w:w="3230"/>
+          </w:tcPr>
+          <w:p>
+            <w:pPr>
+              <w:spacing w:line="240" w:lineRule="auto" w:before="60" w:after="60"/>
+              <w:ind w:firstLine="0"/>
+              <w:jc w:val="left"/>
+            </w:pPr>
+            <w:r>
+              <w:rPr>
+                <w:rFonts w:ascii="Times New Roman" w:hAnsi="Times New Roman"/>
+                <w:color w:val="000000"/>
+                <w:sz w:val="24"/>
+              </w:rPr>
+              <w:t>Световая характеристика окон η0</w:t>
             </w:r>
           </w:p>
         </w:tc>
         <w:tc>
           <w:tcPr>
             <w:tcW w:type="dxa" w:w="3230"/>
-            <w:shd w:fill="E8EEF5"/>
           </w:tcPr>
           <w:p>
             <w:pPr>
+              <w:spacing w:line="240" w:lineRule="auto" w:before="60" w:after="60"/>
+              <w:ind w:firstLine="0"/>
               <w:jc w:val="center"/>
             </w:pPr>
             <w:r>
               <w:rPr>
                 <w:rFonts w:ascii="Times New Roman" w:hAnsi="Times New Roman"/>
-                <w:b/>
-                <w:sz w:val="22"/>
+                <w:color w:val="000000"/>
+                <w:sz w:val="24"/>
               </w:rPr>
-              <w:t>Одностороннее освещение</w:t>
+              <w:t>16,57</w:t>
             </w:r>
           </w:p>
         </w:tc>
         <w:tc>
           <w:tcPr>
             <w:tcW w:type="dxa" w:w="3230"/>
-            <w:shd w:fill="E8EEF5"/>
           </w:tcPr>
           <w:p>
             <w:pPr>
+              <w:spacing w:line="240" w:lineRule="auto" w:before="60" w:after="60"/>
+              <w:ind w:firstLine="0"/>
               <w:jc w:val="center"/>
             </w:pPr>
             <w:r>
               <w:rPr>
                 <w:rFonts w:ascii="Times New Roman" w:hAnsi="Times New Roman"/>
-                <w:b/>
-                <w:sz w:val="22"/>
+                <w:color w:val="000000"/>
+                <w:sz w:val="24"/>
               </w:rPr>
-              <w:t>Двустороннее освещение (рекомендовано)</w:t>
+              <w:t>10,00</w:t>
             </w:r>
           </w:p>
         </w:tc>
       </w:tr>
       <w:tr>
+        <w:trPr>
+          <w:cantSplit/>
+        </w:trPr>
         <w:tc>
           <w:tcPr>
             <w:tcW w:type="dxa" w:w="3230"/>
           </w:tcPr>
           <w:p>
             <w:pPr>
+              <w:spacing w:line="240" w:lineRule="auto" w:before="60" w:after="60"/>
+              <w:ind w:firstLine="0"/>
               <w:jc w:val="left"/>
             </w:pPr>
             <w:r>
               <w:rPr>
                 <w:rFonts w:ascii="Times New Roman" w:hAnsi="Times New Roman"/>
-                <w:sz w:val="20"/>
+                <w:color w:val="000000"/>
+                <w:sz w:val="24"/>
               </w:rPr>
               <w:t>Коэффициент отраженного света r1</w:t>
             </w:r>
@@ -1198,14 +3300,17 @@
           </w:tcPr>
           <w:p>
             <w:pPr>
+              <w:spacing w:line="240" w:lineRule="auto" w:before="60" w:after="60"/>
+              <w:ind w:firstLine="0"/>
               <w:jc w:val="center"/>
             </w:pPr>
             <w:r>
               <w:rPr>
                 <w:rFonts w:ascii="Times New Roman" w:hAnsi="Times New Roman"/>
-                <w:sz w:val="20"/>
+                <w:color w:val="000000"/>
+                <w:sz w:val="24"/>
               </w:rPr>
-              <w:t>2.86</w:t>
+              <w:t>2,86</w:t>
             </w:r>
           </w:p>
         </w:tc>
@@ -1215,31 +3320,40 @@
           </w:tcPr>
           <w:p>
             <w:pPr>
+              <w:spacing w:line="240" w:lineRule="auto" w:before="60" w:after="60"/>
+              <w:ind w:firstLine="0"/>
               <w:jc w:val="center"/>
             </w:pPr>
             <w:r>
               <w:rPr>
                 <w:rFonts w:ascii="Times New Roman" w:hAnsi="Times New Roman"/>
-                <w:sz w:val="20"/>
+                <w:color w:val="000000"/>
+                <w:sz w:val="24"/>
               </w:rPr>
-              <w:t>1.63</w:t>
+              <w:t>1,70</w:t>
             </w:r>
           </w:p>
         </w:tc>
       </w:tr>
       <w:tr>
+        <w:trPr>
+          <w:cantSplit/>
+        </w:trPr>
         <w:tc>
           <w:tcPr>
             <w:tcW w:type="dxa" w:w="3230"/>
           </w:tcPr>
           <w:p>
             <w:pPr>
+              <w:spacing w:line="240" w:lineRule="auto" w:before="60" w:after="60"/>
+              <w:ind w:firstLine="0"/>
               <w:jc w:val="left"/>
             </w:pPr>
             <w:r>
               <w:rPr>
                 <w:rFonts w:ascii="Times New Roman" w:hAnsi="Times New Roman"/>
-                <w:sz w:val="20"/>
+                <w:color w:val="000000"/>
+                <w:sz w:val="24"/>
               </w:rPr>
               <w:t>Требуемая площадь остекления S0</w:t>
             </w:r>
@@ -1251,14 +3365,17 @@
           </w:tcPr>
           <w:p>
             <w:pPr>
+              <w:spacing w:line="240" w:lineRule="auto" w:before="60" w:after="60"/>
+              <w:ind w:firstLine="0"/>
               <w:jc w:val="center"/>
             </w:pPr>
             <w:r>
               <w:rPr>
                 <w:rFonts w:ascii="Times New Roman" w:hAnsi="Times New Roman"/>
-                <w:sz w:val="20"/>
+                <w:color w:val="000000"/>
+                <w:sz w:val="24"/>
               </w:rPr>
-              <w:t>81.20 м²</w:t>
+              <w:t>81,11 м²</w:t>
             </w:r>
           </w:p>
         </w:tc>
@@ -1268,33 +3385,42 @@
           </w:tcPr>
           <w:p>
             <w:pPr>
+              <w:spacing w:line="240" w:lineRule="auto" w:before="60" w:after="60"/>
+              <w:ind w:firstLine="0"/>
               <w:jc w:val="center"/>
             </w:pPr>
             <w:r>
               <w:rPr>
                 <w:rFonts w:ascii="Times New Roman" w:hAnsi="Times New Roman"/>
-                <w:sz w:val="20"/>
+                <w:color w:val="000000"/>
+                <w:sz w:val="24"/>
               </w:rPr>
-              <w:t>87.81 м²</w:t>
+              <w:t>82,35 м²</w:t>
             </w:r>
           </w:p>
         </w:tc>
       </w:tr>
       <w:tr>
+        <w:trPr>
+          <w:cantSplit/>
+        </w:trPr>
         <w:tc>
           <w:tcPr>
             <w:tcW w:type="dxa" w:w="3230"/>
           </w:tcPr>
           <w:p>
             <w:pPr>
+              <w:spacing w:line="240" w:lineRule="auto" w:before="60" w:after="60"/>
+              <w:ind w:firstLine="0"/>
               <w:jc w:val="left"/>
             </w:pPr>
             <w:r>
               <w:rPr>
                 <w:rFonts w:ascii="Times New Roman" w:hAnsi="Times New Roman"/>
-                <w:sz w:val="20"/>
+                <w:color w:val="000000"/>
+                <w:sz w:val="24"/>
               </w:rPr>
-              <w:t>Принятое число окон n</w:t>
+              <w:t>Число оконных проемов n</w:t>
             </w:r>
           </w:p>
         </w:tc>
@@ -1304,14 +3430,17 @@
           </w:tcPr>
           <w:p>
             <w:pPr>
+              <w:spacing w:line="240" w:lineRule="auto" w:before="60" w:after="60"/>
+              <w:ind w:firstLine="0"/>
               <w:jc w:val="center"/>
             </w:pPr>
             <w:r>
               <w:rPr>
                 <w:rFonts w:ascii="Times New Roman" w:hAnsi="Times New Roman"/>
-                <w:sz w:val="20"/>
+                <w:color w:val="000000"/>
+                <w:sz w:val="24"/>
               </w:rPr>
-              <w:t>12 шт. (на 1 стену)</w:t>
+              <w:t>12 шт. (в 1 ряд)</w:t>
             </w:r>
           </w:p>
         </w:tc>
@@ -1321,31 +3450,40 @@
           </w:tcPr>
           <w:p>
             <w:pPr>
+              <w:spacing w:line="240" w:lineRule="auto" w:before="60" w:after="60"/>
+              <w:ind w:firstLine="0"/>
               <w:jc w:val="center"/>
             </w:pPr>
             <w:r>
               <w:rPr>
                 <w:rFonts w:ascii="Times New Roman" w:hAnsi="Times New Roman"/>
-                <w:sz w:val="20"/>
+                <w:color w:val="000000"/>
+                <w:sz w:val="24"/>
               </w:rPr>
-              <w:t>14 шт. (по 7 шт. на 2 стены)</w:t>
+              <w:t>12 шт. (по 6 шт. на две стены)</w:t>
             </w:r>
           </w:p>
         </w:tc>
       </w:tr>
       <w:tr>
+        <w:trPr>
+          <w:cantSplit/>
+        </w:trPr>
         <w:tc>
           <w:tcPr>
             <w:tcW w:type="dxa" w:w="3230"/>
           </w:tcPr>
           <w:p>
             <w:pPr>
+              <w:spacing w:line="240" w:lineRule="auto" w:before="60" w:after="60"/>
+              <w:ind w:firstLine="0"/>
               <w:jc w:val="left"/>
             </w:pPr>
             <w:r>
               <w:rPr>
                 <w:rFonts w:ascii="Times New Roman" w:hAnsi="Times New Roman"/>
-                <w:sz w:val="20"/>
+                <w:color w:val="000000"/>
+                <w:sz w:val="24"/>
               </w:rPr>
               <w:t>Межоконный промежуток b</w:t>
             </w:r>
@@ -1357,14 +3495,17 @@
           </w:tcPr>
           <w:p>
             <w:pPr>
+              <w:spacing w:line="240" w:lineRule="auto" w:before="60" w:after="60"/>
+              <w:ind w:firstLine="0"/>
               <w:jc w:val="center"/>
             </w:pPr>
             <w:r>
               <w:rPr>
                 <w:rFonts w:ascii="Times New Roman" w:hAnsi="Times New Roman"/>
-                <w:sz w:val="20"/>
+                <w:color w:val="000000"/>
+                <w:sz w:val="24"/>
               </w:rPr>
-              <w:t>-0.31 м (не реализуемо)</w:t>
+              <w:t>-0,31 м (не помещаются)</w:t>
             </w:r>
           </w:p>
         </w:tc>
@@ -1374,33 +3515,42 @@
           </w:tcPr>
           <w:p>
             <w:pPr>
+              <w:spacing w:line="240" w:lineRule="auto" w:before="60" w:after="60"/>
+              <w:ind w:firstLine="0"/>
               <w:jc w:val="center"/>
             </w:pPr>
             <w:r>
               <w:rPr>
                 <w:rFonts w:ascii="Times New Roman" w:hAnsi="Times New Roman"/>
-                <w:sz w:val="20"/>
+                <w:color w:val="000000"/>
+                <w:sz w:val="24"/>
               </w:rPr>
-              <w:t>0.75 м (оптимально)</w:t>
+              <w:t>+1,14 м (оптимально)</w:t>
             </w:r>
           </w:p>
         </w:tc>
       </w:tr>
       <w:tr>
+        <w:trPr>
+          <w:cantSplit/>
+        </w:trPr>
         <w:tc>
           <w:tcPr>
             <w:tcW w:type="dxa" w:w="3230"/>
           </w:tcPr>
           <w:p>
             <w:pPr>
+              <w:spacing w:line="240" w:lineRule="auto" w:before="60" w:after="60"/>
+              <w:ind w:firstLine="0"/>
               <w:jc w:val="left"/>
             </w:pPr>
             <w:r>
               <w:rPr>
                 <w:rFonts w:ascii="Times New Roman" w:hAnsi="Times New Roman"/>
-                <w:sz w:val="20"/>
+                <w:color w:val="000000"/>
+                <w:sz w:val="24"/>
               </w:rPr>
-              <w:t>Равномерность освещенности</w:t>
+              <w:t>Конструктивная реализуемость</w:t>
             </w:r>
           </w:p>
         </w:tc>
@@ -1410,14 +3560,17 @@
           </w:tcPr>
           <w:p>
             <w:pPr>
+              <w:spacing w:line="240" w:lineRule="auto" w:before="60" w:after="60"/>
+              <w:ind w:firstLine="0"/>
               <w:jc w:val="center"/>
             </w:pPr>
             <w:r>
               <w:rPr>
                 <w:rFonts w:ascii="Times New Roman" w:hAnsi="Times New Roman"/>
-                <w:sz w:val="20"/>
+                <w:color w:val="000000"/>
+                <w:sz w:val="24"/>
               </w:rPr>
-              <w:t>Низкая (затухание света к дальней стене)</w:t>
+              <w:t>Не реализуемо</w:t>
             </w:r>
           </w:p>
         </w:tc>
@@ -1427,14 +3580,17 @@
           </w:tcPr>
           <w:p>
             <w:pPr>
+              <w:spacing w:line="240" w:lineRule="auto" w:before="60" w:after="60"/>
+              <w:ind w:firstLine="0"/>
               <w:jc w:val="center"/>
             </w:pPr>
             <w:r>
               <w:rPr>
                 <w:rFonts w:ascii="Times New Roman" w:hAnsi="Times New Roman"/>
-                <w:sz w:val="20"/>
+                <w:color w:val="000000"/>
+                <w:sz w:val="24"/>
               </w:rPr>
-              <w:t>Высокая (перекрестное освещение)</w:t>
+              <w:t>Полностью реализуемо, надежно</w:t>
             </w:r>
           </w:p>
         </w:tc>
@@ -1442,314 +3598,687 @@
     </w:tbl>
     <w:p>
       <w:pPr>
-        <w:spacing w:before="240" w:after="120" w:line="276" w:lineRule="auto"/>
+        <w:keepNext/>
+        <w:spacing w:line="360" w:lineRule="auto" w:before="240" w:after="120"/>
+        <w:ind w:firstLine="709"/>
         <w:jc w:val="left"/>
       </w:pPr>
       <w:r>
         <w:rPr>
           <w:rFonts w:ascii="Times New Roman" w:hAnsi="Times New Roman"/>
           <w:b/>
-          <w:color w:val="182B49"/>
-          <w:sz w:val="32"/>
+          <w:color w:val="000000"/>
+          <w:sz w:val="28"/>
         </w:rPr>
-        <w:t>5. Ответы на контрольные вопросы</w:t>
+        <w:t>5 Ответы на контрольные вопросы</w:t>
       </w:r>
     </w:p>
     <w:p>
       <w:pPr>
-        <w:spacing w:before="120" w:after="40" w:line="276" w:lineRule="auto"/>
+        <w:spacing w:line="360" w:lineRule="auto" w:before="120" w:after="40"/>
+        <w:ind w:firstLine="709"/>
+        <w:jc w:val="both"/>
       </w:pPr>
       <w:r>
         <w:rPr>
           <w:rFonts w:ascii="Times New Roman" w:hAnsi="Times New Roman"/>
           <w:b/>
-          <w:color w:val="182B49"/>
-          <w:sz w:val="24"/>
+          <w:i w:val="0"/>
+          <w:color w:val="000000"/>
+          <w:sz w:val="28"/>
         </w:rPr>
-        <w:t>Вопрос 1: Как нормируется естественная освещенность?</w:t>
+        <w:t>1. Как нормируется естественная освещенность?</w:t>
       </w:r>
     </w:p>
     <w:p>
       <w:pPr>
-        <w:spacing w:before="0" w:after="160" w:line="276" w:lineRule="auto"/>
-        <w:ind w:firstLine="706"/>
+        <w:spacing w:line="360" w:lineRule="auto" w:before="0" w:after="80"/>
+        <w:ind w:firstLine="709"/>
         <w:jc w:val="both"/>
       </w:pPr>
       <w:r>
         <w:rPr>
           <w:rFonts w:ascii="Times New Roman" w:hAnsi="Times New Roman"/>
-          <w:sz w:val="22"/>
+          <w:b w:val="0"/>
+          <w:i w:val="0"/>
+          <w:color w:val="000000"/>
+          <w:sz w:val="28"/>
         </w:rPr>
-        <w:t>Ответ: Естественная освещенность нормируется в относительных единицах — через коэффициент естественной освещенности (КЕО, e_N, выражается в процентах). КЕО представляет собой отношение естественной освещенности, создаваемой в некоторой точке заданной плоскости внутри помещения светом неба (непосредственно или после отражений), к одновременному значению наружной горизонтальной освещенности, создаваемой светом полностью открытого небосвода: e = (E_внут / E_нар) × 100%. Нормирование в относительных величинах обусловлено непрерывным изменением наружной естественной освещенности в течение суток и сезонов года в зависимости от положения солнца и облачности.</w:t>
+        <w:t>Естественная освещенность нормируется в относительных величинах посредством коэффициента естественной освещенности (КЕО), обозначаемого l (или e) и выражаемого в процентах. КЕО представляет собой процентное отношение естественной освещенности E_внут, создаваемой в расчетной точке внутри помещения светом неба (прямым или после отражений), к одновременной наружной горизонтальной освещенности E_нар, создаваемой светом полностью открытого небосвода:</w:t>
       </w:r>
     </w:p>
     <w:p>
       <w:pPr>
-        <w:spacing w:before="120" w:after="40" w:line="276" w:lineRule="auto"/>
+        <w:spacing w:line="360" w:lineRule="auto" w:before="0" w:after="80"/>
+        <w:ind w:firstLine="709"/>
+        <w:jc w:val="both"/>
+      </w:pPr>
+      <w:r>
+        <w:rPr>
+          <w:rFonts w:ascii="Times New Roman" w:hAnsi="Times New Roman"/>
+          <w:b w:val="0"/>
+          <w:i w:val="0"/>
+          <w:color w:val="000000"/>
+          <w:sz w:val="28"/>
+        </w:rPr>
+        <w:t>e = (E_внут / E_нар) · 100 %.</w:t>
+      </w:r>
+    </w:p>
+    <w:p>
+      <w:pPr>
+        <w:spacing w:line="360" w:lineRule="auto" w:before="0" w:after="80"/>
+        <w:ind w:firstLine="709"/>
+        <w:jc w:val="both"/>
+      </w:pPr>
+      <w:r>
+        <w:rPr>
+          <w:rFonts w:ascii="Times New Roman" w:hAnsi="Times New Roman"/>
+          <w:b w:val="0"/>
+          <w:i w:val="0"/>
+          <w:color w:val="000000"/>
+          <w:sz w:val="28"/>
+        </w:rPr>
+        <w:t>Нормирование в относительных единицах обусловлено тем, что абсолютная наружная освещенность непрерывно меняется в широких пределах в зависимости от времени суток, сезона года и облачности, тогда как отношение внутренней освещенности к наружной остается относительно постоянной величиной.</w:t>
+      </w:r>
+    </w:p>
+    <w:p>
+      <w:pPr>
+        <w:spacing w:line="360" w:lineRule="auto" w:before="120" w:after="40"/>
+        <w:ind w:firstLine="709"/>
+        <w:jc w:val="both"/>
       </w:pPr>
       <w:r>
         <w:rPr>
           <w:rFonts w:ascii="Times New Roman" w:hAnsi="Times New Roman"/>
           <w:b/>
-          <w:color w:val="182B49"/>
-          <w:sz w:val="24"/>
+          <w:i w:val="0"/>
+          <w:color w:val="000000"/>
+          <w:sz w:val="28"/>
         </w:rPr>
-        <w:t>Вопрос 2: Какие виды естественного освещения вы знаете?</w:t>
+        <w:t>2. Какие виды естественного освещения вы знаете?</w:t>
       </w:r>
     </w:p>
     <w:p>
       <w:pPr>
-        <w:spacing w:before="0" w:after="160" w:line="276" w:lineRule="auto"/>
-        <w:ind w:firstLine="706"/>
+        <w:spacing w:line="360" w:lineRule="auto" w:before="0" w:after="80"/>
+        <w:ind w:firstLine="709"/>
         <w:jc w:val="both"/>
       </w:pPr>
       <w:r>
         <w:rPr>
           <w:rFonts w:ascii="Times New Roman" w:hAnsi="Times New Roman"/>
-          <w:sz w:val="22"/>
+          <w:b w:val="0"/>
+          <w:i w:val="0"/>
+          <w:color w:val="000000"/>
+          <w:sz w:val="28"/>
         </w:rPr>
-        <w:t>Ответ: В соответствии со строительными нормами различают три основных вида естественного освещения:</w:t>
-        <w:br/>
-        <w:t>1. Боковое освещение — осуществляется через световые проемы (окна) в наружных стенах здания. Может быть односторонним (окна на одной стене) или двусторонним (окна на противоположных или смежных стенах).</w:t>
-        <w:br/>
-        <w:t>2. Верхнее освещение — осуществляется через световые аэрационные или зенитные фонари, проемы в перекрытиях и светопрозрачные конструкции кровли.</w:t>
-        <w:br/>
-        <w:t>3. Комбинированное (смешанное) освещение — сочетание бокового и верхнего естественного освещения, обеспечивающее наиболее высокую освещенность и равномерность в крупногабаритных производственных цехах.</w:t>
+        <w:t>В соответствии со строительными нормами и правилами СП 52.13330 различают три основных вида естественного освещения:</w:t>
       </w:r>
     </w:p>
     <w:p>
       <w:pPr>
-        <w:spacing w:before="120" w:after="40" w:line="276" w:lineRule="auto"/>
+        <w:spacing w:line="360" w:lineRule="auto" w:before="0" w:after="80"/>
+        <w:ind w:firstLine="709"/>
+        <w:jc w:val="both"/>
+      </w:pPr>
+      <w:r>
+        <w:rPr>
+          <w:rFonts w:ascii="Times New Roman" w:hAnsi="Times New Roman"/>
+          <w:b w:val="0"/>
+          <w:i w:val="0"/>
+          <w:color w:val="000000"/>
+          <w:sz w:val="28"/>
+        </w:rPr>
+        <w:t>1) Боковое освещение – осуществляется через световые проемы (окна) в наружных стенах здания. Подразделяется на одностороннее (окна расположены в одной наружной стене) и двустороннее (окна расположены в двух противоположных или смежных наружных стенах);</w:t>
+      </w:r>
+    </w:p>
+    <w:p>
+      <w:pPr>
+        <w:spacing w:line="360" w:lineRule="auto" w:before="0" w:after="80"/>
+        <w:ind w:firstLine="709"/>
+        <w:jc w:val="both"/>
+      </w:pPr>
+      <w:r>
+        <w:rPr>
+          <w:rFonts w:ascii="Times New Roman" w:hAnsi="Times New Roman"/>
+          <w:b w:val="0"/>
+          <w:i w:val="0"/>
+          <w:color w:val="000000"/>
+          <w:sz w:val="28"/>
+        </w:rPr>
+        <w:t>2) Верхнее освещение – осуществляется через световые фонари (зенитные, шедовые, аэрационные) в покрытиях зданий, а также через проемы в перекрытиях верхних этажей;</w:t>
+      </w:r>
+    </w:p>
+    <w:p>
+      <w:pPr>
+        <w:spacing w:line="360" w:lineRule="auto" w:before="0" w:after="80"/>
+        <w:ind w:firstLine="709"/>
+        <w:jc w:val="both"/>
+      </w:pPr>
+      <w:r>
+        <w:rPr>
+          <w:rFonts w:ascii="Times New Roman" w:hAnsi="Times New Roman"/>
+          <w:b w:val="0"/>
+          <w:i w:val="0"/>
+          <w:color w:val="000000"/>
+          <w:sz w:val="28"/>
+        </w:rPr>
+        <w:t>3) Комбинированное (смешанное) освещение – представляет собой сочетание бокового и верхнего естественного освещения, обеспечивающее наилучшую освещенность и равномерность в производственных помещениях больших геометрических размеров.</w:t>
+      </w:r>
+    </w:p>
+    <w:p>
+      <w:pPr>
+        <w:spacing w:line="360" w:lineRule="auto" w:before="120" w:after="40"/>
+        <w:ind w:firstLine="709"/>
+        <w:jc w:val="both"/>
       </w:pPr>
       <w:r>
         <w:rPr>
           <w:rFonts w:ascii="Times New Roman" w:hAnsi="Times New Roman"/>
           <w:b/>
-          <w:color w:val="182B49"/>
-          <w:sz w:val="24"/>
+          <w:i w:val="0"/>
+          <w:color w:val="000000"/>
+          <w:sz w:val="28"/>
         </w:rPr>
-        <w:t>Вопрос 3: Какие требования предъявляются к системам производственного освещения?</w:t>
+        <w:t>3. Какие требования предъявляются к системам производственного освещения?</w:t>
       </w:r>
     </w:p>
     <w:p>
       <w:pPr>
-        <w:spacing w:before="0" w:after="160" w:line="276" w:lineRule="auto"/>
-        <w:ind w:firstLine="706"/>
+        <w:spacing w:line="360" w:lineRule="auto" w:before="0" w:after="80"/>
+        <w:ind w:firstLine="709"/>
         <w:jc w:val="both"/>
       </w:pPr>
       <w:r>
         <w:rPr>
           <w:rFonts w:ascii="Times New Roman" w:hAnsi="Times New Roman"/>
-          <w:sz w:val="22"/>
+          <w:b w:val="0"/>
+          <w:i w:val="0"/>
+          <w:color w:val="000000"/>
+          <w:sz w:val="28"/>
         </w:rPr>
-        <w:t>Ответ: К производственному освещению предъявляются следующие обязательные санитарно-гигиенические и технико-экономические требования:</w:t>
-        <w:br/>
-        <w:t>• Обеспечение нормативного уровня освещенности на рабочих поверхностях в соответствии с разрядом зрительной работы;</w:t>
-        <w:br/>
-        <w:t>• Равномерное распределение яркости в поле зрения и исключение резких теней на рабочих местах;</w:t>
-        <w:br/>
-        <w:t>• Отсутствие прямой и отраженной слепящей блесткости (ограничение показателя ослепленности);</w:t>
-        <w:br/>
-        <w:t>• Постоянство освещенности во времени (отсутствие стробоскопического эффекта и пульсаций светового потока);</w:t>
-        <w:br/>
-        <w:t>• Обеспечение правильной цветопередачи и спектрального состава света, близкого к естественному;</w:t>
-        <w:br/>
-        <w:t>• Пожаро- и электробезопасность осветительных установок, надежность, удобство эксплуатации и энергоэффективность.</w:t>
+        <w:t>К системам производственного освещения предъявляются следующие обязательные требования:</w:t>
       </w:r>
     </w:p>
     <w:p>
       <w:pPr>
-        <w:spacing w:before="120" w:after="40" w:line="276" w:lineRule="auto"/>
+        <w:spacing w:line="360" w:lineRule="auto" w:before="0" w:after="80"/>
+        <w:ind w:firstLine="709"/>
+        <w:jc w:val="both"/>
+      </w:pPr>
+      <w:r>
+        <w:rPr>
+          <w:rFonts w:ascii="Times New Roman" w:hAnsi="Times New Roman"/>
+          <w:b w:val="0"/>
+          <w:i w:val="0"/>
+          <w:color w:val="000000"/>
+          <w:sz w:val="28"/>
+        </w:rPr>
+        <w:t>• Освещенность на рабочих местах должна строго соответствовать установленным санитарным нормам для данного разряда зрительной работы;</w:t>
+      </w:r>
+    </w:p>
+    <w:p>
+      <w:pPr>
+        <w:spacing w:line="360" w:lineRule="auto" w:before="0" w:after="80"/>
+        <w:ind w:firstLine="709"/>
+        <w:jc w:val="both"/>
+      </w:pPr>
+      <w:r>
+        <w:rPr>
+          <w:rFonts w:ascii="Times New Roman" w:hAnsi="Times New Roman"/>
+          <w:b w:val="0"/>
+          <w:i w:val="0"/>
+          <w:color w:val="000000"/>
+          <w:sz w:val="28"/>
+        </w:rPr>
+        <w:t>• Обеспечение постоянства освещенности во времени, исключение пульсаций светового потока и стробоскопического эффекта при работе вращающихся механизмов;</w:t>
+      </w:r>
+    </w:p>
+    <w:p>
+      <w:pPr>
+        <w:spacing w:line="360" w:lineRule="auto" w:before="0" w:after="80"/>
+        <w:ind w:firstLine="709"/>
+        <w:jc w:val="both"/>
+      </w:pPr>
+      <w:r>
+        <w:rPr>
+          <w:rFonts w:ascii="Times New Roman" w:hAnsi="Times New Roman"/>
+          <w:b w:val="0"/>
+          <w:i w:val="0"/>
+          <w:color w:val="000000"/>
+          <w:sz w:val="28"/>
+        </w:rPr>
+        <w:t>• Равномерное распределение яркости в поле зрения и ограничение слепящего действия (устранение прямой и отраженной блесткости);</w:t>
+      </w:r>
+    </w:p>
+    <w:p>
+      <w:pPr>
+        <w:spacing w:line="360" w:lineRule="auto" w:before="0" w:after="80"/>
+        <w:ind w:firstLine="709"/>
+        <w:jc w:val="both"/>
+      </w:pPr>
+      <w:r>
+        <w:rPr>
+          <w:rFonts w:ascii="Times New Roman" w:hAnsi="Times New Roman"/>
+          <w:b w:val="0"/>
+          <w:i w:val="0"/>
+          <w:color w:val="000000"/>
+          <w:sz w:val="28"/>
+        </w:rPr>
+        <w:t>• Обеспечение благоприятного спектрального состава света, максимально приближенного к естественному дневному;</w:t>
+      </w:r>
+    </w:p>
+    <w:p>
+      <w:pPr>
+        <w:spacing w:line="360" w:lineRule="auto" w:before="0" w:after="80"/>
+        <w:ind w:firstLine="709"/>
+        <w:jc w:val="both"/>
+      </w:pPr>
+      <w:r>
+        <w:rPr>
+          <w:rFonts w:ascii="Times New Roman" w:hAnsi="Times New Roman"/>
+          <w:b w:val="0"/>
+          <w:i w:val="0"/>
+          <w:color w:val="000000"/>
+          <w:sz w:val="28"/>
+        </w:rPr>
+        <w:t>• Отсутствие глубоких и резких теней на рабочих поверхностях оборудования;</w:t>
+      </w:r>
+    </w:p>
+    <w:p>
+      <w:pPr>
+        <w:spacing w:line="360" w:lineRule="auto" w:before="0" w:after="80"/>
+        <w:ind w:firstLine="709"/>
+        <w:jc w:val="both"/>
+      </w:pPr>
+      <w:r>
+        <w:rPr>
+          <w:rFonts w:ascii="Times New Roman" w:hAnsi="Times New Roman"/>
+          <w:b w:val="0"/>
+          <w:i w:val="0"/>
+          <w:color w:val="000000"/>
+          <w:sz w:val="28"/>
+        </w:rPr>
+        <w:t>• Электро-, пожаро- и взрывобезопасность осветительных установок, надежность и простота обслуживания.</w:t>
+      </w:r>
+    </w:p>
+    <w:p>
+      <w:pPr>
+        <w:spacing w:line="360" w:lineRule="auto" w:before="120" w:after="40"/>
+        <w:ind w:firstLine="709"/>
+        <w:jc w:val="both"/>
       </w:pPr>
       <w:r>
         <w:rPr>
           <w:rFonts w:ascii="Times New Roman" w:hAnsi="Times New Roman"/>
           <w:b/>
-          <w:color w:val="182B49"/>
-          <w:sz w:val="24"/>
+          <w:i w:val="0"/>
+          <w:color w:val="000000"/>
+          <w:sz w:val="28"/>
         </w:rPr>
-        <w:t>Вопрос 4: По каким параметрам определяется разряд зрительной работы?</w:t>
+        <w:t>4. По каким параметрам определяется разряд зрительной работы?</w:t>
       </w:r>
     </w:p>
     <w:p>
       <w:pPr>
-        <w:spacing w:before="0" w:after="160" w:line="276" w:lineRule="auto"/>
-        <w:ind w:firstLine="706"/>
+        <w:spacing w:line="360" w:lineRule="auto" w:before="0" w:after="80"/>
+        <w:ind w:firstLine="709"/>
         <w:jc w:val="both"/>
       </w:pPr>
       <w:r>
         <w:rPr>
           <w:rFonts w:ascii="Times New Roman" w:hAnsi="Times New Roman"/>
-          <w:sz w:val="22"/>
+          <w:b w:val="0"/>
+          <w:i w:val="0"/>
+          <w:color w:val="000000"/>
+          <w:sz w:val="28"/>
         </w:rPr>
-        <w:t>Ответ: Разряд зрительной работы определяется по СП 52.13330 (СНиП 23-05-95) исходя из следующих параметров:</w:t>
-        <w:br/>
-        <w:t>1. Наименьший эквивалентный размер объекта различения (в миллиметрах). Например: до 0,15 мм — разряд I (наивысшая точность); от 0,15 до 0,3 мм — разряд II (очень высокая точность); от 0,3 до 0,5 мм — разряд III (высокая точность, как в варианте 6); от 0,5 до 1 мм — разряд IV (средняя точность); более 5 мм — разряд VI (грубая работа).</w:t>
-        <w:br/>
-        <w:t>2. Контраст объекта различения с фоном (малый, средний, большой), определяемый соотношением яркостей объекта и фона.</w:t>
-        <w:br/>
-        <w:t>3. Характеристика фона (светлый, средний, темный) в зависимости от коэффициента отражения поверхности фона.</w:t>
+        <w:t>Разряд зрительной работы определяется в соответствии с нормативными таблицами СП 52.13330 (СНиП 23-05-95) по следующим основным критериям:</w:t>
       </w:r>
     </w:p>
     <w:p>
       <w:pPr>
-        <w:spacing w:before="120" w:after="40" w:line="276" w:lineRule="auto"/>
+        <w:spacing w:line="360" w:lineRule="auto" w:before="0" w:after="80"/>
+        <w:ind w:firstLine="709"/>
+        <w:jc w:val="both"/>
+      </w:pPr>
+      <w:r>
+        <w:rPr>
+          <w:rFonts w:ascii="Times New Roman" w:hAnsi="Times New Roman"/>
+          <w:b w:val="0"/>
+          <w:i w:val="0"/>
+          <w:color w:val="000000"/>
+          <w:sz w:val="28"/>
+        </w:rPr>
+        <w:t>1) Наименьший эквивалентный размер объекта различения (в миллиметрах). Установлены разряды от I (наивысшая точность, размер объекта менее 0,15 мм) до VI (грубая работа, объект более 5 мм);</w:t>
+      </w:r>
+    </w:p>
+    <w:p>
+      <w:pPr>
+        <w:spacing w:line="360" w:lineRule="auto" w:before="0" w:after="80"/>
+        <w:ind w:firstLine="709"/>
+        <w:jc w:val="both"/>
+      </w:pPr>
+      <w:r>
+        <w:rPr>
+          <w:rFonts w:ascii="Times New Roman" w:hAnsi="Times New Roman"/>
+          <w:b w:val="0"/>
+          <w:i w:val="0"/>
+          <w:color w:val="000000"/>
+          <w:sz w:val="28"/>
+        </w:rPr>
+        <w:t>2) Контраст объекта различения с фоном, вычисляемый по формуле K = |B_о - B_ф| / B_ф (различают большой контраст при K &gt; 0,5, средний при K = 0,2...0,5 и малый при K &lt; 0,2);</w:t>
+      </w:r>
+    </w:p>
+    <w:p>
+      <w:pPr>
+        <w:spacing w:line="360" w:lineRule="auto" w:before="0" w:after="80"/>
+        <w:ind w:firstLine="709"/>
+        <w:jc w:val="both"/>
+      </w:pPr>
+      <w:r>
+        <w:rPr>
+          <w:rFonts w:ascii="Times New Roman" w:hAnsi="Times New Roman"/>
+          <w:b w:val="0"/>
+          <w:i w:val="0"/>
+          <w:color w:val="000000"/>
+          <w:sz w:val="28"/>
+        </w:rPr>
+        <w:t>3) Характеристика фона (светлый при коэффициенте отражения фона ρ &gt; 0,4, средний при ρ = 0,2...0,4 и темный при ρ &lt; 0,2).</w:t>
+      </w:r>
+    </w:p>
+    <w:p>
+      <w:pPr>
+        <w:spacing w:line="360" w:lineRule="auto" w:before="120" w:after="40"/>
+        <w:ind w:firstLine="709"/>
+        <w:jc w:val="both"/>
       </w:pPr>
       <w:r>
         <w:rPr>
           <w:rFonts w:ascii="Times New Roman" w:hAnsi="Times New Roman"/>
           <w:b/>
-          <w:color w:val="182B49"/>
-          <w:sz w:val="24"/>
+          <w:i w:val="0"/>
+          <w:color w:val="000000"/>
+          <w:sz w:val="28"/>
         </w:rPr>
-        <w:t>Вопрос 5: Что характеризует «спектральная видность», в чем заключается ее особенность? Энергетические и фотометрические величины.</w:t>
+        <w:t>5. Что характеризует «спектральная видность», в чем заключается ее особенность? Энергетические и фотометрические величины.</w:t>
       </w:r>
     </w:p>
     <w:p>
       <w:pPr>
-        <w:spacing w:before="0" w:after="160" w:line="276" w:lineRule="auto"/>
-        <w:ind w:firstLine="706"/>
+        <w:spacing w:line="360" w:lineRule="auto" w:before="0" w:after="80"/>
+        <w:ind w:firstLine="709"/>
         <w:jc w:val="both"/>
       </w:pPr>
       <w:r>
         <w:rPr>
           <w:rFonts w:ascii="Times New Roman" w:hAnsi="Times New Roman"/>
-          <w:sz w:val="22"/>
+          <w:b w:val="0"/>
+          <w:i w:val="0"/>
+          <w:color w:val="000000"/>
+          <w:sz w:val="28"/>
         </w:rPr>
-        <w:t>Ответ: Спектральная чувствительность глаза (относительная спектральная световая эффективность, или спектральная видность V(λ)) характеризует избирательную чувствительность человеческого зрительного анализатора к электромагнитному излучению различных длин волн оптического диапазона при одинаковой мощности лучистого потока.</w:t>
-        <w:br/>
-        <w:t>Особенность: максимум чувствительности глаза в условиях дневного (колбочкового) зрения приходится на длину волны λ = 555 нм (желто-зеленая область спектра). При сумеречном (палочковом) зрении максимум сдвигается в сине-зеленую область (λ = 507 нм, эффект Пуркинье).</w:t>
-        <w:br/>
-        <w:t>Связь величин:</w:t>
-        <w:br/>
-        <w:t>• Энергетические величины характеризуют излучение безотносительно зрительного восприятия человека в абсолютных энергетических единицах (поток излучения Ф_е в ваттах Вт, энергетическая светимость Вт/м², энергетическая яркость Вт/(ср·м²)).</w:t>
-        <w:br/>
-        <w:t>• Фотометрические (световые) величины оценивают воздействие оптического излучения на орган зрения с учетом спектральной чувствительности V(λ): световой поток Ф измеряется в люменах (лм), освещенность E — в люксах (лк = лм/м²), сила света I — в канделах (кд), яркость L — в кд/м².</w:t>
+        <w:t>Спектральная чувствительность органа зрения (спектральная видность, или функция V(λ)) характеризует избирательную чувствительность человеческого глаза к электромагнитному излучению различных длин волн оптического диапазона при одинаковой мощности светового потока.</w:t>
       </w:r>
     </w:p>
     <w:p>
       <w:pPr>
-        <w:spacing w:before="240" w:after="120" w:line="276" w:lineRule="auto"/>
+        <w:spacing w:line="360" w:lineRule="auto" w:before="0" w:after="80"/>
+        <w:ind w:firstLine="709"/>
+        <w:jc w:val="both"/>
+      </w:pPr>
+      <w:r>
+        <w:rPr>
+          <w:rFonts w:ascii="Times New Roman" w:hAnsi="Times New Roman"/>
+          <w:b w:val="0"/>
+          <w:i w:val="0"/>
+          <w:color w:val="000000"/>
+          <w:sz w:val="28"/>
+        </w:rPr>
+        <w:t>Особенность заключается в том, что в условиях дневного (колбочкового) зрения максимум чувствительности человеческого глаза соответствует длине волны λ = 555 нм (желто-зеленая часть спектра). В условиях ночного или сумеречного (палочкового) зрения максимум чувствительности смещается в сторону более коротких волн к значению λ = 507 нм (явление Пуркинье).</w:t>
+      </w:r>
+    </w:p>
+    <w:p>
+      <w:pPr>
+        <w:spacing w:line="360" w:lineRule="auto" w:before="0" w:after="80"/>
+        <w:ind w:firstLine="709"/>
+        <w:jc w:val="both"/>
+      </w:pPr>
+      <w:r>
+        <w:rPr>
+          <w:rFonts w:ascii="Times New Roman" w:hAnsi="Times New Roman"/>
+          <w:b w:val="0"/>
+          <w:i w:val="0"/>
+          <w:color w:val="000000"/>
+          <w:sz w:val="28"/>
+        </w:rPr>
+        <w:t>Различие величин:</w:t>
+      </w:r>
+    </w:p>
+    <w:p>
+      <w:pPr>
+        <w:spacing w:line="360" w:lineRule="auto" w:before="0" w:after="80"/>
+        <w:ind w:firstLine="709"/>
+        <w:jc w:val="both"/>
+      </w:pPr>
+      <w:r>
+        <w:rPr>
+          <w:rFonts w:ascii="Times New Roman" w:hAnsi="Times New Roman"/>
+          <w:b w:val="0"/>
+          <w:i w:val="0"/>
+          <w:color w:val="000000"/>
+          <w:sz w:val="28"/>
+        </w:rPr>
+        <w:t>• Энергетические величины характеризуют излучение чисто физически независимо от зрительного восприятия человека: лучистый поток Ф_e (ватт, Вт), энергетическая освещенность (облученность, Вт/м²), сила излучения (Вт/ср), энергетическая яркость (Вт/(ср·м²));</w:t>
+      </w:r>
+    </w:p>
+    <w:p>
+      <w:pPr>
+        <w:spacing w:line="360" w:lineRule="auto" w:before="0" w:after="80"/>
+        <w:ind w:firstLine="709"/>
+        <w:jc w:val="both"/>
+      </w:pPr>
+      <w:r>
+        <w:rPr>
+          <w:rFonts w:ascii="Times New Roman" w:hAnsi="Times New Roman"/>
+          <w:b w:val="0"/>
+          <w:i w:val="0"/>
+          <w:color w:val="000000"/>
+          <w:sz w:val="28"/>
+        </w:rPr>
+        <w:t>• Фотометрические (световые) величины оценивают излучение по его зрительному воздействию с учетом спектральной видности глаза: световой поток Ф (люмен, лм), освещенность E (люкс, лк), сила света I (кандела, кд), яркость L (кд/м²).</w:t>
+      </w:r>
+    </w:p>
+    <w:p>
+      <w:pPr>
+        <w:keepNext/>
+        <w:spacing w:line="360" w:lineRule="auto" w:before="240" w:after="120"/>
+        <w:ind w:firstLine="709"/>
         <w:jc w:val="left"/>
       </w:pPr>
       <w:r>
         <w:rPr>
           <w:rFonts w:ascii="Times New Roman" w:hAnsi="Times New Roman"/>
           <w:b/>
-          <w:color w:val="182B49"/>
-          <w:sz w:val="32"/>
+          <w:color w:val="000000"/>
+          <w:sz w:val="28"/>
         </w:rPr>
-        <w:t>6. Выводы</w:t>
+        <w:t>6 Выводы</w:t>
       </w:r>
     </w:p>
     <w:p>
       <w:pPr>
-        <w:spacing w:before="0" w:after="120" w:line="276" w:lineRule="auto"/>
-        <w:ind w:firstLine="706"/>
+        <w:spacing w:line="360" w:lineRule="auto" w:before="0" w:after="0"/>
+        <w:ind w:firstLine="709"/>
         <w:jc w:val="both"/>
       </w:pPr>
       <w:r>
         <w:rPr>
           <w:rFonts w:ascii="Times New Roman" w:hAnsi="Times New Roman"/>
-          <w:sz w:val="24"/>
+          <w:b w:val="0"/>
+          <w:i w:val="0"/>
+          <w:color w:val="000000"/>
+          <w:sz w:val="28"/>
         </w:rPr>
-        <w:t>1. В ходе выполнения лабораторной работы № 1 освоена методика расчета систем естественного освещения производственных помещений связи и IT-инфраструктуры по СП 52.13330 (СНиП 23-05-95).</w:t>
-        <w:br/>
-        <w:t>2. Для аппаратного зала телеграфа размерами 20 × 10 × 5 м (III разряд зрительной работы, КЕО l_min = 2,0%) выполнен полный пошаговый расчет световых параметров с учетом затенения противостоящим зданием (K_зд = 1.40), светопропускания окон (r0 = 0.40) и отражающих свойств поверхностей (ρ_ср = 38.6%, r1 = 2.86).</w:t>
-        <w:br/>
-        <w:t>3. Расчет показал, что для одностороннего бокового освещения требуемая площадь остекления составляет S0 = 81.20 м², что соответствует n = 12 окнам шириной по 2,0 м. Суммарная ширина оконных проемов (24.0 м) превышает длину стены здания (20,0 м), что делает одностороннюю схему физически нереализуемой (b = -0.31 м &lt; 0).</w:t>
-        <w:br/>
-        <w:t>4. Предложено рациональное инженерное решение: перейти на двустороннее боковое освещение. При двусторонней схеме (r1 = 1.63) требуемая площадь окон составляет S0 = 87.81 м², что реализуется установкой 14 окон (по 7 окон на каждой продольной стене). Межоконный промежуток составляет b = 0.75 м, что обеспечивает конструктивную прочность простенков, высокую равномерность естественной освещенности рабочих мест и соблюдение требований охраны труда.</w:t>
+        <w:t>1. В ходе выполнения лабораторной работы изучены нормативные положения СП 52.13330 (СНиП 23-05-95) и освоена инженерная методика расчета естественного освещения производственных помещений связи.</w:t>
       </w:r>
     </w:p>
     <w:p>
       <w:pPr>
-        <w:spacing w:before="240" w:after="120" w:line="276" w:lineRule="auto"/>
+        <w:spacing w:line="360" w:lineRule="auto" w:before="0" w:after="0"/>
+        <w:ind w:firstLine="709"/>
+        <w:jc w:val="both"/>
+      </w:pPr>
+      <w:r>
+        <w:rPr>
+          <w:rFonts w:ascii="Times New Roman" w:hAnsi="Times New Roman"/>
+          <w:b w:val="0"/>
+          <w:i w:val="0"/>
+          <w:color w:val="000000"/>
+          <w:sz w:val="28"/>
+        </w:rPr>
+        <w:t>2. Для аппаратного зала размерами 20,0 × 10,0 × 5,0 м (III разряд зрительной работы, нормированный КЕО l_min = 2,0 %) рассчитаны геометрические параметры (h1 = 3,50 м, A / B = 2,00, B / h1 = 2,86, L / H = 1,00) и определены нормативные коэффициенты (η0 = 16,57, K_зд = 1,40, r0 = 0,40, ρ_ср = 38,6 %, r1 = 2,86).</w:t>
+      </w:r>
+    </w:p>
+    <w:p>
+      <w:pPr>
+        <w:spacing w:line="360" w:lineRule="auto" w:before="0" w:after="0"/>
+        <w:ind w:firstLine="709"/>
+        <w:jc w:val="both"/>
+      </w:pPr>
+      <w:r>
+        <w:rPr>
+          <w:rFonts w:ascii="Times New Roman" w:hAnsi="Times New Roman"/>
+          <w:b w:val="0"/>
+          <w:i w:val="0"/>
+          <w:color w:val="000000"/>
+          <w:sz w:val="28"/>
+        </w:rPr>
+        <w:t>3. Расчет односторонней схемы освещения показал, что требуемая площадь остекления составляет S0 = 81,11 м², что соответствует установке 12 оконных проемов размером 3,5 × 2,0 м. При общей ширине окон 24,0 м они физически не помещаются на наружной стене длиной 20,0 м (межоконный промежуток b = -0,31 м &lt; 0).</w:t>
+      </w:r>
+    </w:p>
+    <w:p>
+      <w:pPr>
+        <w:spacing w:line="360" w:lineRule="auto" w:before="0" w:after="0"/>
+        <w:ind w:firstLine="709"/>
+        <w:jc w:val="both"/>
+      </w:pPr>
+      <w:r>
+        <w:rPr>
+          <w:rFonts w:ascii="Times New Roman" w:hAnsi="Times New Roman"/>
+          <w:b w:val="0"/>
+          <w:i w:val="0"/>
+          <w:color w:val="000000"/>
+          <w:sz w:val="28"/>
+        </w:rPr>
+        <w:t>4. Разработано рациональное инженерное решение по переходу на двустороннее боковое освещение. При двусторонней схеме (r1 = 1,70, η0 = 10,00) требуемая площадь остекления составляет 82,35 м² (12 окон). Размещение по 6 окон на двух противоположных продольных стенах обеспечивает оптимальный шаг простенков b = 1,14 м, достаточную несущую способность строительных конструкций и равномерное распределение светового потока по всей глубине зала без образования теневых зон.</w:t>
+      </w:r>
+    </w:p>
+    <w:p>
+      <w:pPr>
+        <w:keepNext/>
+        <w:spacing w:line="360" w:lineRule="auto" w:before="240" w:after="120"/>
+        <w:ind w:firstLine="709"/>
         <w:jc w:val="left"/>
       </w:pPr>
       <w:r>
         <w:rPr>
           <w:rFonts w:ascii="Times New Roman" w:hAnsi="Times New Roman"/>
           <w:b/>
-          <w:color w:val="182B49"/>
-          <w:sz w:val="32"/>
+          <w:color w:val="000000"/>
+          <w:sz w:val="28"/>
         </w:rPr>
-        <w:t>7. Список использованных источников</w:t>
+        <w:t>7 Список использованных источников</w:t>
       </w:r>
     </w:p>
     <w:p>
       <w:pPr>
-        <w:spacing w:before="40" w:after="80" w:line="276" w:lineRule="auto"/>
-        <w:ind w:firstLine="706"/>
+        <w:spacing w:line="360" w:lineRule="auto" w:before="40" w:after="40"/>
+        <w:ind w:firstLine="709"/>
         <w:jc w:val="both"/>
       </w:pPr>
       <w:r>
         <w:rPr>
           <w:rFonts w:ascii="Times New Roman" w:hAnsi="Times New Roman"/>
-          <w:sz w:val="22"/>
+          <w:b w:val="0"/>
+          <w:i w:val="0"/>
+          <w:color w:val="000000"/>
+          <w:sz w:val="28"/>
         </w:rPr>
-        <w:t>1. Курбатов В.А. Расчёт естественной освещённости в производственном помещении: Учебно-методическое пособие по курсу «Безопасность жизнедеятельности» / В.А. Курбатов. — М.: МТУСИ, 2022. — 24 с.</w:t>
+        <w:t>1. Курбатов В.А. Расчет естественной освещенности в производственном помещении: Учебно-методическое пособие по курсу «Безопасность жизнедеятельности» / В.А. Курбатов. – М.: МТУСИ, 2022. – 24 с.</w:t>
       </w:r>
     </w:p>
     <w:p>
       <w:pPr>
-        <w:spacing w:before="40" w:after="80" w:line="276" w:lineRule="auto"/>
-        <w:ind w:firstLine="706"/>
+        <w:spacing w:line="360" w:lineRule="auto" w:before="40" w:after="40"/>
+        <w:ind w:firstLine="709"/>
         <w:jc w:val="both"/>
       </w:pPr>
       <w:r>
         <w:rPr>
           <w:rFonts w:ascii="Times New Roman" w:hAnsi="Times New Roman"/>
-          <w:sz w:val="22"/>
+          <w:b w:val="0"/>
+          <w:i w:val="0"/>
+          <w:color w:val="000000"/>
+          <w:sz w:val="28"/>
         </w:rPr>
-        <w:t>2. СП 52.13330.2016. Естественное и искусственное освещение. Актуализированная редакция СНиП 23-05-95*. — М.: Минстрой России, 2016.</w:t>
+        <w:t>2. СП 52.13330.2016. Естественное и искусственное освещение. Актуализированная редакция СНиП 23-05-95*. – М.: Минстрой России, 2016. – 118 с.</w:t>
       </w:r>
     </w:p>
     <w:p>
       <w:pPr>
-        <w:spacing w:before="40" w:after="80" w:line="276" w:lineRule="auto"/>
-        <w:ind w:firstLine="706"/>
+        <w:spacing w:line="360" w:lineRule="auto" w:before="40" w:after="40"/>
+        <w:ind w:firstLine="709"/>
         <w:jc w:val="both"/>
       </w:pPr>
       <w:r>
         <w:rPr>
           <w:rFonts w:ascii="Times New Roman" w:hAnsi="Times New Roman"/>
-          <w:sz w:val="22"/>
+          <w:b w:val="0"/>
+          <w:i w:val="0"/>
+          <w:color w:val="000000"/>
+          <w:sz w:val="28"/>
         </w:rPr>
-        <w:t>3. СанПиН 1.2.3685-21. Гигиенические нормативы и требования к обеспечению безопасности и (или) безвредности для человека факторов среды обитания.</w:t>
+        <w:t>3. СанПиН 1.2.3685-21. Гигиенические нормативы и требования к обеспечению безопасности и (или) безвредности для человека факторов среды обитания. – М.: Федеральный центр гигиены и эпидемиологии Роспотребнадзора, 2021. – 472 с.</w:t>
       </w:r>
     </w:p>
     <w:p>
       <w:pPr>
-        <w:spacing w:before="40" w:after="80" w:line="276" w:lineRule="auto"/>
-        <w:ind w:firstLine="706"/>
+        <w:spacing w:line="360" w:lineRule="auto" w:before="40" w:after="40"/>
+        <w:ind w:firstLine="709"/>
         <w:jc w:val="both"/>
       </w:pPr>
       <w:r>
         <w:rPr>
           <w:rFonts w:ascii="Times New Roman" w:hAnsi="Times New Roman"/>
-          <w:sz w:val="22"/>
+          <w:b w:val="0"/>
+          <w:i w:val="0"/>
+          <w:color w:val="000000"/>
+          <w:sz w:val="28"/>
         </w:rPr>
-        <w:t>4. ГОСТ 12.1.046-2014. Система стандартов безопасности труда. Строительство. Нормы освещения строительных площадок.</w:t>
+        <w:t>4. ГОСТ 12.1.046-2014. Система стандартов безопасности труда. Строительство. Нормы освещения строительных площадок. – М.: Стандартинформ, 2015. – 12 с.</w:t>
       </w:r>
     </w:p>
     <w:p>
       <w:pPr>
-        <w:spacing w:before="40" w:after="80" w:line="276" w:lineRule="auto"/>
-        <w:ind w:firstLine="706"/>
+        <w:spacing w:line="360" w:lineRule="auto" w:before="40" w:after="40"/>
+        <w:ind w:firstLine="709"/>
         <w:jc w:val="both"/>
       </w:pPr>
       <w:r>
         <w:rPr>
           <w:rFonts w:ascii="Times New Roman" w:hAnsi="Times New Roman"/>
-          <w:sz w:val="22"/>
+          <w:b w:val="0"/>
+          <w:i w:val="0"/>
+          <w:color w:val="000000"/>
+          <w:sz w:val="28"/>
         </w:rPr>
-        <w:t>5. ГОСТ 7.32-2017. Система стандартов по информации, библиотечному и издательскому делу. Отчет о научно-исследовательской работе. Структура и правила оформления.</w:t>
+        <w:t>5. ГОСТ 7.32-2017. Система стандартов по информации, библиотечному и издательскому делу. Отчет о научно-исследовательской работе. Структура и правила оформления. – М.: Стандартинформ, 2017. – 28 с.</w:t>
       </w:r>
     </w:p>
     <w:sectPr>
       <w:pgSz w:w="12240" w:h="15840"/>
-      <w:pgMar w:top="1138" w:right="850" w:bottom="1138" w:left="1699" w:header="720" w:footer="720" w:gutter="0"/>
+      <w:pgMar w:top="1134" w:right="850" w:bottom="1134" w:left="1701" w:header="567" w:footer="567" w:gutter="0"/>
       <w:cols w:space="720"/>
       <w:docGrid w:linePitch="360"/>
     </w:sectPr>

</xml_diff>

<commit_message>
fix(lab-01): clean formatting and remove \n escape artifacts strictly by GOST 7.32
</commit_message>
<xml_diff>
--- a/information-ecology/lab-01-natural-lighting/docs/Отчет_ЛР1_Смирнов_БСТ2556.docx
+++ b/information-ecology/lab-01-natural-lighting/docs/Отчет_ЛР1_Смирнов_БСТ2556.docx
@@ -4,7 +4,7 @@
   <w:body>
     <w:p>
       <w:pPr>
-        <w:spacing w:line="360" w:lineRule="auto" w:before="0" w:after="40"/>
+        <w:spacing w:line="264" w:lineRule="auto" w:before="0" w:after="20"/>
         <w:ind w:firstLine="0"/>
         <w:jc w:val="center"/>
       </w:pPr>
@@ -16,12 +16,29 @@
           <w:color w:val="000000"/>
           <w:sz w:val="22"/>
         </w:rPr>
-        <w:t>МИНИСТЕРСТВО ЦИФРОВОГО РАЗВИТИЯ, СВЯЗИ И МАССОВЫХ КОММУНИКАЦИЙ РОССИЙСКОЙ ФЕДЕРАЦИИ</w:t>
+        <w:t>МИНИСТЕРСТВО ЦИФРОВОГО РАЗВИТИЯ, СВЯЗИ И МАССОВЫХ КОММУНИКАЦИЙ</w:t>
       </w:r>
     </w:p>
     <w:p>
       <w:pPr>
-        <w:spacing w:line="360" w:lineRule="auto" w:before="0" w:after="40"/>
+        <w:spacing w:line="264" w:lineRule="auto" w:before="0" w:after="40"/>
+        <w:ind w:firstLine="0"/>
+        <w:jc w:val="center"/>
+      </w:pPr>
+      <w:r>
+        <w:rPr>
+          <w:rFonts w:ascii="Times New Roman" w:hAnsi="Times New Roman"/>
+          <w:b/>
+          <w:i w:val="0"/>
+          <w:color w:val="000000"/>
+          <w:sz w:val="22"/>
+        </w:rPr>
+        <w:t>РОССИЙСКОЙ ФЕДЕРАЦИИ</w:t>
+      </w:r>
+    </w:p>
+    <w:p>
+      <w:pPr>
+        <w:spacing w:line="264" w:lineRule="auto" w:before="0" w:after="40"/>
         <w:ind w:firstLine="0"/>
         <w:jc w:val="center"/>
       </w:pPr>
@@ -31,14 +48,14 @@
           <w:b w:val="0"/>
           <w:i w:val="0"/>
           <w:color w:val="000000"/>
-          <w:sz w:val="22"/>
+          <w:sz w:val="20"/>
         </w:rPr>
         <w:t>Ордена Трудового Красного Знамени федеральное государственное бюджетное образовательное учреждение высшего образования</w:t>
       </w:r>
     </w:p>
     <w:p>
       <w:pPr>
-        <w:spacing w:line="360" w:lineRule="auto" w:before="0" w:after="280"/>
+        <w:spacing w:line="264" w:lineRule="auto" w:before="0" w:after="360"/>
         <w:ind w:firstLine="0"/>
         <w:jc w:val="center"/>
       </w:pPr>
@@ -50,12 +67,12 @@
           <w:color w:val="000000"/>
           <w:sz w:val="24"/>
         </w:rPr>
-        <w:t>«МОСКОВСКИЙ ТЕХНИЧЕСКИЙ УНИВЕРСИТЕТ СВЯЗИ И ИНФОРМАТИКИ»</w:t>
+        <w:t>«МОСКОВСКИЙ ТЕХНИЧЕСКИЙ УНИВЕРСИТЕТ СВЯЗИ И ИНФОРМАТИКИ» (МТУСИ)</w:t>
       </w:r>
     </w:p>
     <w:p>
       <w:pPr>
-        <w:spacing w:line="360" w:lineRule="auto" w:before="0" w:after="40"/>
+        <w:spacing w:line="276" w:lineRule="auto" w:before="0" w:after="40"/>
         <w:ind w:firstLine="0"/>
         <w:jc w:val="center"/>
       </w:pPr>
@@ -72,7 +89,7 @@
     </w:p>
     <w:p>
       <w:pPr>
-        <w:spacing w:line="360" w:lineRule="auto" w:before="0" w:after="960"/>
+        <w:spacing w:line="276" w:lineRule="auto" w:before="0" w:after="1080"/>
         <w:ind w:firstLine="0"/>
         <w:jc w:val="center"/>
       </w:pPr>
@@ -84,12 +101,12 @@
           <w:color w:val="000000"/>
           <w:sz w:val="24"/>
         </w:rPr>
-        <w:t>Кафедра экологии, безопасности жизнедеятельности и электропитания</w:t>
+        <w:t>Кафедра «Экология, безопасность жизнедеятельности и электропитание»</w:t>
       </w:r>
     </w:p>
     <w:p>
       <w:pPr>
-        <w:spacing w:line="360" w:lineRule="auto" w:before="240" w:after="80"/>
+        <w:spacing w:line="276" w:lineRule="auto" w:before="360" w:after="80"/>
         <w:ind w:firstLine="0"/>
         <w:jc w:val="center"/>
       </w:pPr>
@@ -106,7 +123,7 @@
     </w:p>
     <w:p>
       <w:pPr>
-        <w:spacing w:line="360" w:lineRule="auto" w:before="0" w:after="80"/>
+        <w:spacing w:line="276" w:lineRule="auto" w:before="0" w:after="80"/>
         <w:ind w:firstLine="0"/>
         <w:jc w:val="center"/>
       </w:pPr>
@@ -123,7 +140,7 @@
     </w:p>
     <w:p>
       <w:pPr>
-        <w:spacing w:line="360" w:lineRule="auto" w:before="0" w:after="280"/>
+        <w:spacing w:line="276" w:lineRule="auto" w:before="0" w:after="240"/>
         <w:ind w:firstLine="0"/>
         <w:jc w:val="center"/>
       </w:pPr>
@@ -140,7 +157,7 @@
     </w:p>
     <w:p>
       <w:pPr>
-        <w:spacing w:line="360" w:lineRule="auto" w:before="0" w:after="80"/>
+        <w:spacing w:line="276" w:lineRule="auto" w:before="0" w:after="80"/>
         <w:ind w:firstLine="0"/>
         <w:jc w:val="center"/>
       </w:pPr>
@@ -157,7 +174,7 @@
     </w:p>
     <w:p>
       <w:pPr>
-        <w:spacing w:line="360" w:lineRule="auto" w:before="0" w:after="1280"/>
+        <w:spacing w:line="276" w:lineRule="auto" w:before="0" w:after="960"/>
         <w:ind w:firstLine="0"/>
         <w:jc w:val="center"/>
       </w:pPr>
@@ -172,24 +189,186 @@
         <w:t>(Вариант № 6)</w:t>
       </w:r>
     </w:p>
+    <w:tbl>
+      <w:tblPr>
+        <w:tblW w:type="auto" w:w="0"/>
+        <w:jc w:val="center"/>
+        <w:tblLayout w:type="fixed"/>
+        <w:tblLook w:firstColumn="1" w:firstRow="1" w:lastColumn="0" w:lastRow="0" w:noHBand="0" w:noVBand="1" w:val="04A0"/>
+        <w:tblBorders>
+          <w:top w:val="none"/>
+          <w:bottom w:val="none"/>
+          <w:left w:val="none"/>
+          <w:right w:val="none"/>
+          <w:insideH w:val="none"/>
+          <w:insideV w:val="none"/>
+        </w:tblBorders>
+      </w:tblPr>
+      <w:tblGrid>
+        <w:gridCol w:w="4252"/>
+        <w:gridCol w:w="5102"/>
+      </w:tblGrid>
+      <w:tr>
+        <w:tc>
+          <w:tcPr>
+            <w:tcW w:type="dxa" w:w="4844"/>
+          </w:tcPr>
+          <w:p/>
+        </w:tc>
+        <w:tc>
+          <w:tcPr>
+            <w:tcW w:type="dxa" w:w="4844"/>
+          </w:tcPr>
+          <w:p>
+            <w:pPr>
+              <w:spacing w:line="276" w:lineRule="auto" w:before="0" w:after="40"/>
+              <w:ind w:firstLine="0"/>
+              <w:jc w:val="left"/>
+            </w:pPr>
+            <w:r>
+              <w:rPr>
+                <w:rFonts w:ascii="Times New Roman" w:hAnsi="Times New Roman"/>
+                <w:b w:val="0"/>
+                <w:color w:val="000000"/>
+                <w:sz w:val="24"/>
+              </w:rPr>
+              <w:t>Выполнил:</w:t>
+            </w:r>
+          </w:p>
+          <w:p>
+            <w:pPr>
+              <w:spacing w:line="276" w:lineRule="auto" w:before="0" w:after="40"/>
+              <w:ind w:firstLine="0"/>
+              <w:jc w:val="left"/>
+            </w:pPr>
+            <w:r>
+              <w:rPr>
+                <w:rFonts w:ascii="Times New Roman" w:hAnsi="Times New Roman"/>
+                <w:b w:val="0"/>
+                <w:color w:val="000000"/>
+                <w:sz w:val="24"/>
+              </w:rPr>
+              <w:t>студент группы БСТ2556</w:t>
+            </w:r>
+          </w:p>
+          <w:p>
+            <w:pPr>
+              <w:spacing w:line="276" w:lineRule="auto" w:before="0" w:after="40"/>
+              <w:ind w:firstLine="0"/>
+              <w:jc w:val="left"/>
+            </w:pPr>
+            <w:r>
+              <w:rPr>
+                <w:rFonts w:ascii="Times New Roman" w:hAnsi="Times New Roman"/>
+                <w:b/>
+                <w:color w:val="000000"/>
+                <w:sz w:val="24"/>
+              </w:rPr>
+              <w:t>Смирнов Вячеслав Юрьевич</w:t>
+            </w:r>
+          </w:p>
+          <w:p>
+            <w:pPr>
+              <w:spacing w:line="276" w:lineRule="auto" w:before="0" w:after="40"/>
+              <w:ind w:firstLine="0"/>
+              <w:jc w:val="left"/>
+            </w:pPr>
+            <w:r>
+              <w:rPr>
+                <w:rFonts w:ascii="Times New Roman" w:hAnsi="Times New Roman"/>
+                <w:b w:val="0"/>
+                <w:color w:val="000000"/>
+                <w:sz w:val="24"/>
+              </w:rPr>
+              <w:t>Зачетная книжка: ЗБСТ25066</w:t>
+            </w:r>
+          </w:p>
+          <w:p>
+            <w:pPr>
+              <w:spacing w:line="276" w:lineRule="auto" w:before="0" w:after="40"/>
+              <w:ind w:firstLine="0"/>
+              <w:jc w:val="left"/>
+            </w:pPr>
+            <w:r>
+              <w:rPr>
+                <w:rFonts w:ascii="Times New Roman" w:hAnsi="Times New Roman"/>
+                <w:b w:val="0"/>
+                <w:color w:val="000000"/>
+                <w:sz w:val="24"/>
+              </w:rPr>
+              <w:t>Направление: 09.03.02 Информационные системы и технологии</w:t>
+            </w:r>
+          </w:p>
+          <w:p>
+            <w:pPr>
+              <w:spacing w:line="276" w:lineRule="auto" w:before="0" w:after="240"/>
+              <w:ind w:firstLine="0"/>
+              <w:jc w:val="left"/>
+            </w:pPr>
+            <w:r>
+              <w:rPr>
+                <w:rFonts w:ascii="Times New Roman" w:hAnsi="Times New Roman"/>
+                <w:b w:val="0"/>
+                <w:color w:val="000000"/>
+                <w:sz w:val="24"/>
+              </w:rPr>
+              <w:t>Профиль: Инженерия DevSecOps (2 курс)</w:t>
+            </w:r>
+          </w:p>
+          <w:p>
+            <w:pPr>
+              <w:spacing w:line="276" w:lineRule="auto" w:before="0" w:after="40"/>
+              <w:ind w:firstLine="0"/>
+              <w:jc w:val="left"/>
+            </w:pPr>
+            <w:r>
+              <w:rPr>
+                <w:rFonts w:ascii="Times New Roman" w:hAnsi="Times New Roman"/>
+                <w:b w:val="0"/>
+                <w:color w:val="000000"/>
+                <w:sz w:val="24"/>
+              </w:rPr>
+              <w:t>Проверил:</w:t>
+            </w:r>
+          </w:p>
+          <w:p>
+            <w:pPr>
+              <w:spacing w:line="276" w:lineRule="auto" w:before="0" w:after="40"/>
+              <w:ind w:firstLine="0"/>
+              <w:jc w:val="left"/>
+            </w:pPr>
+            <w:r>
+              <w:rPr>
+                <w:rFonts w:ascii="Times New Roman" w:hAnsi="Times New Roman"/>
+                <w:b w:val="0"/>
+                <w:color w:val="000000"/>
+                <w:sz w:val="24"/>
+              </w:rPr>
+              <w:t>доцент кафедры ЭБЖиЭ</w:t>
+            </w:r>
+          </w:p>
+          <w:p>
+            <w:pPr>
+              <w:spacing w:line="276" w:lineRule="auto" w:before="0" w:after="0"/>
+              <w:ind w:firstLine="0"/>
+              <w:jc w:val="left"/>
+            </w:pPr>
+            <w:r>
+              <w:rPr>
+                <w:rFonts w:ascii="Times New Roman" w:hAnsi="Times New Roman"/>
+                <w:b/>
+                <w:color w:val="000000"/>
+                <w:sz w:val="24"/>
+              </w:rPr>
+              <w:t>Курбатов В.А.</w:t>
+            </w:r>
+          </w:p>
+        </w:tc>
+      </w:tr>
+    </w:tbl>
     <w:p>
       <w:pPr>
-        <w:spacing w:line="312" w:lineRule="auto" w:before="480" w:after="1440"/>
-        <w:ind w:firstLine="0"/>
-        <w:jc w:val="right"/>
-      </w:pPr>
-      <w:r>
-        <w:rPr>
-          <w:rFonts w:ascii="Times New Roman" w:hAnsi="Times New Roman"/>
-          <w:color w:val="000000"/>
-          <w:sz w:val="26"/>
-        </w:rPr>
-        <w:t>Выполнил: студент группы БСТ2556\nСмирнов Вячеслав Юрьевич\nЗачетная книжка: ЗБСТ25066\nНаправление: 09.03.02 Информационные системы и технологии\nПрофиль: Инженерия DevSecOps (2 курс)\n\nПроверил: доцент кафедры ЭБЖиЭ\nКурбатов В.А.\n</w:t>
-      </w:r>
-    </w:p>
-    <w:p>
-      <w:pPr>
-        <w:spacing w:line="360" w:lineRule="auto" w:before="720" w:after="0"/>
+        <w:spacing w:line="240" w:lineRule="auto" w:before="1280" w:after="0"/>
         <w:ind w:firstLine="0"/>
         <w:jc w:val="center"/>
       </w:pPr>
@@ -212,7 +391,7 @@
     <w:p>
       <w:pPr>
         <w:keepNext/>
-        <w:spacing w:line="360" w:lineRule="auto" w:before="240" w:after="120"/>
+        <w:spacing w:line="360" w:lineRule="auto" w:before="280" w:after="120"/>
         <w:ind w:firstLine="709"/>
         <w:jc w:val="left"/>
       </w:pPr>
@@ -291,7 +470,7 @@
           <w:color w:val="000000"/>
           <w:sz w:val="28"/>
         </w:rPr>
-        <w:t>2) рассчитать геометрические параметры помещения, световых проемов и затенения противостоящим зданием;</w:t>
+        <w:t>2) рассчитать геометрические параметры помещения, световых проемов и взаимного расположения с противостоящим зданием;</w:t>
       </w:r>
     </w:p>
     <w:p>
@@ -365,7 +544,7 @@
     <w:p>
       <w:pPr>
         <w:keepNext/>
-        <w:spacing w:line="360" w:lineRule="auto" w:before="240" w:after="120"/>
+        <w:spacing w:line="360" w:lineRule="auto" w:before="280" w:after="120"/>
         <w:ind w:firstLine="709"/>
         <w:jc w:val="left"/>
       </w:pPr>
@@ -560,7 +739,7 @@
                 <w:color w:val="000000"/>
                 <w:sz w:val="24"/>
               </w:rPr>
-              <w:t>Высокая точность (объект различения 0,3–0,5 мм)</w:t>
+              <w:t>Высокая точность (размер объекта 0,3–0,5 мм)</w:t>
             </w:r>
           </w:p>
         </w:tc>
@@ -1219,7 +1398,7 @@
     <w:p>
       <w:pPr>
         <w:keepNext/>
-        <w:spacing w:line="360" w:lineRule="auto" w:before="240" w:after="120"/>
+        <w:spacing w:line="360" w:lineRule="auto" w:before="280" w:after="120"/>
         <w:ind w:firstLine="709"/>
         <w:jc w:val="left"/>
       </w:pPr>
@@ -2329,7 +2508,7 @@
                 <w:color w:val="000000"/>
                 <w:sz w:val="28"/>
               </w:rPr>
-              <w:t>ρ_ср = (0,50 · 200,0 + 0,50 · 300,0 + 0,10 · 200,0) / 700,0 = (100,0 + 150,0 + 20,0) / 700,0 = 270,0 / 700,0 = 0,3857 (38,6 %).</w:t>
+              <w:t>ρ_ср = (0,50 · 200,0 + 0,50 · 300,0 + 0,10 · 200,0) / 700,0 = 270,0 / 700,0 = 0,3857 (38,6 %).</w:t>
             </w:r>
           </w:p>
         </w:tc>
@@ -2786,7 +2965,7 @@
     <w:p>
       <w:pPr>
         <w:keepNext/>
-        <w:spacing w:line="360" w:lineRule="auto" w:before="240" w:after="120"/>
+        <w:spacing w:line="360" w:lineRule="auto" w:before="280" w:after="120"/>
         <w:ind w:firstLine="709"/>
         <w:jc w:val="left"/>
       </w:pPr>
@@ -3599,7 +3778,7 @@
     <w:p>
       <w:pPr>
         <w:keepNext/>
-        <w:spacing w:line="360" w:lineRule="auto" w:before="240" w:after="120"/>
+        <w:spacing w:line="360" w:lineRule="auto" w:before="280" w:after="120"/>
         <w:ind w:firstLine="709"/>
         <w:jc w:val="left"/>
       </w:pPr>
@@ -3615,7 +3794,7 @@
     </w:p>
     <w:p>
       <w:pPr>
-        <w:spacing w:line="360" w:lineRule="auto" w:before="120" w:after="40"/>
+        <w:spacing w:line="360" w:lineRule="auto" w:before="0" w:after="0"/>
         <w:ind w:firstLine="709"/>
         <w:jc w:val="both"/>
       </w:pPr>
@@ -3632,7 +3811,7 @@
     </w:p>
     <w:p>
       <w:pPr>
-        <w:spacing w:line="360" w:lineRule="auto" w:before="0" w:after="80"/>
+        <w:spacing w:line="360" w:lineRule="auto" w:before="0" w:after="0"/>
         <w:ind w:firstLine="709"/>
         <w:jc w:val="both"/>
       </w:pPr>
@@ -3644,46 +3823,12 @@
           <w:color w:val="000000"/>
           <w:sz w:val="28"/>
         </w:rPr>
-        <w:t>Естественная освещенность нормируется в относительных величинах посредством коэффициента естественной освещенности (КЕО), обозначаемого l (или e) и выражаемого в процентах. КЕО представляет собой процентное отношение естественной освещенности E_внут, создаваемой в расчетной точке внутри помещения светом неба (прямым или после отражений), к одновременной наружной горизонтальной освещенности E_нар, создаваемой светом полностью открытого небосвода:</w:t>
+        <w:t>Естественная освещенность нормируется в относительных величинах посредством коэффициента естественной освещенности (КЕО), обозначаемого l (или e) и выражаемого в процентах. КЕО представляет собой процентное отношение естественной освещенности E_внут, создаваемой в расчетной точке внутри помещения светом неба (прямым или после отражений), к одновременной наружной горизонтальной освещенности E_нар, создаваемой светом полностью открытого небосвода: e = (E_внут / E_нар) · 100 %. Нормирование в относительных единицах обусловлено тем, что абсолютная наружная освещенность непрерывно меняется в широких пределах в зависимости от времени суток, сезона года и облачности, тогда как отношение внутренней освещенности к наружной остается относительно постоянной величиной.</w:t>
       </w:r>
     </w:p>
     <w:p>
       <w:pPr>
-        <w:spacing w:line="360" w:lineRule="auto" w:before="0" w:after="80"/>
-        <w:ind w:firstLine="709"/>
-        <w:jc w:val="both"/>
-      </w:pPr>
-      <w:r>
-        <w:rPr>
-          <w:rFonts w:ascii="Times New Roman" w:hAnsi="Times New Roman"/>
-          <w:b w:val="0"/>
-          <w:i w:val="0"/>
-          <w:color w:val="000000"/>
-          <w:sz w:val="28"/>
-        </w:rPr>
-        <w:t>e = (E_внут / E_нар) · 100 %.</w:t>
-      </w:r>
-    </w:p>
-    <w:p>
-      <w:pPr>
-        <w:spacing w:line="360" w:lineRule="auto" w:before="0" w:after="80"/>
-        <w:ind w:firstLine="709"/>
-        <w:jc w:val="both"/>
-      </w:pPr>
-      <w:r>
-        <w:rPr>
-          <w:rFonts w:ascii="Times New Roman" w:hAnsi="Times New Roman"/>
-          <w:b w:val="0"/>
-          <w:i w:val="0"/>
-          <w:color w:val="000000"/>
-          <w:sz w:val="28"/>
-        </w:rPr>
-        <w:t>Нормирование в относительных единицах обусловлено тем, что абсолютная наружная освещенность непрерывно меняется в широких пределах в зависимости от времени суток, сезона года и облачности, тогда как отношение внутренней освещенности к наружной остается относительно постоянной величиной.</w:t>
-      </w:r>
-    </w:p>
-    <w:p>
-      <w:pPr>
-        <w:spacing w:line="360" w:lineRule="auto" w:before="120" w:after="40"/>
+        <w:spacing w:line="360" w:lineRule="auto" w:before="0" w:after="0"/>
         <w:ind w:firstLine="709"/>
         <w:jc w:val="both"/>
       </w:pPr>
@@ -3700,7 +3845,7 @@
     </w:p>
     <w:p>
       <w:pPr>
-        <w:spacing w:line="360" w:lineRule="auto" w:before="0" w:after="80"/>
+        <w:spacing w:line="360" w:lineRule="auto" w:before="0" w:after="0"/>
         <w:ind w:firstLine="709"/>
         <w:jc w:val="both"/>
       </w:pPr>
@@ -3717,7 +3862,7 @@
     </w:p>
     <w:p>
       <w:pPr>
-        <w:spacing w:line="360" w:lineRule="auto" w:before="0" w:after="80"/>
+        <w:spacing w:line="360" w:lineRule="auto" w:before="0" w:after="0"/>
         <w:ind w:firstLine="709"/>
         <w:jc w:val="both"/>
       </w:pPr>
@@ -3734,7 +3879,7 @@
     </w:p>
     <w:p>
       <w:pPr>
-        <w:spacing w:line="360" w:lineRule="auto" w:before="0" w:after="80"/>
+        <w:spacing w:line="360" w:lineRule="auto" w:before="0" w:after="0"/>
         <w:ind w:firstLine="709"/>
         <w:jc w:val="both"/>
       </w:pPr>
@@ -3751,7 +3896,7 @@
     </w:p>
     <w:p>
       <w:pPr>
-        <w:spacing w:line="360" w:lineRule="auto" w:before="0" w:after="80"/>
+        <w:spacing w:line="360" w:lineRule="auto" w:before="0" w:after="0"/>
         <w:ind w:firstLine="709"/>
         <w:jc w:val="both"/>
       </w:pPr>
@@ -3768,7 +3913,7 @@
     </w:p>
     <w:p>
       <w:pPr>
-        <w:spacing w:line="360" w:lineRule="auto" w:before="120" w:after="40"/>
+        <w:spacing w:line="360" w:lineRule="auto" w:before="0" w:after="0"/>
         <w:ind w:firstLine="709"/>
         <w:jc w:val="both"/>
       </w:pPr>
@@ -3785,7 +3930,7 @@
     </w:p>
     <w:p>
       <w:pPr>
-        <w:spacing w:line="360" w:lineRule="auto" w:before="0" w:after="80"/>
+        <w:spacing w:line="360" w:lineRule="auto" w:before="0" w:after="0"/>
         <w:ind w:firstLine="709"/>
         <w:jc w:val="both"/>
       </w:pPr>
@@ -3802,7 +3947,7 @@
     </w:p>
     <w:p>
       <w:pPr>
-        <w:spacing w:line="360" w:lineRule="auto" w:before="0" w:after="80"/>
+        <w:spacing w:line="360" w:lineRule="auto" w:before="0" w:after="0"/>
         <w:ind w:firstLine="709"/>
         <w:jc w:val="both"/>
       </w:pPr>
@@ -3814,12 +3959,12 @@
           <w:color w:val="000000"/>
           <w:sz w:val="28"/>
         </w:rPr>
-        <w:t>• Освещенность на рабочих местах должна строго соответствовать установленным санитарным нормам для данного разряда зрительной работы;</w:t>
+        <w:t>• освещенность на рабочих местах должна строго соответствовать установленным санитарным нормам для данного разряда зрительной работы;</w:t>
       </w:r>
     </w:p>
     <w:p>
       <w:pPr>
-        <w:spacing w:line="360" w:lineRule="auto" w:before="0" w:after="80"/>
+        <w:spacing w:line="360" w:lineRule="auto" w:before="0" w:after="0"/>
         <w:ind w:firstLine="709"/>
         <w:jc w:val="both"/>
       </w:pPr>
@@ -3831,12 +3976,12 @@
           <w:color w:val="000000"/>
           <w:sz w:val="28"/>
         </w:rPr>
-        <w:t>• Обеспечение постоянства освещенности во времени, исключение пульсаций светового потока и стробоскопического эффекта при работе вращающихся механизмов;</w:t>
+        <w:t>• обеспечение постоянства освещенности во времени, исключение пульсаций светового потока и стробоскопического эффекта;</w:t>
       </w:r>
     </w:p>
     <w:p>
       <w:pPr>
-        <w:spacing w:line="360" w:lineRule="auto" w:before="0" w:after="80"/>
+        <w:spacing w:line="360" w:lineRule="auto" w:before="0" w:after="0"/>
         <w:ind w:firstLine="709"/>
         <w:jc w:val="both"/>
       </w:pPr>
@@ -3848,12 +3993,12 @@
           <w:color w:val="000000"/>
           <w:sz w:val="28"/>
         </w:rPr>
-        <w:t>• Равномерное распределение яркости в поле зрения и ограничение слепящего действия (устранение прямой и отраженной блесткости);</w:t>
+        <w:t>• равномерное распределение яркости в поле зрения и ограничение слепящего действия (устранение прямой и отраженной блесткости);</w:t>
       </w:r>
     </w:p>
     <w:p>
       <w:pPr>
-        <w:spacing w:line="360" w:lineRule="auto" w:before="0" w:after="80"/>
+        <w:spacing w:line="360" w:lineRule="auto" w:before="0" w:after="0"/>
         <w:ind w:firstLine="709"/>
         <w:jc w:val="both"/>
       </w:pPr>
@@ -3865,12 +4010,12 @@
           <w:color w:val="000000"/>
           <w:sz w:val="28"/>
         </w:rPr>
-        <w:t>• Обеспечение благоприятного спектрального состава света, максимально приближенного к естественному дневному;</w:t>
+        <w:t>• обеспечение благоприятного спектрального состава света, максимально приближенного к естественному дневному;</w:t>
       </w:r>
     </w:p>
     <w:p>
       <w:pPr>
-        <w:spacing w:line="360" w:lineRule="auto" w:before="0" w:after="80"/>
+        <w:spacing w:line="360" w:lineRule="auto" w:before="0" w:after="0"/>
         <w:ind w:firstLine="709"/>
         <w:jc w:val="both"/>
       </w:pPr>
@@ -3882,12 +4027,12 @@
           <w:color w:val="000000"/>
           <w:sz w:val="28"/>
         </w:rPr>
-        <w:t>• Отсутствие глубоких и резких теней на рабочих поверхностях оборудования;</w:t>
+        <w:t>• отсутствие глубоких и резких теней на рабочих поверхностях оборудования;</w:t>
       </w:r>
     </w:p>
     <w:p>
       <w:pPr>
-        <w:spacing w:line="360" w:lineRule="auto" w:before="0" w:after="80"/>
+        <w:spacing w:line="360" w:lineRule="auto" w:before="0" w:after="0"/>
         <w:ind w:firstLine="709"/>
         <w:jc w:val="both"/>
       </w:pPr>
@@ -3899,12 +4044,12 @@
           <w:color w:val="000000"/>
           <w:sz w:val="28"/>
         </w:rPr>
-        <w:t>• Электро-, пожаро- и взрывобезопасность осветительных установок, надежность и простота обслуживания.</w:t>
+        <w:t>• электро-, пожаро- и взрывобезопасность осветительных установок, надежность и простота обслуживания.</w:t>
       </w:r>
     </w:p>
     <w:p>
       <w:pPr>
-        <w:spacing w:line="360" w:lineRule="auto" w:before="120" w:after="40"/>
+        <w:spacing w:line="360" w:lineRule="auto" w:before="0" w:after="0"/>
         <w:ind w:firstLine="709"/>
         <w:jc w:val="both"/>
       </w:pPr>
@@ -3921,7 +4066,7 @@
     </w:p>
     <w:p>
       <w:pPr>
-        <w:spacing w:line="360" w:lineRule="auto" w:before="0" w:after="80"/>
+        <w:spacing w:line="360" w:lineRule="auto" w:before="0" w:after="0"/>
         <w:ind w:firstLine="709"/>
         <w:jc w:val="both"/>
       </w:pPr>
@@ -3933,12 +4078,12 @@
           <w:color w:val="000000"/>
           <w:sz w:val="28"/>
         </w:rPr>
-        <w:t>Разряд зрительной работы определяется в соответствии с нормативными таблицами СП 52.13330 (СНиП 23-05-95) по следующим основным критериям:</w:t>
+        <w:t>Разряд зрительной работы определяется в соответствии с нормативными таблицами СП 52.13330 по следующим критериям:</w:t>
       </w:r>
     </w:p>
     <w:p>
       <w:pPr>
-        <w:spacing w:line="360" w:lineRule="auto" w:before="0" w:after="80"/>
+        <w:spacing w:line="360" w:lineRule="auto" w:before="0" w:after="0"/>
         <w:ind w:firstLine="709"/>
         <w:jc w:val="both"/>
       </w:pPr>
@@ -3950,12 +4095,12 @@
           <w:color w:val="000000"/>
           <w:sz w:val="28"/>
         </w:rPr>
-        <w:t>1) Наименьший эквивалентный размер объекта различения (в миллиметрах). Установлены разряды от I (наивысшая точность, размер объекта менее 0,15 мм) до VI (грубая работа, объект более 5 мм);</w:t>
+        <w:t>1) наименьший эквивалентный размер объекта различения (в миллиметрах). Установлены разряды от I (наивысшая точность, менее 0,15 мм) до VI (грубая работа, более 5 мм);</w:t>
       </w:r>
     </w:p>
     <w:p>
       <w:pPr>
-        <w:spacing w:line="360" w:lineRule="auto" w:before="0" w:after="80"/>
+        <w:spacing w:line="360" w:lineRule="auto" w:before="0" w:after="0"/>
         <w:ind w:firstLine="709"/>
         <w:jc w:val="both"/>
       </w:pPr>
@@ -3967,12 +4112,12 @@
           <w:color w:val="000000"/>
           <w:sz w:val="28"/>
         </w:rPr>
-        <w:t>2) Контраст объекта различения с фоном, вычисляемый по формуле K = |B_о - B_ф| / B_ф (различают большой контраст при K &gt; 0,5, средний при K = 0,2...0,5 и малый при K &lt; 0,2);</w:t>
+        <w:t>2) контраст объекта различения с фоном K = |B_о - B_ф| / B_ф (большой при K &gt; 0,5, средний при K = 0,2...0,5 и малый при K &lt; 0,2);</w:t>
       </w:r>
     </w:p>
     <w:p>
       <w:pPr>
-        <w:spacing w:line="360" w:lineRule="auto" w:before="0" w:after="80"/>
+        <w:spacing w:line="360" w:lineRule="auto" w:before="0" w:after="0"/>
         <w:ind w:firstLine="709"/>
         <w:jc w:val="both"/>
       </w:pPr>
@@ -3984,12 +4129,12 @@
           <w:color w:val="000000"/>
           <w:sz w:val="28"/>
         </w:rPr>
-        <w:t>3) Характеристика фона (светлый при коэффициенте отражения фона ρ &gt; 0,4, средний при ρ = 0,2...0,4 и темный при ρ &lt; 0,2).</w:t>
+        <w:t>3) характеристика фона (светлый при коэффициенте отражения фона ρ &gt; 0,4, средний при ρ = 0,2...0,4 и темный при ρ &lt; 0,2).</w:t>
       </w:r>
     </w:p>
     <w:p>
       <w:pPr>
-        <w:spacing w:line="360" w:lineRule="auto" w:before="120" w:after="40"/>
+        <w:spacing w:line="360" w:lineRule="auto" w:before="0" w:after="0"/>
         <w:ind w:firstLine="709"/>
         <w:jc w:val="both"/>
       </w:pPr>
@@ -4006,7 +4151,7 @@
     </w:p>
     <w:p>
       <w:pPr>
-        <w:spacing w:line="360" w:lineRule="auto" w:before="0" w:after="80"/>
+        <w:spacing w:line="360" w:lineRule="auto" w:before="0" w:after="0"/>
         <w:ind w:firstLine="709"/>
         <w:jc w:val="both"/>
       </w:pPr>
@@ -4023,7 +4168,7 @@
     </w:p>
     <w:p>
       <w:pPr>
-        <w:spacing w:line="360" w:lineRule="auto" w:before="0" w:after="80"/>
+        <w:spacing w:line="360" w:lineRule="auto" w:before="0" w:after="0"/>
         <w:ind w:firstLine="709"/>
         <w:jc w:val="both"/>
       </w:pPr>
@@ -4040,7 +4185,7 @@
     </w:p>
     <w:p>
       <w:pPr>
-        <w:spacing w:line="360" w:lineRule="auto" w:before="0" w:after="80"/>
+        <w:spacing w:line="360" w:lineRule="auto" w:before="0" w:after="0"/>
         <w:ind w:firstLine="709"/>
         <w:jc w:val="both"/>
       </w:pPr>
@@ -4057,7 +4202,7 @@
     </w:p>
     <w:p>
       <w:pPr>
-        <w:spacing w:line="360" w:lineRule="auto" w:before="0" w:after="80"/>
+        <w:spacing w:line="360" w:lineRule="auto" w:before="0" w:after="0"/>
         <w:ind w:firstLine="709"/>
         <w:jc w:val="both"/>
       </w:pPr>
@@ -4074,7 +4219,7 @@
     </w:p>
     <w:p>
       <w:pPr>
-        <w:spacing w:line="360" w:lineRule="auto" w:before="0" w:after="80"/>
+        <w:spacing w:line="360" w:lineRule="auto" w:before="0" w:after="0"/>
         <w:ind w:firstLine="709"/>
         <w:jc w:val="both"/>
       </w:pPr>
@@ -4092,7 +4237,7 @@
     <w:p>
       <w:pPr>
         <w:keepNext/>
-        <w:spacing w:line="360" w:lineRule="auto" w:before="240" w:after="120"/>
+        <w:spacing w:line="360" w:lineRule="auto" w:before="280" w:after="120"/>
         <w:ind w:firstLine="709"/>
         <w:jc w:val="left"/>
       </w:pPr>
@@ -4177,7 +4322,7 @@
     <w:p>
       <w:pPr>
         <w:keepNext/>
-        <w:spacing w:line="360" w:lineRule="auto" w:before="240" w:after="120"/>
+        <w:spacing w:line="360" w:lineRule="auto" w:before="280" w:after="120"/>
         <w:ind w:firstLine="709"/>
         <w:jc w:val="left"/>
       </w:pPr>

</xml_diff>